<commit_message>
fixes finall before ashura
</commit_message>
<xml_diff>
--- a/notes.docx
+++ b/notes.docx
@@ -30,32 +30,10 @@
         </w:numPr>
       </w:pPr>
       <w:r>
-        <w:t>create uploaded file video thumbnail</w:t>
-      </w:r>
-    </w:p>
-    <w:p>
-      <w:pPr>
-        <w:numPr>
-          <w:ilvl w:val="0"/>
-          <w:numId w:val="14"/>
-        </w:numPr>
-      </w:pPr>
-      <w:r>
         <w:t>Add Default</w:t>
       </w:r>
       <w:r>
-        <w:t xml:space="preserve"> value </w:t>
-      </w:r>
-      <w:r>
-        <w:t xml:space="preserve">(from </w:t>
-      </w:r>
-      <w:proofErr w:type="spellStart"/>
-      <w:r>
-        <w:t>db</w:t>
-      </w:r>
-      <w:proofErr w:type="spellEnd"/>
-      <w:r>
-        <w:t>)</w:t>
+        <w:t xml:space="preserve"> value</w:t>
       </w:r>
     </w:p>
     <w:p>
@@ -64,15 +42,22 @@
           <w:ilvl w:val="1"/>
           <w:numId w:val="14"/>
         </w:numPr>
-        <w:rPr>
-          <w:rtl/>
-        </w:rPr>
+      </w:pPr>
+      <w:r>
+        <w:t>from db</w:t>
+      </w:r>
+    </w:p>
+    <w:p>
+      <w:pPr>
+        <w:numPr>
+          <w:ilvl w:val="1"/>
+          <w:numId w:val="14"/>
+        </w:numPr>
       </w:pPr>
       <w:r>
         <w:t>default value for file</w:t>
       </w:r>
     </w:p>
-    <w:p/>
     <w:p>
       <w:pPr>
         <w:pStyle w:val="ListParagraph"/>
@@ -271,14 +256,6 @@
         <w:t>.</w:t>
       </w:r>
     </w:p>
-    <w:p/>
-    <w:p>
-      <w:pPr>
-        <w:rPr>
-          <w:lang w:bidi="fa-IR"/>
-        </w:rPr>
-      </w:pPr>
-    </w:p>
     <w:p>
       <w:pPr>
         <w:numPr>
@@ -290,13 +267,8 @@
         <w:t>write</w:t>
       </w:r>
       <w:r>
-        <w:t xml:space="preserve"> </w:t>
-      </w:r>
-      <w:proofErr w:type="spellStart"/>
-      <w:r>
-        <w:t>onSubmit</w:t>
-      </w:r>
-      <w:proofErr w:type="spellEnd"/>
+        <w:t xml:space="preserve"> onSubmit</w:t>
+      </w:r>
     </w:p>
     <w:p>
       <w:pPr>
@@ -306,15 +278,7 @@
         </w:numPr>
       </w:pPr>
       <w:r>
-        <w:t xml:space="preserve">Send to </w:t>
-      </w:r>
-      <w:proofErr w:type="spellStart"/>
-      <w:r>
-        <w:t>api</w:t>
-      </w:r>
-      <w:proofErr w:type="spellEnd"/>
-      <w:r>
-        <w:t xml:space="preserve"> (with file / without file (direct values) difference)</w:t>
+        <w:t>Send to api (with file / without file (direct values) difference)</w:t>
       </w:r>
     </w:p>
     <w:p>
@@ -325,23 +289,7 @@
         </w:numPr>
       </w:pPr>
       <w:r>
-        <w:t xml:space="preserve">add </w:t>
-      </w:r>
-      <w:proofErr w:type="spellStart"/>
-      <w:r>
-        <w:t>db</w:t>
-      </w:r>
-      <w:proofErr w:type="spellEnd"/>
-      <w:r>
-        <w:t xml:space="preserve"> queries errors in </w:t>
-      </w:r>
-      <w:proofErr w:type="spellStart"/>
-      <w:r>
-        <w:t>onSubmit</w:t>
-      </w:r>
-      <w:proofErr w:type="spellEnd"/>
-      <w:r>
-        <w:t xml:space="preserve"> to RFH (on field) e.g. for add records with</w:t>
+        <w:t>add db queries errors in onSubmit to RFH (on field) e.g. for add records with</w:t>
       </w:r>
       <w:r>
         <w:t xml:space="preserve"> </w:t>
@@ -367,17 +315,11 @@
         <w:t xml:space="preserve">(test) </w:t>
       </w:r>
       <w:r>
-        <w:t xml:space="preserve">(with </w:t>
-      </w:r>
-      <w:proofErr w:type="spellStart"/>
-      <w:r>
-        <w:t>ui</w:t>
-      </w:r>
-      <w:proofErr w:type="spellEnd"/>
-      <w:r>
-        <w:t>) *Axios*</w:t>
-      </w:r>
-    </w:p>
+        <w:t>(with ui) *Axios*</w:t>
+      </w:r>
+    </w:p>
+    <w:p/>
+    <w:p/>
     <w:p>
       <w:pPr>
         <w:numPr>
@@ -400,50 +342,47 @@
         </w:numPr>
       </w:pPr>
       <w:r>
-        <w:t xml:space="preserve">Add making form with </w:t>
-      </w:r>
-      <w:proofErr w:type="spellStart"/>
-      <w:r>
-        <w:t>useForm</w:t>
-      </w:r>
-      <w:proofErr w:type="spellEnd"/>
-      <w:r>
-        <w:t xml:space="preserve"> live template</w:t>
+        <w:t xml:space="preserve">Add making form with useForm </w:t>
+      </w:r>
+      <w:r>
+        <w:t>form</w:t>
+      </w:r>
+      <w:r>
+        <w:t xml:space="preserve"> template</w:t>
       </w:r>
     </w:p>
     <w:p/>
     <w:p/>
     <w:p/>
+    <w:p/>
     <w:p>
       <w:r>
         <w:lastRenderedPageBreak/>
+        <w:t>Create zod schema file template</w:t>
+      </w:r>
+    </w:p>
+    <w:p>
+      <w:r>
         <w:t>create CRUD DB drizzle file template</w:t>
       </w:r>
     </w:p>
     <w:p>
       <w:r>
-        <w:t>Read media file (in file manager) (test)</w:t>
+        <w:t>Read media file (</w:t>
+      </w:r>
+      <w:r>
+        <w:t>from file manager</w:t>
+      </w:r>
+      <w:r>
+        <w:t>) (test)</w:t>
       </w:r>
     </w:p>
     <w:p>
       <w:r>
         <w:t>create creating DB template (</w:t>
       </w:r>
-      <w:proofErr w:type="spellStart"/>
-      <w:r>
-        <w:t>Uuid</w:t>
-      </w:r>
-      <w:proofErr w:type="spellEnd"/>
-      <w:r>
-        <w:t xml:space="preserve"> for </w:t>
-      </w:r>
-      <w:proofErr w:type="spellStart"/>
-      <w:r>
-        <w:t>pg</w:t>
-      </w:r>
-      <w:proofErr w:type="spellEnd"/>
-      <w:r>
-        <w:t xml:space="preserve"> table</w:t>
+      <w:r>
+        <w:t>Uuid for pg table</w:t>
       </w:r>
       <w:r>
         <w:t>)</w:t>
@@ -456,15 +395,7 @@
     </w:p>
     <w:p>
       <w:r>
-        <w:t xml:space="preserve">??? CRUD Endpoint logic (DB </w:t>
-      </w:r>
-      <w:proofErr w:type="spellStart"/>
-      <w:r>
-        <w:t>getBys</w:t>
-      </w:r>
-      <w:proofErr w:type="spellEnd"/>
-      <w:r>
-        <w:t xml:space="preserve"> function)</w:t>
+        <w:t>??? CRUD Endpoint logic (DB getBys function)</w:t>
       </w:r>
     </w:p>
     <w:p>
@@ -499,36 +430,13 @@
       </w:r>
     </w:p>
     <w:p>
-      <w:proofErr w:type="spellStart"/>
-      <w:proofErr w:type="gramStart"/>
-      <w:r>
-        <w:t>Zustland</w:t>
-      </w:r>
-      <w:proofErr w:type="spellEnd"/>
-      <w:r>
-        <w:t>(</w:t>
-      </w:r>
-      <w:proofErr w:type="gramEnd"/>
-      <w:r>
-        <w:t xml:space="preserve">file </w:t>
-      </w:r>
-      <w:proofErr w:type="gramStart"/>
-      <w:r>
-        <w:t>template ??</w:t>
-      </w:r>
-      <w:proofErr w:type="gramEnd"/>
-      <w:r>
-        <w:t xml:space="preserve"> And live template)</w:t>
-      </w:r>
-    </w:p>
-    <w:p>
-      <w:proofErr w:type="spellStart"/>
-      <w:r>
-        <w:t>Zarinpal</w:t>
-      </w:r>
-      <w:proofErr w:type="spellEnd"/>
-      <w:r>
-        <w:t xml:space="preserve"> API</w:t>
+      <w:r>
+        <w:t>Zustland(file template ?? And live template)</w:t>
+      </w:r>
+    </w:p>
+    <w:p>
+      <w:r>
+        <w:t>Zarinpal API</w:t>
       </w:r>
     </w:p>
     <w:p>
@@ -538,15 +446,7 @@
     </w:p>
     <w:p>
       <w:r>
-        <w:t xml:space="preserve">Create </w:t>
-      </w:r>
-      <w:proofErr w:type="spellStart"/>
-      <w:r>
-        <w:t>dragble</w:t>
-      </w:r>
-      <w:proofErr w:type="spellEnd"/>
-      <w:r>
-        <w:t xml:space="preserve"> div</w:t>
+        <w:t>Create dragble div</w:t>
       </w:r>
     </w:p>
     <w:p>
@@ -560,26 +460,13 @@
       </w:r>
     </w:p>
     <w:p>
-      <w:proofErr w:type="spellStart"/>
-      <w:r>
-        <w:t>GenerateStaticParams</w:t>
-      </w:r>
-      <w:proofErr w:type="spellEnd"/>
-      <w:r>
-        <w:t xml:space="preserve"> tips</w:t>
-      </w:r>
-    </w:p>
-    <w:p>
-      <w:r>
-        <w:t xml:space="preserve">??? How to revalidate </w:t>
-      </w:r>
-      <w:proofErr w:type="spellStart"/>
-      <w:r>
-        <w:t>generateStaticParams</w:t>
-      </w:r>
-      <w:proofErr w:type="spellEnd"/>
-      <w:r>
-        <w:t xml:space="preserve"> cached pages</w:t>
+      <w:r>
+        <w:t>GenerateStaticParams tips</w:t>
+      </w:r>
+    </w:p>
+    <w:p>
+      <w:r>
+        <w:t>??? How to revalidate generateStaticParams cached pages</w:t>
       </w:r>
     </w:p>
     <w:p>
@@ -589,21 +476,8 @@
           <w:numId w:val="5"/>
         </w:numPr>
       </w:pPr>
-      <w:proofErr w:type="gramStart"/>
-      <w:r>
-        <w:t>Return ??</w:t>
-      </w:r>
-      <w:proofErr w:type="gramEnd"/>
-      <w:r>
-        <w:t xml:space="preserve"> [] in </w:t>
-      </w:r>
-      <w:proofErr w:type="spellStart"/>
-      <w:r>
-        <w:t>generateStaticParams</w:t>
-      </w:r>
-      <w:proofErr w:type="spellEnd"/>
-      <w:r>
-        <w:t xml:space="preserve"> after data fetch for when fetch data is undefined</w:t>
+      <w:r>
+        <w:t>Return ?? [] in generateStaticParams after data fetch for when fetch data is undefined</w:t>
       </w:r>
     </w:p>
     <w:p>
@@ -614,41 +488,17 @@
         </w:numPr>
       </w:pPr>
       <w:r>
-        <w:t xml:space="preserve">Can’t use dynamic component in cached pages (with </w:t>
-      </w:r>
-      <w:proofErr w:type="spellStart"/>
-      <w:r>
-        <w:t>generateStaticParams</w:t>
-      </w:r>
-      <w:proofErr w:type="spellEnd"/>
-      <w:r>
-        <w:t>) without cache components unless get error</w:t>
-      </w:r>
-    </w:p>
-    <w:p>
-      <w:r>
-        <w:t xml:space="preserve">Add </w:t>
-      </w:r>
-      <w:proofErr w:type="spellStart"/>
-      <w:r>
-        <w:t>generateStaticParams</w:t>
-      </w:r>
-      <w:proofErr w:type="spellEnd"/>
-      <w:r>
-        <w:t xml:space="preserve"> to route file template</w:t>
-      </w:r>
-    </w:p>
-    <w:p>
-      <w:r>
-        <w:t xml:space="preserve">Next </w:t>
-      </w:r>
-      <w:proofErr w:type="spellStart"/>
-      <w:r>
-        <w:t>pwa</w:t>
-      </w:r>
-      <w:proofErr w:type="spellEnd"/>
-      <w:r>
-        <w:t xml:space="preserve"> template (offline service worker)</w:t>
+        <w:t>Can’t use dynamic component in cached pages (with generateStaticParams) without cache components unless get error</w:t>
+      </w:r>
+    </w:p>
+    <w:p>
+      <w:r>
+        <w:t>Add generateStaticParams to route file template</w:t>
+      </w:r>
+    </w:p>
+    <w:p>
+      <w:r>
+        <w:t>Next pwa template (offline service worker)</w:t>
       </w:r>
     </w:p>
     <w:p>
@@ -663,15 +513,11 @@
     </w:p>
     <w:p>
       <w:r>
+        <w:lastRenderedPageBreak/>
         <w:t xml:space="preserve">Re-touch </w:t>
       </w:r>
-      <w:proofErr w:type="spellStart"/>
-      <w:r>
-        <w:t>errorMap</w:t>
-      </w:r>
-      <w:proofErr w:type="spellEnd"/>
-      <w:r>
-        <w:t xml:space="preserve"> file</w:t>
+      <w:r>
+        <w:t>errorMap file</w:t>
       </w:r>
       <w:r>
         <w:t xml:space="preserve"> errors</w:t>
@@ -690,23 +536,13 @@
     </w:p>
     <w:p>
       <w:r>
-        <w:t xml:space="preserve">show </w:t>
-      </w:r>
-      <w:proofErr w:type="spellStart"/>
-      <w:r>
-        <w:t>ui</w:t>
-      </w:r>
-      <w:proofErr w:type="spellEnd"/>
-      <w:r>
-        <w:t xml:space="preserve"> guide on first load</w:t>
-      </w:r>
-    </w:p>
-    <w:p>
-      <w:proofErr w:type="spellStart"/>
+        <w:t>show ui guide on first load</w:t>
+      </w:r>
+    </w:p>
+    <w:p>
       <w:r>
         <w:t>websocket</w:t>
       </w:r>
-      <w:proofErr w:type="spellEnd"/>
     </w:p>
     <w:p>
       <w:r>
@@ -719,112 +555,23 @@
       </w:r>
     </w:p>
     <w:p>
-      <w:proofErr w:type="spellStart"/>
-      <w:r>
-        <w:t>Js</w:t>
-      </w:r>
-      <w:proofErr w:type="spellEnd"/>
-      <w:r>
-        <w:t xml:space="preserve"> note</w:t>
-      </w:r>
-    </w:p>
-    <w:p>
-      <w:r>
-        <w:t>Use (</w:t>
-      </w:r>
-      <w:proofErr w:type="gramStart"/>
-      <w:r>
-        <w:t>()=&gt;{ /</w:t>
-      </w:r>
-      <w:proofErr w:type="gramEnd"/>
-      <w:r>
-        <w:t xml:space="preserve">/ function </w:t>
-      </w:r>
-      <w:proofErr w:type="gramStart"/>
-      <w:r>
-        <w:t>statements })(</w:t>
-      </w:r>
-      <w:proofErr w:type="gramEnd"/>
-      <w:r>
-        <w:t>) for run function when creating function</w:t>
-      </w:r>
-    </w:p>
-    <w:p>
-      <w:r>
-        <w:t>use || for return a value when a variable is null (what is the difference between ?? and |</w:t>
-      </w:r>
-      <w:proofErr w:type="gramStart"/>
-      <w:r>
-        <w:t>| )</w:t>
-      </w:r>
-      <w:proofErr w:type="gramEnd"/>
-    </w:p>
-    <w:p>
-      <w:r>
-        <w:t xml:space="preserve">??? Why </w:t>
-      </w:r>
-      <w:proofErr w:type="spellStart"/>
-      <w:proofErr w:type="gramStart"/>
-      <w:r>
-        <w:t>e.target</w:t>
-      </w:r>
-      <w:proofErr w:type="gramEnd"/>
-      <w:r>
-        <w:t>.files</w:t>
-      </w:r>
-      <w:proofErr w:type="spellEnd"/>
-      <w:r>
-        <w:t xml:space="preserve">?.[0] and </w:t>
-      </w:r>
-      <w:proofErr w:type="spellStart"/>
-      <w:proofErr w:type="gramStart"/>
-      <w:r>
-        <w:t>e.target</w:t>
-      </w:r>
-      <w:proofErr w:type="gramEnd"/>
-      <w:r>
-        <w:t>.files</w:t>
-      </w:r>
-      <w:proofErr w:type="spellEnd"/>
-      <w:r>
-        <w:t xml:space="preserve">![0] are different </w:t>
-      </w:r>
-      <w:proofErr w:type="spellStart"/>
-      <w:r>
-        <w:t>sytaxes</w:t>
-      </w:r>
-      <w:proofErr w:type="spellEnd"/>
-      <w:r>
-        <w:t xml:space="preserve"> (same for objects e.g. </w:t>
-      </w:r>
-      <w:proofErr w:type="spellStart"/>
-      <w:r>
-        <w:t>controller.</w:t>
-      </w:r>
-      <w:proofErr w:type="gramStart"/>
-      <w:r>
-        <w:t>data</w:t>
-      </w:r>
-      <w:proofErr w:type="spellEnd"/>
-      <w:r>
-        <w:t>![</w:t>
-      </w:r>
-      <w:proofErr w:type="gramEnd"/>
-      <w:r>
-        <w:t xml:space="preserve">”user”] / </w:t>
-      </w:r>
-      <w:proofErr w:type="spellStart"/>
-      <w:r>
-        <w:t>controller.data</w:t>
-      </w:r>
-      <w:proofErr w:type="spellEnd"/>
-      <w:proofErr w:type="gramStart"/>
-      <w:r>
-        <w:t>?.[</w:t>
-      </w:r>
-      <w:proofErr w:type="gramEnd"/>
-      <w:r>
-        <w:t>”user”])</w:t>
+      <w:r>
+        <w:t>Js note</w:t>
+      </w:r>
+    </w:p>
+    <w:p>
+      <w:r>
+        <w:t>Use (()=&gt;{ // function statements })() for run function when creating function</w:t>
+      </w:r>
+    </w:p>
+    <w:p>
+      <w:r>
+        <w:t>use || for return a value when a variable is null (what is the difference between ?? and || )</w:t>
+      </w:r>
+    </w:p>
+    <w:p>
+      <w:r>
+        <w:t>??? Why e.target.files?.[0] and e.target.files![0] are different sytaxes (same for objects e.g. controller.data![”user”] / controller.data?.[”user”])</w:t>
       </w:r>
     </w:p>
     <w:p>
@@ -834,252 +581,58 @@
     </w:p>
     <w:p>
       <w:r>
-        <w:t xml:space="preserve">!! converts value to </w:t>
-      </w:r>
-      <w:proofErr w:type="spellStart"/>
-      <w:r>
-        <w:t>boolean</w:t>
-      </w:r>
-      <w:proofErr w:type="spellEnd"/>
-      <w:r>
-        <w:t xml:space="preserve"> *true if it </w:t>
-      </w:r>
-      <w:proofErr w:type="gramStart"/>
-      <w:r>
-        <w:t>exist</w:t>
-      </w:r>
-      <w:proofErr w:type="gramEnd"/>
-      <w:r>
-        <w:t xml:space="preserve"> and false if it's not*</w:t>
-      </w:r>
-    </w:p>
-    <w:p>
-      <w:r>
-        <w:t xml:space="preserve">difference </w:t>
-      </w:r>
-      <w:proofErr w:type="spellStart"/>
-      <w:proofErr w:type="gramStart"/>
-      <w:r>
-        <w:t>bewteen</w:t>
-      </w:r>
-      <w:proofErr w:type="spellEnd"/>
-      <w:r>
-        <w:t xml:space="preserve"> .</w:t>
-      </w:r>
-      <w:proofErr w:type="spellStart"/>
-      <w:r>
-        <w:t>toString</w:t>
-      </w:r>
-      <w:proofErr w:type="spellEnd"/>
-      <w:proofErr w:type="gramEnd"/>
-      <w:r>
-        <w:t>() and String(value)</w:t>
-      </w:r>
-    </w:p>
-    <w:p>
-      <w:r>
-        <w:t xml:space="preserve">??? </w:t>
-      </w:r>
-      <w:proofErr w:type="gramStart"/>
-      <w:r>
-        <w:t>use .</w:t>
-      </w:r>
-      <w:proofErr w:type="spellStart"/>
-      <w:r>
-        <w:t>toFixed</w:t>
-      </w:r>
-      <w:proofErr w:type="spellEnd"/>
-      <w:proofErr w:type="gramEnd"/>
-      <w:r>
-        <w:t>(0) of Number class to remove decimals</w:t>
-      </w:r>
-    </w:p>
-    <w:p>
-      <w:r>
-        <w:t xml:space="preserve">What </w:t>
-      </w:r>
-      <w:proofErr w:type="spellStart"/>
-      <w:r>
-        <w:t>Object.bind</w:t>
-      </w:r>
-      <w:proofErr w:type="spellEnd"/>
-      <w:r>
-        <w:t xml:space="preserve"> does</w:t>
-      </w:r>
-    </w:p>
-    <w:p>
-      <w:r>
-        <w:t xml:space="preserve">replace const object with another object using </w:t>
-      </w:r>
-      <w:proofErr w:type="spellStart"/>
-      <w:proofErr w:type="gramStart"/>
-      <w:r>
-        <w:t>object.assign</w:t>
-      </w:r>
-      <w:proofErr w:type="spellEnd"/>
-      <w:proofErr w:type="gramEnd"/>
-    </w:p>
-    <w:p>
-      <w:proofErr w:type="gramStart"/>
-      <w:r>
-        <w:t>Adding !</w:t>
-      </w:r>
-      <w:proofErr w:type="gramEnd"/>
-      <w:r>
-        <w:t xml:space="preserve"> in front of </w:t>
-      </w:r>
-      <w:proofErr w:type="spellStart"/>
-      <w:r>
-        <w:t>possibely</w:t>
-      </w:r>
-      <w:proofErr w:type="spellEnd"/>
-      <w:r>
-        <w:t xml:space="preserve"> undefine value will throw error if value is </w:t>
-      </w:r>
-      <w:proofErr w:type="spellStart"/>
-      <w:r>
-        <w:t>undefiend</w:t>
-      </w:r>
-      <w:proofErr w:type="spellEnd"/>
-      <w:r>
-        <w:t xml:space="preserve">, caused remove </w:t>
-      </w:r>
-      <w:proofErr w:type="spellStart"/>
-      <w:r>
-        <w:t>ts</w:t>
-      </w:r>
-      <w:proofErr w:type="spellEnd"/>
-      <w:r>
-        <w:t xml:space="preserve"> error (add when you sure it’s not null)</w:t>
-      </w:r>
-    </w:p>
-    <w:p>
-      <w:r>
-        <w:t xml:space="preserve">For deleting field in object, </w:t>
-      </w:r>
-      <w:proofErr w:type="spellStart"/>
-      <w:r>
-        <w:t>distructur</w:t>
-      </w:r>
-      <w:proofErr w:type="spellEnd"/>
-      <w:r>
-        <w:t xml:space="preserve"> object with key names that wanted to be deleted and ...rest, and use rest object as deleted object</w:t>
-      </w:r>
-    </w:p>
-    <w:p>
-      <w:r>
-        <w:t xml:space="preserve">Create </w:t>
-      </w:r>
-      <w:proofErr w:type="spellStart"/>
-      <w:r>
-        <w:t>uuid</w:t>
-      </w:r>
-      <w:proofErr w:type="spellEnd"/>
-      <w:r>
-        <w:t xml:space="preserve"> with </w:t>
-      </w:r>
-      <w:proofErr w:type="spellStart"/>
-      <w:proofErr w:type="gramStart"/>
-      <w:r>
-        <w:t>crypto.randomUUID</w:t>
-      </w:r>
-      <w:proofErr w:type="spellEnd"/>
-      <w:proofErr w:type="gramEnd"/>
-      <w:r>
-        <w:t>() method</w:t>
-      </w:r>
-    </w:p>
-    <w:p>
-      <w:proofErr w:type="spellStart"/>
-      <w:r>
-        <w:t>Distructure</w:t>
-      </w:r>
-      <w:proofErr w:type="spellEnd"/>
-      <w:r>
-        <w:t xml:space="preserve"> nested values with nested </w:t>
-      </w:r>
-      <w:proofErr w:type="spellStart"/>
-      <w:r>
-        <w:t>disctructure</w:t>
-      </w:r>
-      <w:proofErr w:type="spellEnd"/>
-      <w:r>
-        <w:t xml:space="preserve"> e.g. const {register, </w:t>
-      </w:r>
-      <w:proofErr w:type="spellStart"/>
-      <w:r>
-        <w:t>handleSubmit</w:t>
-      </w:r>
-      <w:proofErr w:type="spellEnd"/>
-      <w:r>
-        <w:t xml:space="preserve">, </w:t>
-      </w:r>
-      <w:proofErr w:type="spellStart"/>
-      <w:r>
-        <w:t>formState</w:t>
-      </w:r>
-      <w:proofErr w:type="spellEnd"/>
-      <w:r>
-        <w:t xml:space="preserve">: {errors}} = </w:t>
-      </w:r>
-      <w:proofErr w:type="spellStart"/>
-      <w:r>
-        <w:t>useForm</w:t>
-      </w:r>
-      <w:proofErr w:type="spellEnd"/>
-      <w:r>
-        <w:t xml:space="preserve"> *access nested “errors” object in </w:t>
-      </w:r>
-      <w:proofErr w:type="spellStart"/>
-      <w:r>
-        <w:t>formState</w:t>
-      </w:r>
-      <w:proofErr w:type="spellEnd"/>
-      <w:r>
-        <w:t xml:space="preserve"> object from </w:t>
-      </w:r>
-      <w:proofErr w:type="spellStart"/>
-      <w:r>
-        <w:t>useForm</w:t>
-      </w:r>
-      <w:proofErr w:type="spellEnd"/>
-      <w:r>
-        <w:t>*</w:t>
-      </w:r>
-    </w:p>
-    <w:p>
-      <w:r>
-        <w:t xml:space="preserve">??? </w:t>
-      </w:r>
-      <w:proofErr w:type="gramStart"/>
-      <w:r>
-        <w:t>.bind</w:t>
-      </w:r>
-      <w:proofErr w:type="gramEnd"/>
-      <w:r>
-        <w:t>() for passing id to server action</w:t>
+        <w:t>!! converts value to boolean *true if it exist and false if it's not*</w:t>
+      </w:r>
+    </w:p>
+    <w:p>
+      <w:r>
+        <w:t>difference bewteen .toString() and String(value)</w:t>
+      </w:r>
+    </w:p>
+    <w:p>
+      <w:r>
+        <w:t>??? use .toFixed(0) of Number class to remove decimals</w:t>
+      </w:r>
+    </w:p>
+    <w:p>
+      <w:r>
+        <w:t>What Object.bind does</w:t>
+      </w:r>
+    </w:p>
+    <w:p>
+      <w:r>
+        <w:t>replace const object with another object using object.assign</w:t>
+      </w:r>
+    </w:p>
+    <w:p>
+      <w:r>
+        <w:t>Adding ! in front of possibely undefine value will throw error if value is undefiend, caused remove ts error (add when you sure it’s not null)</w:t>
+      </w:r>
+    </w:p>
+    <w:p>
+      <w:r>
+        <w:t>For deleting field in object, distructur object with key names that wanted to be deleted and ...rest, and use rest object as deleted object</w:t>
+      </w:r>
+    </w:p>
+    <w:p>
+      <w:r>
+        <w:t>Create uuid with crypto.randomUUID() method</w:t>
+      </w:r>
+    </w:p>
+    <w:p>
+      <w:r>
+        <w:t>Distructure nested values with nested disctructure e.g. const {register, handleSubmit, formState: {errors}} = useForm *access nested “errors” object in formState object from useForm*</w:t>
       </w:r>
     </w:p>
     <w:p>
       <w:r>
         <w:lastRenderedPageBreak/>
-        <w:t xml:space="preserve">??? use </w:t>
-      </w:r>
-      <w:proofErr w:type="gramStart"/>
-      <w:r>
-        <w:t>entries(</w:t>
-      </w:r>
-      <w:proofErr w:type="gramEnd"/>
-      <w:r>
-        <w:t xml:space="preserve">), </w:t>
-      </w:r>
-      <w:proofErr w:type="spellStart"/>
-      <w:r>
-        <w:t>Object.formEntries</w:t>
-      </w:r>
-      <w:proofErr w:type="spellEnd"/>
-      <w:r>
-        <w:t>() for catch form fields</w:t>
+        <w:t>??? .bind() for passing id to server action</w:t>
+      </w:r>
+    </w:p>
+    <w:p>
+      <w:r>
+        <w:t>??? use entries(), Object.formEntries() for catch form fields</w:t>
       </w:r>
     </w:p>
     <w:p>
@@ -1090,14 +643,7 @@
         <w:rPr>
           <w:rtl/>
         </w:rPr>
-        <w:t xml:space="preserve">لیست </w:t>
-      </w:r>
-      <w:proofErr w:type="gramStart"/>
-      <w:r>
-        <w:rPr>
-          <w:rtl/>
-        </w:rPr>
-        <w:t>گردشی</w:t>
+        <w:t>لیست گردشی</w:t>
       </w:r>
       <w:r>
         <w:t xml:space="preserve"> </w:t>
@@ -1111,7 +657,6 @@
       <w:r>
         <w:t>operations</w:t>
       </w:r>
-      <w:proofErr w:type="gramEnd"/>
     </w:p>
     <w:p>
       <w:pPr>
@@ -1138,15 +683,7 @@
         <w:t>Create</w:t>
       </w:r>
       <w:r>
-        <w:t xml:space="preserve"> file input with hidden class and label with </w:t>
-      </w:r>
-      <w:proofErr w:type="spellStart"/>
-      <w:r>
-        <w:t>HTMLfor</w:t>
-      </w:r>
-      <w:proofErr w:type="spellEnd"/>
-      <w:r>
-        <w:t xml:space="preserve"> linked to input for manage </w:t>
+        <w:t xml:space="preserve"> file input with hidden class and label with HTMLfor linked to input for manage </w:t>
       </w:r>
       <w:r>
         <w:t xml:space="preserve">form input </w:t>
@@ -1199,23 +736,7 @@
         </w:numPr>
       </w:pPr>
       <w:r>
-        <w:t xml:space="preserve">??? menu[number] for array - </w:t>
-      </w:r>
-      <w:proofErr w:type="spellStart"/>
-      <w:r>
-        <w:t>keyof</w:t>
-      </w:r>
-      <w:proofErr w:type="spellEnd"/>
-      <w:r>
-        <w:t xml:space="preserve"> </w:t>
-      </w:r>
-      <w:proofErr w:type="spellStart"/>
-      <w:r>
-        <w:t>typeof</w:t>
-      </w:r>
-      <w:proofErr w:type="spellEnd"/>
-      <w:r>
-        <w:t xml:space="preserve"> Object for object - Object[”key”] for object</w:t>
+        <w:t>??? menu[number] for array - keyof typeof Object for object - Object[”key”] for object</w:t>
       </w:r>
     </w:p>
     <w:p>
@@ -1237,15 +758,7 @@
         </w:numPr>
       </w:pPr>
       <w:r>
-        <w:t>with optional members on define &amp; use if(</w:t>
-      </w:r>
-      <w:proofErr w:type="spellStart"/>
-      <w:r>
-        <w:t>not_exists</w:t>
-      </w:r>
-      <w:proofErr w:type="spellEnd"/>
-      <w:r>
-        <w:t>) return</w:t>
+        <w:t>with optional members on define &amp; use if(not_exists) return</w:t>
       </w:r>
     </w:p>
     <w:p>
@@ -1256,31 +769,7 @@
         </w:numPr>
       </w:pPr>
       <w:r>
-        <w:t xml:space="preserve">Add generic type to arrow object with &lt;T&gt; before () e.g. const </w:t>
-      </w:r>
-      <w:proofErr w:type="spellStart"/>
-      <w:r>
-        <w:t>setSomething</w:t>
-      </w:r>
-      <w:proofErr w:type="spellEnd"/>
-      <w:r>
-        <w:t xml:space="preserve"> = &lt;T</w:t>
-      </w:r>
-      <w:proofErr w:type="gramStart"/>
-      <w:r>
-        <w:t>&gt;(</w:t>
-      </w:r>
-      <w:proofErr w:type="gramEnd"/>
-      <w:r>
-        <w:t xml:space="preserve">) =&gt; {} / async &lt;T&gt; </w:t>
-      </w:r>
-      <w:proofErr w:type="gramStart"/>
-      <w:r>
-        <w:t>()=&gt;{</w:t>
-      </w:r>
-      <w:proofErr w:type="gramEnd"/>
-      <w:r>
-        <w:t>}</w:t>
+        <w:t>Add generic type to arrow object with &lt;T&gt; before () e.g. const setSomething = &lt;T&gt;() =&gt; {} / async &lt;T&gt; ()=&gt;{}</w:t>
       </w:r>
     </w:p>
     <w:p>
@@ -1290,23 +779,13 @@
     </w:p>
     <w:p>
       <w:r>
-        <w:t xml:space="preserve">Note </w:t>
-      </w:r>
-      <w:proofErr w:type="spellStart"/>
-      <w:r>
-        <w:t>prisma</w:t>
-      </w:r>
-      <w:proofErr w:type="spellEnd"/>
-    </w:p>
-    <w:p>
-      <w:r>
-        <w:t xml:space="preserve">Note </w:t>
-      </w:r>
-      <w:proofErr w:type="spellStart"/>
-      <w:r>
-        <w:t>zod</w:t>
-      </w:r>
-      <w:proofErr w:type="spellEnd"/>
+        <w:t>Note prisma</w:t>
+      </w:r>
+    </w:p>
+    <w:p>
+      <w:r>
+        <w:t>Note zod</w:t>
+      </w:r>
     </w:p>
     <w:p>
       <w:pPr>
@@ -1316,36 +795,7 @@
         </w:numPr>
       </w:pPr>
       <w:r>
-        <w:t xml:space="preserve">Pick member from </w:t>
-      </w:r>
-      <w:proofErr w:type="spellStart"/>
-      <w:r>
-        <w:t>zod</w:t>
-      </w:r>
-      <w:proofErr w:type="spellEnd"/>
-      <w:r>
-        <w:t xml:space="preserve"> object validation (</w:t>
-      </w:r>
-      <w:proofErr w:type="gramStart"/>
-      <w:r>
-        <w:t>with .pick</w:t>
-      </w:r>
-      <w:proofErr w:type="gramEnd"/>
-      <w:r>
-        <w:t>({</w:t>
-      </w:r>
-      <w:proofErr w:type="spellStart"/>
-      <w:r>
-        <w:t>key-</w:t>
-      </w:r>
-      <w:proofErr w:type="gramStart"/>
-      <w:r>
-        <w:t>name:true</w:t>
-      </w:r>
-      <w:proofErr w:type="spellEnd"/>
-      <w:proofErr w:type="gramEnd"/>
-      <w:r>
-        <w:t>}) method)</w:t>
+        <w:t>Pick member from zod object validation (with .pick({key-name:true}) method)</w:t>
       </w:r>
     </w:p>
     <w:p>
@@ -1356,15 +806,7 @@
         </w:numPr>
       </w:pPr>
       <w:r>
-        <w:t xml:space="preserve">Extend schema into new schema </w:t>
-      </w:r>
-      <w:proofErr w:type="gramStart"/>
-      <w:r>
-        <w:t>via .extend</w:t>
-      </w:r>
-      <w:proofErr w:type="gramEnd"/>
-      <w:r>
-        <w:t>(second schema) with another schema</w:t>
+        <w:t>Extend schema into new schema via .extend(second schema) with another schema</w:t>
       </w:r>
     </w:p>
     <w:p>
@@ -1375,13 +817,8 @@
         </w:numPr>
       </w:pPr>
       <w:r>
-        <w:t xml:space="preserve">Manage file input (type, size, …) with </w:t>
-      </w:r>
-      <w:proofErr w:type="spellStart"/>
-      <w:r>
-        <w:t>superRefine</w:t>
-      </w:r>
-      <w:proofErr w:type="spellEnd"/>
+        <w:t>Manage file input (type, size, …) with superRefine</w:t>
+      </w:r>
       <w:r>
         <w:t xml:space="preserve"> after </w:t>
       </w:r>
@@ -1412,36 +849,8 @@
         </w:numPr>
       </w:pPr>
       <w:r>
-        <w:t>install packages (drizzle-</w:t>
-      </w:r>
-      <w:proofErr w:type="spellStart"/>
-      <w:r>
-        <w:t>orm</w:t>
-      </w:r>
-      <w:proofErr w:type="spellEnd"/>
-      <w:r>
-        <w:t xml:space="preserve">, </w:t>
-      </w:r>
-      <w:proofErr w:type="spellStart"/>
-      <w:proofErr w:type="gramStart"/>
-      <w:r>
-        <w:t>postgres</w:t>
-      </w:r>
-      <w:proofErr w:type="spellEnd"/>
-      <w:r>
-        <w:t xml:space="preserve"> ,drizzle</w:t>
-      </w:r>
-      <w:proofErr w:type="gramEnd"/>
-      <w:r>
-        <w:t>-kit -D, drizzle-</w:t>
-      </w:r>
-      <w:proofErr w:type="spellStart"/>
-      <w:r>
-        <w:t>zod</w:t>
-      </w:r>
-      <w:proofErr w:type="spellEnd"/>
-      <w:r>
-        <w:t>)</w:t>
+        <w:lastRenderedPageBreak/>
+        <w:t>install packages (drizzle-orm, postgres ,drizzle-kit -D, drizzle-zod)</w:t>
       </w:r>
     </w:p>
     <w:p>
@@ -1452,8 +861,227 @@
         </w:numPr>
       </w:pPr>
       <w:r>
+        <w:t>add DB_URL env</w:t>
+      </w:r>
+    </w:p>
+    <w:p>
+      <w:pPr>
+        <w:numPr>
+          <w:ilvl w:val="0"/>
+          <w:numId w:val="8"/>
+        </w:numPr>
+      </w:pPr>
+      <w:r>
+        <w:t>create drizzle.config.ts in root</w:t>
+      </w:r>
+    </w:p>
+    <w:p>
+      <w:pPr>
+        <w:numPr>
+          <w:ilvl w:val="0"/>
+          <w:numId w:val="8"/>
+        </w:numPr>
+      </w:pPr>
+    </w:p>
+    <w:p>
+      <w:pPr>
+        <w:numPr>
+          <w:ilvl w:val="0"/>
+          <w:numId w:val="8"/>
+        </w:numPr>
+      </w:pPr>
+      <w:r>
+        <w:t>create DB.schema file (import table entities from drizzle-orm/pg-core)</w:t>
+      </w:r>
+    </w:p>
+    <w:p>
+      <w:pPr>
+        <w:numPr>
+          <w:ilvl w:val="0"/>
+          <w:numId w:val="8"/>
+        </w:numPr>
+      </w:pPr>
+      <w:r>
+        <w:t>run push for push schema to db</w:t>
+      </w:r>
+    </w:p>
+    <w:p>
+      <w:pPr>
+        <w:numPr>
+          <w:ilvl w:val="0"/>
+          <w:numId w:val="8"/>
+        </w:numPr>
+      </w:pPr>
+    </w:p>
+    <w:p>
+      <w:pPr>
+        <w:numPr>
+          <w:ilvl w:val="0"/>
+          <w:numId w:val="8"/>
+        </w:numPr>
+      </w:pPr>
+      <w:r>
+        <w:t>create DB.connection for connect to db (import drizzle from drizzle-orm/postgres-js, postgres from postgres, * as schema from DB/init/schema)</w:t>
+      </w:r>
+    </w:p>
+    <w:p>
+      <w:pPr>
+        <w:numPr>
+          <w:ilvl w:val="0"/>
+          <w:numId w:val="8"/>
+        </w:numPr>
+      </w:pPr>
+    </w:p>
+    <w:p>
+      <w:pPr>
+        <w:numPr>
+          <w:ilvl w:val="0"/>
+          <w:numId w:val="8"/>
+        </w:numPr>
+      </w:pPr>
+      <w:r>
+        <w:t>create DB.migration for migrate schema changes to db (instead of drizzle-kit push (with saving history) (generate needed before using migration file) (migration file needed to run))</w:t>
+      </w:r>
+    </w:p>
+    <w:p>
+      <w:pPr>
+        <w:numPr>
+          <w:ilvl w:val="0"/>
+          <w:numId w:val="8"/>
+        </w:numPr>
+      </w:pPr>
+    </w:p>
+    <w:p>
+      <w:pPr>
+        <w:numPr>
+          <w:ilvl w:val="0"/>
+          <w:numId w:val="8"/>
+        </w:numPr>
+      </w:pPr>
+      <w:r>
+        <w:t>Use in code for create sql and export type with inferInsertModel and inferSelectModel (InferSelectModel returns type of all fields, InferInsertModel returns required fields with optional type for optional DB fields (those have default value in table))</w:t>
+      </w:r>
+    </w:p>
+    <w:p>
+      <w:pPr>
+        <w:numPr>
+          <w:ilvl w:val="0"/>
+          <w:numId w:val="8"/>
+        </w:numPr>
+      </w:pPr>
+      <w:r>
+        <w:t>SQL behind the scene workflow</w:t>
+      </w:r>
+    </w:p>
+    <w:p>
+      <w:pPr>
+        <w:numPr>
+          <w:ilvl w:val="0"/>
+          <w:numId w:val="8"/>
+        </w:numPr>
+      </w:pPr>
+      <w:r>
+        <w:t>1. get all records from table (FROM)</w:t>
+      </w:r>
+    </w:p>
+    <w:p>
+      <w:pPr>
+        <w:numPr>
+          <w:ilvl w:val="0"/>
+          <w:numId w:val="8"/>
+        </w:numPr>
+      </w:pPr>
+      <w:r>
+        <w:t>2. join records with another tables (JOINs)</w:t>
+      </w:r>
+    </w:p>
+    <w:p>
+      <w:pPr>
+        <w:numPr>
+          <w:ilvl w:val="0"/>
+          <w:numId w:val="8"/>
+        </w:numPr>
+      </w:pPr>
+      <w:r>
+        <w:t>3. field selection condition (WHERE)</w:t>
+      </w:r>
+    </w:p>
+    <w:p>
+      <w:pPr>
+        <w:numPr>
+          <w:ilvl w:val="0"/>
+          <w:numId w:val="8"/>
+        </w:numPr>
+      </w:pPr>
+      <w:r>
+        <w:t>4. grouping records (GROUP BY)</w:t>
+      </w:r>
+    </w:p>
+    <w:p>
+      <w:pPr>
+        <w:numPr>
+          <w:ilvl w:val="0"/>
+          <w:numId w:val="8"/>
+        </w:numPr>
+      </w:pPr>
+      <w:r>
+        <w:t>5. grouped field condition (HAVING)</w:t>
+      </w:r>
+    </w:p>
+    <w:p>
+      <w:pPr>
+        <w:numPr>
+          <w:ilvl w:val="0"/>
+          <w:numId w:val="8"/>
+        </w:numPr>
+      </w:pPr>
+      <w:r>
+        <w:t>6. aggregates (if exists) (agg functions)</w:t>
+      </w:r>
+    </w:p>
+    <w:p>
+      <w:pPr>
+        <w:numPr>
+          <w:ilvl w:val="0"/>
+          <w:numId w:val="8"/>
+        </w:numPr>
+      </w:pPr>
+      <w:r>
+        <w:t>7. select fields (SELECT)</w:t>
+      </w:r>
+    </w:p>
+    <w:p>
+      <w:pPr>
+        <w:numPr>
+          <w:ilvl w:val="0"/>
+          <w:numId w:val="8"/>
+        </w:numPr>
+      </w:pPr>
+      <w:r>
+        <w:t>type Tresult = typeof result, would get type of executed query automatically</w:t>
+      </w:r>
+    </w:p>
+    <w:p>
+      <w:pPr>
+        <w:numPr>
+          <w:ilvl w:val="0"/>
+          <w:numId w:val="8"/>
+        </w:numPr>
+      </w:pPr>
+      <w:r>
+        <w:t>On creating entity, name argument (as string) is require beside ts key name for separate sql logic from ts logic e.g. createdAt: serial(“created_at”).primaryKey()</w:t>
+      </w:r>
+    </w:p>
+    <w:p>
+      <w:pPr>
+        <w:numPr>
+          <w:ilvl w:val="0"/>
+          <w:numId w:val="8"/>
+        </w:numPr>
+      </w:pPr>
+      <w:r>
         <w:lastRenderedPageBreak/>
-        <w:t>add DB_URL env</w:t>
+        <w:t>Passing arrays as value to .insert(table_name).values() makes multiple records e.g. .insert(table_name).values([{name: “ali”, age: 25},{name:"mamad”, age: 20}])</w:t>
       </w:r>
     </w:p>
     <w:p>
@@ -1464,544 +1092,8 @@
         </w:numPr>
       </w:pPr>
       <w:r>
-        <w:t xml:space="preserve">create </w:t>
-      </w:r>
-      <w:proofErr w:type="spellStart"/>
-      <w:r>
-        <w:t>drizzle.config.ts</w:t>
-      </w:r>
-      <w:proofErr w:type="spellEnd"/>
-      <w:r>
-        <w:t xml:space="preserve"> in root</w:t>
-      </w:r>
-    </w:p>
-    <w:p>
-      <w:pPr>
-        <w:numPr>
-          <w:ilvl w:val="0"/>
-          <w:numId w:val="8"/>
-        </w:numPr>
-      </w:pPr>
-    </w:p>
-    <w:p>
-      <w:pPr>
-        <w:numPr>
-          <w:ilvl w:val="0"/>
-          <w:numId w:val="8"/>
-        </w:numPr>
-      </w:pPr>
-      <w:r>
-        <w:t xml:space="preserve">create </w:t>
-      </w:r>
-      <w:proofErr w:type="spellStart"/>
-      <w:proofErr w:type="gramStart"/>
-      <w:r>
-        <w:t>DB.schema</w:t>
-      </w:r>
-      <w:proofErr w:type="spellEnd"/>
-      <w:proofErr w:type="gramEnd"/>
-      <w:r>
-        <w:t xml:space="preserve"> file (import table entities from drizzle-</w:t>
-      </w:r>
-      <w:proofErr w:type="spellStart"/>
-      <w:r>
-        <w:t>orm</w:t>
-      </w:r>
-      <w:proofErr w:type="spellEnd"/>
-      <w:r>
-        <w:t>/</w:t>
-      </w:r>
-      <w:proofErr w:type="spellStart"/>
-      <w:r>
-        <w:t>pg</w:t>
-      </w:r>
-      <w:proofErr w:type="spellEnd"/>
-      <w:r>
-        <w:t>-core)</w:t>
-      </w:r>
-    </w:p>
-    <w:p>
-      <w:pPr>
-        <w:numPr>
-          <w:ilvl w:val="0"/>
-          <w:numId w:val="8"/>
-        </w:numPr>
-      </w:pPr>
-      <w:r>
-        <w:t xml:space="preserve">run push for push schema to </w:t>
-      </w:r>
-      <w:proofErr w:type="spellStart"/>
-      <w:r>
-        <w:t>db</w:t>
-      </w:r>
-      <w:proofErr w:type="spellEnd"/>
-    </w:p>
-    <w:p>
-      <w:pPr>
-        <w:numPr>
-          <w:ilvl w:val="0"/>
-          <w:numId w:val="8"/>
-        </w:numPr>
-      </w:pPr>
-    </w:p>
-    <w:p>
-      <w:pPr>
-        <w:numPr>
-          <w:ilvl w:val="0"/>
-          <w:numId w:val="8"/>
-        </w:numPr>
-      </w:pPr>
-      <w:r>
-        <w:t xml:space="preserve">create </w:t>
-      </w:r>
-      <w:proofErr w:type="spellStart"/>
-      <w:proofErr w:type="gramStart"/>
-      <w:r>
-        <w:t>DB.connection</w:t>
-      </w:r>
-      <w:proofErr w:type="spellEnd"/>
-      <w:proofErr w:type="gramEnd"/>
-      <w:r>
-        <w:t xml:space="preserve"> for connect to </w:t>
-      </w:r>
-      <w:proofErr w:type="spellStart"/>
-      <w:r>
-        <w:t>db</w:t>
-      </w:r>
-      <w:proofErr w:type="spellEnd"/>
-      <w:r>
-        <w:t xml:space="preserve"> (import drizzle from drizzle-</w:t>
-      </w:r>
-      <w:proofErr w:type="spellStart"/>
-      <w:r>
-        <w:t>orm</w:t>
-      </w:r>
-      <w:proofErr w:type="spellEnd"/>
-      <w:r>
-        <w:t>/</w:t>
-      </w:r>
-      <w:proofErr w:type="spellStart"/>
-      <w:r>
-        <w:t>postgres-js</w:t>
-      </w:r>
-      <w:proofErr w:type="spellEnd"/>
-      <w:r>
-        <w:t xml:space="preserve">, </w:t>
-      </w:r>
-      <w:proofErr w:type="spellStart"/>
-      <w:r>
-        <w:t>postgres</w:t>
-      </w:r>
-      <w:proofErr w:type="spellEnd"/>
-      <w:r>
-        <w:t xml:space="preserve"> from </w:t>
-      </w:r>
-      <w:proofErr w:type="spellStart"/>
-      <w:r>
-        <w:t>postgres</w:t>
-      </w:r>
-      <w:proofErr w:type="spellEnd"/>
-      <w:r>
-        <w:t>, * as schema from DB/</w:t>
-      </w:r>
-      <w:proofErr w:type="spellStart"/>
-      <w:r>
-        <w:t>init</w:t>
-      </w:r>
-      <w:proofErr w:type="spellEnd"/>
-      <w:r>
-        <w:t>/schema)</w:t>
-      </w:r>
-    </w:p>
-    <w:p>
-      <w:pPr>
-        <w:numPr>
-          <w:ilvl w:val="0"/>
-          <w:numId w:val="8"/>
-        </w:numPr>
-      </w:pPr>
-    </w:p>
-    <w:p>
-      <w:pPr>
-        <w:numPr>
-          <w:ilvl w:val="0"/>
-          <w:numId w:val="8"/>
-        </w:numPr>
-      </w:pPr>
-      <w:r>
-        <w:t xml:space="preserve">create </w:t>
-      </w:r>
-      <w:proofErr w:type="spellStart"/>
-      <w:proofErr w:type="gramStart"/>
-      <w:r>
-        <w:t>DB.migration</w:t>
-      </w:r>
-      <w:proofErr w:type="spellEnd"/>
-      <w:proofErr w:type="gramEnd"/>
-      <w:r>
-        <w:t xml:space="preserve"> for migrate schema changes to </w:t>
-      </w:r>
-      <w:proofErr w:type="spellStart"/>
-      <w:r>
-        <w:t>db</w:t>
-      </w:r>
-      <w:proofErr w:type="spellEnd"/>
-      <w:r>
-        <w:t xml:space="preserve"> (instead of drizzle-kit push (with saving history) (generate needed before using migration file) (migration file needed to run))</w:t>
-      </w:r>
-    </w:p>
-    <w:p>
-      <w:pPr>
-        <w:numPr>
-          <w:ilvl w:val="0"/>
-          <w:numId w:val="8"/>
-        </w:numPr>
-      </w:pPr>
-    </w:p>
-    <w:p>
-      <w:pPr>
-        <w:numPr>
-          <w:ilvl w:val="0"/>
-          <w:numId w:val="8"/>
-        </w:numPr>
-      </w:pPr>
-      <w:r>
-        <w:t xml:space="preserve">Use in code for create </w:t>
-      </w:r>
-      <w:proofErr w:type="spellStart"/>
-      <w:r>
-        <w:t>sql</w:t>
-      </w:r>
-      <w:proofErr w:type="spellEnd"/>
-      <w:r>
-        <w:t xml:space="preserve"> and export type with </w:t>
-      </w:r>
-      <w:proofErr w:type="spellStart"/>
-      <w:r>
-        <w:t>inferInsertModel</w:t>
-      </w:r>
-      <w:proofErr w:type="spellEnd"/>
-      <w:r>
-        <w:t xml:space="preserve"> and </w:t>
-      </w:r>
-      <w:proofErr w:type="spellStart"/>
-      <w:r>
-        <w:t>inferSelectModel</w:t>
-      </w:r>
-      <w:proofErr w:type="spellEnd"/>
-      <w:r>
-        <w:t xml:space="preserve"> (</w:t>
-      </w:r>
-      <w:proofErr w:type="spellStart"/>
-      <w:r>
-        <w:t>InferSelectModel</w:t>
-      </w:r>
-      <w:proofErr w:type="spellEnd"/>
-      <w:r>
-        <w:t xml:space="preserve"> returns type of all fields, </w:t>
-      </w:r>
-      <w:proofErr w:type="spellStart"/>
-      <w:r>
-        <w:t>InferInsertModel</w:t>
-      </w:r>
-      <w:proofErr w:type="spellEnd"/>
-      <w:r>
-        <w:t xml:space="preserve"> returns required fields with optional type for optional DB fields (those have default value in table))</w:t>
-      </w:r>
-    </w:p>
-    <w:p>
-      <w:pPr>
-        <w:numPr>
-          <w:ilvl w:val="0"/>
-          <w:numId w:val="8"/>
-        </w:numPr>
-      </w:pPr>
-      <w:r>
-        <w:t>SQL behind the scene workflow</w:t>
-      </w:r>
-    </w:p>
-    <w:p>
-      <w:pPr>
-        <w:numPr>
-          <w:ilvl w:val="0"/>
-          <w:numId w:val="8"/>
-        </w:numPr>
-      </w:pPr>
-      <w:r>
-        <w:t>1. get all records from table (FROM)</w:t>
-      </w:r>
-    </w:p>
-    <w:p>
-      <w:pPr>
-        <w:numPr>
-          <w:ilvl w:val="0"/>
-          <w:numId w:val="8"/>
-        </w:numPr>
-      </w:pPr>
-      <w:r>
-        <w:t>2. join records with another tables (JOINs)</w:t>
-      </w:r>
-    </w:p>
-    <w:p>
-      <w:pPr>
-        <w:numPr>
-          <w:ilvl w:val="0"/>
-          <w:numId w:val="8"/>
-        </w:numPr>
-      </w:pPr>
-      <w:r>
-        <w:t>3. field selection condition (WHERE)</w:t>
-      </w:r>
-    </w:p>
-    <w:p>
-      <w:pPr>
-        <w:numPr>
-          <w:ilvl w:val="0"/>
-          <w:numId w:val="8"/>
-        </w:numPr>
-      </w:pPr>
-      <w:r>
-        <w:t>4. grouping records (GROUP BY)</w:t>
-      </w:r>
-    </w:p>
-    <w:p>
-      <w:pPr>
-        <w:numPr>
-          <w:ilvl w:val="0"/>
-          <w:numId w:val="8"/>
-        </w:numPr>
-      </w:pPr>
-      <w:r>
-        <w:t>5. grouped field condition (HAVING)</w:t>
-      </w:r>
-    </w:p>
-    <w:p>
-      <w:pPr>
-        <w:numPr>
-          <w:ilvl w:val="0"/>
-          <w:numId w:val="8"/>
-        </w:numPr>
-      </w:pPr>
-      <w:r>
-        <w:t>6. aggregates (if exists) (</w:t>
-      </w:r>
-      <w:proofErr w:type="spellStart"/>
-      <w:r>
-        <w:t>agg</w:t>
-      </w:r>
-      <w:proofErr w:type="spellEnd"/>
-      <w:r>
-        <w:t xml:space="preserve"> functions)</w:t>
-      </w:r>
-    </w:p>
-    <w:p>
-      <w:pPr>
-        <w:numPr>
-          <w:ilvl w:val="0"/>
-          <w:numId w:val="8"/>
-        </w:numPr>
-      </w:pPr>
-      <w:r>
-        <w:t>7. select fields (SELECT)</w:t>
-      </w:r>
-    </w:p>
-    <w:p>
-      <w:pPr>
-        <w:numPr>
-          <w:ilvl w:val="0"/>
-          <w:numId w:val="8"/>
-        </w:numPr>
-      </w:pPr>
-      <w:r>
-        <w:t xml:space="preserve">type </w:t>
-      </w:r>
-      <w:proofErr w:type="spellStart"/>
-      <w:r>
-        <w:t>Tresult</w:t>
-      </w:r>
-      <w:proofErr w:type="spellEnd"/>
-      <w:r>
-        <w:t xml:space="preserve"> = </w:t>
-      </w:r>
-      <w:proofErr w:type="spellStart"/>
-      <w:r>
-        <w:t>typeof</w:t>
-      </w:r>
-      <w:proofErr w:type="spellEnd"/>
-      <w:r>
-        <w:t xml:space="preserve"> result, would get type of executed query automatically</w:t>
-      </w:r>
-    </w:p>
-    <w:p>
-      <w:pPr>
-        <w:numPr>
-          <w:ilvl w:val="0"/>
-          <w:numId w:val="8"/>
-        </w:numPr>
-      </w:pPr>
-      <w:r>
-        <w:t xml:space="preserve">On creating entity, name argument (as string) is require beside </w:t>
-      </w:r>
-      <w:proofErr w:type="spellStart"/>
-      <w:r>
-        <w:t>ts</w:t>
-      </w:r>
-      <w:proofErr w:type="spellEnd"/>
-      <w:r>
-        <w:t xml:space="preserve"> key name for separate </w:t>
-      </w:r>
-      <w:proofErr w:type="spellStart"/>
-      <w:r>
-        <w:t>sql</w:t>
-      </w:r>
-      <w:proofErr w:type="spellEnd"/>
-      <w:r>
-        <w:t xml:space="preserve"> logic from </w:t>
-      </w:r>
-      <w:proofErr w:type="spellStart"/>
-      <w:r>
-        <w:t>ts</w:t>
-      </w:r>
-      <w:proofErr w:type="spellEnd"/>
-      <w:r>
-        <w:t xml:space="preserve"> logic e.g. </w:t>
-      </w:r>
-      <w:proofErr w:type="spellStart"/>
-      <w:r>
-        <w:t>createdAt</w:t>
-      </w:r>
-      <w:proofErr w:type="spellEnd"/>
-      <w:r>
-        <w:t>: serial(“</w:t>
-      </w:r>
-      <w:proofErr w:type="spellStart"/>
-      <w:r>
-        <w:t>created_at</w:t>
-      </w:r>
-      <w:proofErr w:type="spellEnd"/>
-      <w:r>
-        <w:t>”</w:t>
-      </w:r>
-      <w:proofErr w:type="gramStart"/>
-      <w:r>
-        <w:t>).</w:t>
-      </w:r>
-      <w:proofErr w:type="spellStart"/>
-      <w:r>
-        <w:t>primaryKey</w:t>
-      </w:r>
-      <w:proofErr w:type="spellEnd"/>
-      <w:proofErr w:type="gramEnd"/>
-      <w:r>
-        <w:t>()</w:t>
-      </w:r>
-    </w:p>
-    <w:p>
-      <w:pPr>
-        <w:numPr>
-          <w:ilvl w:val="0"/>
-          <w:numId w:val="8"/>
-        </w:numPr>
-      </w:pPr>
-      <w:r>
-        <w:lastRenderedPageBreak/>
-        <w:t xml:space="preserve">Passing arrays as value </w:t>
-      </w:r>
-      <w:proofErr w:type="gramStart"/>
-      <w:r>
-        <w:t>to .insert</w:t>
-      </w:r>
-      <w:proofErr w:type="gramEnd"/>
-      <w:r>
-        <w:t>(</w:t>
-      </w:r>
-      <w:proofErr w:type="spellStart"/>
-      <w:r>
-        <w:t>table_name</w:t>
-      </w:r>
-      <w:proofErr w:type="spellEnd"/>
-      <w:proofErr w:type="gramStart"/>
-      <w:r>
-        <w:t>).values</w:t>
-      </w:r>
-      <w:proofErr w:type="gramEnd"/>
-      <w:r>
-        <w:t xml:space="preserve">() makes multiple records </w:t>
-      </w:r>
-      <w:proofErr w:type="gramStart"/>
-      <w:r>
-        <w:t>e.g. .insert</w:t>
-      </w:r>
-      <w:proofErr w:type="gramEnd"/>
-      <w:r>
-        <w:t>(</w:t>
-      </w:r>
-      <w:proofErr w:type="spellStart"/>
-      <w:r>
-        <w:t>table_name</w:t>
-      </w:r>
-      <w:proofErr w:type="spellEnd"/>
-      <w:proofErr w:type="gramStart"/>
-      <w:r>
-        <w:t>).values</w:t>
-      </w:r>
-      <w:proofErr w:type="gramEnd"/>
-      <w:r>
-        <w:t>([{name: “</w:t>
-      </w:r>
-      <w:proofErr w:type="spellStart"/>
-      <w:r>
-        <w:t>ali</w:t>
-      </w:r>
-      <w:proofErr w:type="spellEnd"/>
-      <w:r>
-        <w:t>”, age: 25</w:t>
-      </w:r>
-      <w:proofErr w:type="gramStart"/>
-      <w:r>
-        <w:t>},{</w:t>
-      </w:r>
-      <w:proofErr w:type="gramEnd"/>
-      <w:r>
-        <w:t>name:"</w:t>
-      </w:r>
-      <w:proofErr w:type="spellStart"/>
-      <w:r>
-        <w:t>mamad</w:t>
-      </w:r>
-      <w:proofErr w:type="spellEnd"/>
-      <w:r>
-        <w:t>”, age: 20}])</w:t>
-      </w:r>
-    </w:p>
-    <w:p>
-      <w:pPr>
-        <w:numPr>
-          <w:ilvl w:val="0"/>
-          <w:numId w:val="8"/>
-        </w:numPr>
-      </w:pPr>
-      <w:proofErr w:type="gramStart"/>
-      <w:r>
-        <w:t>.returning</w:t>
-      </w:r>
-      <w:proofErr w:type="gramEnd"/>
-      <w:r>
-        <w:t xml:space="preserve">() for (end of) creating / updating / deleting, returns just created / updated / deleted record values (returns specific values with passing object to it </w:t>
-      </w:r>
-      <w:proofErr w:type="gramStart"/>
-      <w:r>
-        <w:t>e.g. .returning</w:t>
-      </w:r>
-      <w:proofErr w:type="gramEnd"/>
-      <w:r>
-        <w:t>({id: users.id, name: users.name}</w:t>
-      </w:r>
-      <w:proofErr w:type="gramStart"/>
-      <w:r>
-        <w:t>) )</w:t>
-      </w:r>
-      <w:proofErr w:type="gramEnd"/>
+        <w:t>.returning() for (end of) creating / updating / deleting, returns just created / updated / deleted record values (returns specific values with passing object to it e.g. .returning({id: users.id, name: users.name}) )</w:t>
+      </w:r>
     </w:p>
     <w:p>
       <w:pPr>
@@ -2099,36 +1191,7 @@
         </w:numPr>
       </w:pPr>
       <w:r>
-        <w:t xml:space="preserve">think joins as two step operation (step one. Join all rows of two tables (full join). Step two. Consider which rows to select (left join: only rows that first table’s primary key is not null, right join: only rows that second table’s primary key is not null, inner join: only rows that both and first table’s primary key are not </w:t>
-      </w:r>
-      <w:proofErr w:type="gramStart"/>
-      <w:r>
-        <w:t>null )</w:t>
-      </w:r>
-      <w:proofErr w:type="gramEnd"/>
-      <w:r>
-        <w:t xml:space="preserve">) (all could be created with WHERE </w:t>
-      </w:r>
-      <w:proofErr w:type="spellStart"/>
-      <w:proofErr w:type="gramStart"/>
-      <w:r>
-        <w:t>isNotNull</w:t>
-      </w:r>
-      <w:proofErr w:type="spellEnd"/>
-      <w:r>
-        <w:t>(</w:t>
-      </w:r>
-      <w:proofErr w:type="gramEnd"/>
-      <w:r>
-        <w:t xml:space="preserve">), but joins </w:t>
-      </w:r>
-      <w:proofErr w:type="gramStart"/>
-      <w:r>
-        <w:t>has</w:t>
-      </w:r>
-      <w:proofErr w:type="gramEnd"/>
-      <w:r>
-        <w:t xml:space="preserve"> more performance)</w:t>
+        <w:t>think joins as two step operation (step one. Join all rows of two tables (full join). Step two. Consider which rows to select (left join: only rows that first table’s primary key is not null, right join: only rows that second table’s primary key is not null, inner join: only rows that both and first table’s primary key are not null )) (all could be created with WHERE isNotNull(), but joins has more performance)</w:t>
       </w:r>
     </w:p>
     <w:p>
@@ -2139,52 +1202,7 @@
         </w:numPr>
       </w:pPr>
       <w:r>
-        <w:t>Get all when a filter is null using (</w:t>
-      </w:r>
-      <w:proofErr w:type="gramStart"/>
-      <w:r>
-        <w:t>filter ?</w:t>
-      </w:r>
-      <w:proofErr w:type="gramEnd"/>
-      <w:r>
-        <w:t xml:space="preserve"> Filter </w:t>
-      </w:r>
-      <w:proofErr w:type="gramStart"/>
-      <w:r>
-        <w:t>condition :</w:t>
-      </w:r>
-      <w:proofErr w:type="gramEnd"/>
-      <w:r>
-        <w:t xml:space="preserve"> undefined) e.g. </w:t>
-      </w:r>
-      <w:proofErr w:type="gramStart"/>
-      <w:r>
-        <w:t>city ?</w:t>
-      </w:r>
-      <w:proofErr w:type="gramEnd"/>
-      <w:r>
-        <w:t xml:space="preserve"> </w:t>
-      </w:r>
-      <w:proofErr w:type="gramStart"/>
-      <w:r>
-        <w:t>eq(</w:t>
-      </w:r>
-      <w:proofErr w:type="spellStart"/>
-      <w:r>
-        <w:t>table.city</w:t>
-      </w:r>
-      <w:proofErr w:type="spellEnd"/>
-      <w:proofErr w:type="gramEnd"/>
-      <w:r>
-        <w:t>, city</w:t>
-      </w:r>
-      <w:proofErr w:type="gramStart"/>
-      <w:r>
-        <w:t>) :</w:t>
-      </w:r>
-      <w:proofErr w:type="gramEnd"/>
-      <w:r>
-        <w:t xml:space="preserve"> undefined</w:t>
+        <w:t>Get all when a filter is null using (filter ? Filter condition : undefined) e.g. city ? eq(table.city, city) : undefined</w:t>
       </w:r>
     </w:p>
     <w:p>
@@ -2195,23 +1213,7 @@
         </w:numPr>
       </w:pPr>
       <w:r>
-        <w:t>COALESCE = returning value if a value is null (</w:t>
-      </w:r>
-      <w:proofErr w:type="gramStart"/>
-      <w:r>
-        <w:t>COALESCE( $</w:t>
-      </w:r>
-      <w:proofErr w:type="gramEnd"/>
-      <w:r>
-        <w:t xml:space="preserve">{value}, </w:t>
-      </w:r>
-      <w:proofErr w:type="gramStart"/>
-      <w:r>
-        <w:t>80 )</w:t>
-      </w:r>
-      <w:proofErr w:type="gramEnd"/>
-      <w:r>
-        <w:t>) (if value was null, output will be 80)</w:t>
+        <w:t>COALESCE = returning value if a value is null (COALESCE( ${value}, 80 )) (if value was null, output will be 80)</w:t>
       </w:r>
     </w:p>
     <w:p>
@@ -2222,28 +1224,7 @@
         </w:numPr>
       </w:pPr>
       <w:r>
-        <w:t xml:space="preserve">join many-to-many (by adding two </w:t>
-      </w:r>
-      <w:proofErr w:type="spellStart"/>
-      <w:r>
-        <w:t>leftJoins</w:t>
-      </w:r>
-      <w:proofErr w:type="spellEnd"/>
-      <w:r>
-        <w:t xml:space="preserve"> chaining (from first table to doc table and doc table to second table - consider </w:t>
-      </w:r>
-      <w:proofErr w:type="gramStart"/>
-      <w:r>
-        <w:t>each .</w:t>
-      </w:r>
-      <w:proofErr w:type="spellStart"/>
-      <w:r>
-        <w:t>leftjoin</w:t>
-      </w:r>
-      <w:proofErr w:type="spellEnd"/>
-      <w:proofErr w:type="gramEnd"/>
-      <w:r>
-        <w:t xml:space="preserve"> as new table with joined values))</w:t>
+        <w:t>join many-to-many (by adding two leftJoins chaining (from first table to doc table and doc table to second table - consider each .leftjoin as new table with joined values))</w:t>
       </w:r>
     </w:p>
     <w:p>
@@ -2331,21 +1312,8 @@
           <w:numId w:val="8"/>
         </w:numPr>
       </w:pPr>
-      <w:proofErr w:type="spellStart"/>
-      <w:r>
-        <w:t>sqls</w:t>
-      </w:r>
-      <w:proofErr w:type="spellEnd"/>
-      <w:r>
-        <w:t xml:space="preserve"> (</w:t>
-      </w:r>
-      <w:proofErr w:type="spellStart"/>
-      <w:r>
-        <w:t>json_agg</w:t>
-      </w:r>
-      <w:proofErr w:type="spellEnd"/>
-      <w:r>
-        <w:t>, …)</w:t>
+      <w:r>
+        <w:t>sqls (json_agg, …)</w:t>
       </w:r>
     </w:p>
     <w:p>
@@ -2356,23 +1324,7 @@
         </w:numPr>
       </w:pPr>
       <w:r>
-        <w:t xml:space="preserve">Turning table type from string to </w:t>
-      </w:r>
-      <w:proofErr w:type="spellStart"/>
-      <w:r>
-        <w:t>enum</w:t>
-      </w:r>
-      <w:proofErr w:type="spellEnd"/>
-      <w:r>
-        <w:t xml:space="preserve"> (Must change </w:t>
-      </w:r>
-      <w:proofErr w:type="spellStart"/>
-      <w:r>
-        <w:t>sql</w:t>
-      </w:r>
-      <w:proofErr w:type="spellEnd"/>
-      <w:r>
-        <w:t xml:space="preserve"> manually)</w:t>
+        <w:t>Turning table type from string to enum (Must change sql manually)</w:t>
       </w:r>
     </w:p>
     <w:p>
@@ -2383,45 +1335,8 @@
         </w:numPr>
       </w:pPr>
       <w:r>
-        <w:t xml:space="preserve">must use </w:t>
-      </w:r>
-      <w:proofErr w:type="spellStart"/>
-      <w:r>
-        <w:t>sql</w:t>
-      </w:r>
-      <w:proofErr w:type="spellEnd"/>
-      <w:r>
-        <w:t xml:space="preserve"> USING keyword to convert types (ALTER TABLE "users" ALTER COLUMN "role" SET DATA TYPE "</w:t>
-      </w:r>
-      <w:proofErr w:type="spellStart"/>
-      <w:r>
-        <w:t>public"."role</w:t>
-      </w:r>
-      <w:proofErr w:type="spellEnd"/>
-      <w:r>
-        <w:t>" USING "role</w:t>
-      </w:r>
-      <w:proofErr w:type="gramStart"/>
-      <w:r>
-        <w:t>"::text::</w:t>
-      </w:r>
-      <w:proofErr w:type="gramEnd"/>
-      <w:r>
-        <w:t>"</w:t>
-      </w:r>
-      <w:proofErr w:type="spellStart"/>
-      <w:r>
-        <w:t>public"."role</w:t>
-      </w:r>
-      <w:proofErr w:type="spellEnd"/>
-      <w:r>
-        <w:t>"</w:t>
-      </w:r>
-      <w:proofErr w:type="gramStart"/>
-      <w:r>
-        <w:t>; )</w:t>
-      </w:r>
-      <w:proofErr w:type="gramEnd"/>
+        <w:t>must use sql USING keyword to convert types (ALTER TABLE "users" ALTER COLUMN "role" SET DATA TYPE "public"."role" USING "role"::text::"public"."role"; )</w:t>
+      </w:r>
     </w:p>
     <w:p>
       <w:pPr>
@@ -2475,15 +1390,7 @@
         </w:numPr>
       </w:pPr>
       <w:r>
-        <w:t>All unique fields must have READ function (</w:t>
-      </w:r>
-      <w:proofErr w:type="spellStart"/>
-      <w:r>
-        <w:t>readBy</w:t>
-      </w:r>
-      <w:proofErr w:type="spellEnd"/>
-      <w:r>
-        <w:t>)</w:t>
+        <w:t>All unique fields must have READ function (readBy)</w:t>
       </w:r>
     </w:p>
     <w:p>
@@ -2542,31 +1449,7 @@
         </w:numPr>
       </w:pPr>
       <w:r>
-        <w:t xml:space="preserve">Zod </w:t>
-      </w:r>
-      <w:proofErr w:type="spellStart"/>
-      <w:r>
-        <w:t>errorMap</w:t>
-      </w:r>
-      <w:proofErr w:type="spellEnd"/>
-      <w:r>
-        <w:t xml:space="preserve"> must defined in form with </w:t>
-      </w:r>
-      <w:proofErr w:type="spellStart"/>
-      <w:r>
-        <w:t>z.config</w:t>
-      </w:r>
-      <w:proofErr w:type="spellEnd"/>
-      <w:r>
-        <w:t xml:space="preserve"> (because it’s client-side and global (server-side </w:t>
-      </w:r>
-      <w:proofErr w:type="spellStart"/>
-      <w:r>
-        <w:t>layout.tsx</w:t>
-      </w:r>
-      <w:proofErr w:type="spellEnd"/>
-      <w:r>
-        <w:t>) is not readable in client-side) (set in dedicated client-side file and import to form</w:t>
+        <w:t>Zod errorMap must defined in form with z.config (because it’s client-side and global (server-side layout.tsx) is not readable in client-side) (set in dedicated client-side file and import to form</w:t>
       </w:r>
       <w:r>
         <w:t xml:space="preserve"> for </w:t>
@@ -2583,15 +1466,7 @@
         </w:numPr>
       </w:pPr>
       <w:r>
-        <w:t xml:space="preserve">Manage looking with label (with </w:t>
-      </w:r>
-      <w:proofErr w:type="spellStart"/>
-      <w:r>
-        <w:t>HTMLfor</w:t>
-      </w:r>
-      <w:proofErr w:type="spellEnd"/>
-      <w:r>
-        <w:t xml:space="preserve"> linked to input) with hidden input</w:t>
+        <w:t>Manage looking with label (with HTMLfor linked to input) with hidden input</w:t>
       </w:r>
     </w:p>
     <w:p>
@@ -2602,23 +1477,7 @@
         </w:numPr>
       </w:pPr>
       <w:r>
-        <w:t>Display file name with const file = watch(“</w:t>
-      </w:r>
-      <w:proofErr w:type="spellStart"/>
-      <w:r>
-        <w:t>inputName</w:t>
-      </w:r>
-      <w:proofErr w:type="spellEnd"/>
-      <w:r>
-        <w:t xml:space="preserve">”) (get from </w:t>
-      </w:r>
-      <w:proofErr w:type="spellStart"/>
-      <w:r>
-        <w:t>useForm</w:t>
-      </w:r>
-      <w:proofErr w:type="spellEnd"/>
-      <w:r>
-        <w:t>)</w:t>
+        <w:t>Display file name with const file = watch(“inputName”) (get from useForm)</w:t>
       </w:r>
     </w:p>
     <w:p>
@@ -2635,23 +1494,7 @@
       </w:pPr>
       <w:r>
         <w:lastRenderedPageBreak/>
-        <w:t xml:space="preserve">delete file input using </w:t>
-      </w:r>
-      <w:proofErr w:type="spellStart"/>
-      <w:r>
-        <w:t>resetFiled</w:t>
-      </w:r>
-      <w:proofErr w:type="spellEnd"/>
-      <w:r>
-        <w:t xml:space="preserve"> and </w:t>
-      </w:r>
-      <w:proofErr w:type="spellStart"/>
-      <w:r>
-        <w:t>clearErrors</w:t>
-      </w:r>
-      <w:proofErr w:type="spellEnd"/>
-      <w:r>
-        <w:t xml:space="preserve"> in clear button click handler</w:t>
+        <w:t>delete file input using resetFiled and clearErrors in clear button click handler</w:t>
       </w:r>
     </w:p>
     <w:p>
@@ -2662,31 +1505,10 @@
         </w:numPr>
       </w:pPr>
       <w:r>
-        <w:t>Display file preview with &lt;</w:t>
-      </w:r>
-      <w:proofErr w:type="spellStart"/>
-      <w:r>
-        <w:t>img</w:t>
-      </w:r>
-      <w:proofErr w:type="spellEnd"/>
-      <w:r>
-        <w:t xml:space="preserve"> </w:t>
-      </w:r>
-      <w:proofErr w:type="spellStart"/>
-      <w:r>
-        <w:t>src</w:t>
-      </w:r>
-      <w:proofErr w:type="spellEnd"/>
-      <w:r>
-        <w:t>={</w:t>
-      </w:r>
-      <w:proofErr w:type="spellStart"/>
-      <w:r>
-        <w:t>URL.createObjectURL</w:t>
-      </w:r>
-      <w:proofErr w:type="spellEnd"/>
-      <w:r>
-        <w:t>(file)}</w:t>
+        <w:t xml:space="preserve">Display file preview with &lt;img </w:t>
+      </w:r>
+      <w:r>
+        <w:t>src={URL.createObjectURL(file)}</w:t>
       </w:r>
       <w:r>
         <w:t xml:space="preserve"> /&gt;</w:t>
@@ -2715,15 +1537,7 @@
         <w:t>Create a single</w:t>
       </w:r>
       <w:r>
-        <w:t xml:space="preserve"> </w:t>
-      </w:r>
-      <w:proofErr w:type="spellStart"/>
-      <w:r>
-        <w:t>zod</w:t>
-      </w:r>
-      <w:proofErr w:type="spellEnd"/>
-      <w:r>
-        <w:t xml:space="preserve"> schema</w:t>
+        <w:t xml:space="preserve"> zod schema</w:t>
       </w:r>
       <w:r>
         <w:t xml:space="preserve"> </w:t>
@@ -2743,83 +1557,8 @@
         </w:numPr>
       </w:pPr>
       <w:r>
-        <w:t xml:space="preserve">(For </w:t>
-      </w:r>
-      <w:proofErr w:type="spellStart"/>
-      <w:r>
-        <w:t>multi mode</w:t>
-      </w:r>
-      <w:proofErr w:type="spellEnd"/>
-      <w:r>
-        <w:t xml:space="preserve"> operations (additional fields e.g. file), create custom </w:t>
-      </w:r>
-      <w:proofErr w:type="spellStart"/>
-      <w:r>
-        <w:t>zod</w:t>
-      </w:r>
-      <w:proofErr w:type="spellEnd"/>
-      <w:r>
-        <w:t xml:space="preserve"> schema) (For multi table (CURD in multiple tables operations e.g. users + orders) nest </w:t>
-      </w:r>
-      <w:proofErr w:type="spellStart"/>
-      <w:r>
-        <w:t>theyr</w:t>
-      </w:r>
-      <w:proofErr w:type="spellEnd"/>
-      <w:r>
-        <w:t xml:space="preserve"> schemas) create custom -&gt; use </w:t>
-      </w:r>
-      <w:proofErr w:type="spellStart"/>
-      <w:proofErr w:type="gramStart"/>
-      <w:r>
-        <w:t>z.object</w:t>
-      </w:r>
-      <w:proofErr w:type="spellEnd"/>
-      <w:proofErr w:type="gramEnd"/>
-      <w:r>
-        <w:t>({</w:t>
-      </w:r>
-      <w:proofErr w:type="spellStart"/>
-      <w:r>
-        <w:t>tableOne</w:t>
-      </w:r>
-      <w:proofErr w:type="spellEnd"/>
-      <w:r>
-        <w:t xml:space="preserve">: drizzleZodSchema1, </w:t>
-      </w:r>
-      <w:proofErr w:type="spellStart"/>
-      <w:r>
-        <w:t>tableTwo</w:t>
-      </w:r>
-      <w:proofErr w:type="spellEnd"/>
-      <w:r>
-        <w:t>: drizzleZodSchema2}) (register name converts to “nested_object_member.name" e.g. &lt;input {...</w:t>
-      </w:r>
-      <w:proofErr w:type="spellStart"/>
-      <w:proofErr w:type="gramStart"/>
-      <w:r>
-        <w:t>form.register</w:t>
-      </w:r>
-      <w:proofErr w:type="spellEnd"/>
-      <w:proofErr w:type="gramEnd"/>
-      <w:r>
-        <w:t>("</w:t>
-      </w:r>
-      <w:proofErr w:type="spellStart"/>
-      <w:proofErr w:type="gramStart"/>
-      <w:r>
-        <w:t>db.title</w:t>
-      </w:r>
-      <w:proofErr w:type="spellEnd"/>
-      <w:proofErr w:type="gramEnd"/>
-      <w:r>
-        <w:t>")} /</w:t>
-      </w:r>
-      <w:proofErr w:type="gramStart"/>
-      <w:r>
-        <w:t>&gt; )</w:t>
-      </w:r>
-      <w:proofErr w:type="gramEnd"/>
+        <w:t>(For multi mode operations (additional fields e.g. file), create custom zod schema) (For multi table (CURD in multiple tables operations e.g. users + orders) nest theyr schemas) create custom -&gt; use z.object({tableOne: drizzleZodSchema1, tableTwo: drizzleZodSchema2}) (register name converts to “nested_object_member.name" e.g. &lt;input {...form.register("db.title")} /&gt; )</w:t>
+      </w:r>
     </w:p>
     <w:p>
       <w:pPr>
@@ -2830,23 +1569,7 @@
         <w:spacing w:line="276" w:lineRule="auto"/>
       </w:pPr>
       <w:r>
-        <w:t xml:space="preserve">Use Extended </w:t>
-      </w:r>
-      <w:proofErr w:type="spellStart"/>
-      <w:r>
-        <w:t>zod</w:t>
-      </w:r>
-      <w:proofErr w:type="spellEnd"/>
-      <w:r>
-        <w:t xml:space="preserve"> DB schema with additional wanted values and for Append more-of-DB-schema values to </w:t>
-      </w:r>
-      <w:proofErr w:type="spellStart"/>
-      <w:r>
-        <w:t>useForm</w:t>
-      </w:r>
-      <w:proofErr w:type="spellEnd"/>
-      <w:r>
-        <w:t xml:space="preserve"> form</w:t>
+        <w:t>Use Extended zod DB schema with additional wanted values and for Append more-of-DB-schema values to useForm form</w:t>
       </w:r>
     </w:p>
     <w:p>
@@ -2871,13 +1594,8 @@
     <w:p/>
     <w:p>
       <w:r>
-        <w:t xml:space="preserve">Note next </w:t>
-      </w:r>
-      <w:proofErr w:type="spellStart"/>
-      <w:r>
-        <w:t>js</w:t>
-      </w:r>
-      <w:proofErr w:type="spellEnd"/>
+        <w:t>Note next js</w:t>
+      </w:r>
     </w:p>
     <w:p>
       <w:pPr>
@@ -2920,71 +1638,7 @@
         </w:numPr>
       </w:pPr>
       <w:r>
-        <w:t xml:space="preserve">Auto </w:t>
-      </w:r>
-      <w:proofErr w:type="gramStart"/>
-      <w:r>
-        <w:t>detect .env</w:t>
-      </w:r>
-      <w:proofErr w:type="gramEnd"/>
-      <w:r>
-        <w:t xml:space="preserve"> only works in next </w:t>
-      </w:r>
-      <w:proofErr w:type="spellStart"/>
-      <w:r>
-        <w:t>js</w:t>
-      </w:r>
-      <w:proofErr w:type="spellEnd"/>
-      <w:r>
-        <w:t xml:space="preserve"> bootstrap (run with </w:t>
-      </w:r>
-      <w:proofErr w:type="spellStart"/>
-      <w:r>
-        <w:t>npx</w:t>
-      </w:r>
-      <w:proofErr w:type="spellEnd"/>
-      <w:r>
-        <w:t xml:space="preserve"> next </w:t>
-      </w:r>
-      <w:proofErr w:type="gramStart"/>
-      <w:r>
-        <w:t>…..</w:t>
-      </w:r>
-      <w:proofErr w:type="gramEnd"/>
-      <w:r>
-        <w:t xml:space="preserve">), for files outside next </w:t>
-      </w:r>
-      <w:proofErr w:type="spellStart"/>
-      <w:r>
-        <w:t>js</w:t>
-      </w:r>
-      <w:proofErr w:type="spellEnd"/>
-      <w:r>
-        <w:t xml:space="preserve"> bootstrap (run with </w:t>
-      </w:r>
-      <w:proofErr w:type="spellStart"/>
-      <w:r>
-        <w:t>tsx</w:t>
-      </w:r>
-      <w:proofErr w:type="spellEnd"/>
-      <w:r>
-        <w:t xml:space="preserve"> </w:t>
-      </w:r>
-      <w:proofErr w:type="spellStart"/>
-      <w:r>
-        <w:t>file_name</w:t>
-      </w:r>
-      <w:proofErr w:type="spellEnd"/>
-      <w:r>
-        <w:t xml:space="preserve">) </w:t>
-      </w:r>
-      <w:proofErr w:type="spellStart"/>
-      <w:r>
-        <w:t>dotenv</w:t>
-      </w:r>
-      <w:proofErr w:type="spellEnd"/>
-      <w:r>
-        <w:t xml:space="preserve"> package is needed</w:t>
+        <w:t>Auto detect .env only works in next js bootstrap (run with npx next …..), for files outside next js bootstrap (run with tsx file_name) dotenv package is needed</w:t>
       </w:r>
     </w:p>
     <w:p>
@@ -2994,35 +1648,9 @@
           <w:numId w:val="9"/>
         </w:numPr>
       </w:pPr>
-      <w:proofErr w:type="spellStart"/>
-      <w:r>
-        <w:t>Ssr</w:t>
-      </w:r>
-      <w:proofErr w:type="spellEnd"/>
-      <w:r>
-        <w:t xml:space="preserve"> data is </w:t>
-      </w:r>
-      <w:proofErr w:type="spellStart"/>
-      <w:r>
-        <w:t>readble</w:t>
-      </w:r>
-      <w:proofErr w:type="spellEnd"/>
-      <w:r>
-        <w:t xml:space="preserve"> throw same HTTPS connection for </w:t>
-      </w:r>
-      <w:proofErr w:type="spellStart"/>
-      <w:r>
-        <w:t>seo</w:t>
-      </w:r>
-      <w:proofErr w:type="spellEnd"/>
-      <w:r>
-        <w:t xml:space="preserve"> bots even with suspense loading </w:t>
-      </w:r>
-      <w:proofErr w:type="spellStart"/>
-      <w:r>
-        <w:t>placholder</w:t>
-      </w:r>
-      <w:proofErr w:type="spellEnd"/>
+      <w:r>
+        <w:t>Ssr data is readble throw same HTTPS connection for seo bots even with suspense loading placholder</w:t>
+      </w:r>
     </w:p>
     <w:p>
       <w:pPr>
@@ -3032,13 +1660,8 @@
         </w:numPr>
       </w:pPr>
       <w:r>
-        <w:t xml:space="preserve">add article in next </w:t>
-      </w:r>
-      <w:proofErr w:type="spellStart"/>
-      <w:r>
-        <w:t>js</w:t>
-      </w:r>
-      <w:proofErr w:type="spellEnd"/>
+        <w:t>add article in next js</w:t>
+      </w:r>
     </w:p>
     <w:p>
       <w:r>
@@ -3069,15 +1692,7 @@
         </w:numPr>
       </w:pPr>
       <w:r>
-        <w:t xml:space="preserve">headers (cookie vs </w:t>
-      </w:r>
-      <w:proofErr w:type="spellStart"/>
-      <w:r>
-        <w:t>authorazation</w:t>
-      </w:r>
-      <w:proofErr w:type="spellEnd"/>
-      <w:r>
-        <w:t>)</w:t>
+        <w:t>headers (cookie vs authorazation)</w:t>
       </w:r>
     </w:p>
     <w:p>
@@ -3098,15 +1713,7 @@
     </w:p>
     <w:p>
       <w:r>
-        <w:t xml:space="preserve">- Manage user access with </w:t>
-      </w:r>
-      <w:proofErr w:type="spellStart"/>
-      <w:r>
-        <w:t>middlewares</w:t>
-      </w:r>
-      <w:proofErr w:type="spellEnd"/>
-      <w:r>
-        <w:t xml:space="preserve"> in protected pages to keep pages static</w:t>
+        <w:t>- Manage user access with middlewares in protected pages to keep pages static</w:t>
       </w:r>
     </w:p>
     <w:p>
@@ -3135,46 +1742,18 @@
       </w:r>
     </w:p>
     <w:p>
-      <w:proofErr w:type="spellStart"/>
-      <w:r>
-        <w:t>init</w:t>
-      </w:r>
-      <w:proofErr w:type="spellEnd"/>
-      <w:r>
-        <w:t xml:space="preserve"> </w:t>
-      </w:r>
-      <w:proofErr w:type="spellStart"/>
-      <w:r>
-        <w:t>typecsript</w:t>
-      </w:r>
-      <w:proofErr w:type="spellEnd"/>
-    </w:p>
-    <w:p>
-      <w:r>
-        <w:t xml:space="preserve">install </w:t>
-      </w:r>
-      <w:proofErr w:type="spellStart"/>
-      <w:r>
-        <w:t>cors</w:t>
-      </w:r>
-      <w:proofErr w:type="spellEnd"/>
-    </w:p>
-    <w:p>
-      <w:proofErr w:type="spellStart"/>
-      <w:r>
-        <w:t>init</w:t>
-      </w:r>
-      <w:proofErr w:type="spellEnd"/>
-      <w:r>
-        <w:t xml:space="preserve"> </w:t>
-      </w:r>
-      <w:proofErr w:type="spellStart"/>
-      <w:r>
-        <w:t>cors</w:t>
-      </w:r>
-      <w:proofErr w:type="spellEnd"/>
-      <w:r>
-        <w:t xml:space="preserve"> (for allow access from client)</w:t>
+      <w:r>
+        <w:t>init typecsript</w:t>
+      </w:r>
+    </w:p>
+    <w:p>
+      <w:r>
+        <w:t>install cors</w:t>
+      </w:r>
+    </w:p>
+    <w:p>
+      <w:r>
+        <w:t>init cors (for allow access from client)</w:t>
       </w:r>
     </w:p>
     <w:p>
@@ -3183,51 +1762,29 @@
       </w:r>
     </w:p>
     <w:p>
-      <w:proofErr w:type="spellStart"/>
-      <w:r>
-        <w:t>init</w:t>
-      </w:r>
-      <w:proofErr w:type="spellEnd"/>
-      <w:r>
-        <w:t xml:space="preserve"> cookie parser</w:t>
-      </w:r>
-    </w:p>
-    <w:p>
-      <w:r>
-        <w:t xml:space="preserve">add </w:t>
-      </w:r>
-      <w:proofErr w:type="spellStart"/>
-      <w:r>
-        <w:t>esmod</w:t>
-      </w:r>
-      <w:proofErr w:type="spellEnd"/>
-    </w:p>
-    <w:p>
-      <w:r>
-        <w:t xml:space="preserve">type module package </w:t>
-      </w:r>
-      <w:proofErr w:type="spellStart"/>
-      <w:r>
-        <w:t>json</w:t>
-      </w:r>
-      <w:proofErr w:type="spellEnd"/>
-    </w:p>
-    <w:p>
-      <w:proofErr w:type="spellStart"/>
+      <w:r>
+        <w:t>init cookie parser</w:t>
+      </w:r>
+    </w:p>
+    <w:p>
+      <w:r>
+        <w:t>add esmod</w:t>
+      </w:r>
+    </w:p>
+    <w:p>
+      <w:r>
+        <w:t>type module package json</w:t>
+      </w:r>
+    </w:p>
+    <w:p>
       <w:r>
         <w:t>allowImportingTsExtensions</w:t>
       </w:r>
-      <w:proofErr w:type="spellEnd"/>
-    </w:p>
-    <w:p>
-      <w:r>
-        <w:t xml:space="preserve">install </w:t>
-      </w:r>
-      <w:proofErr w:type="spellStart"/>
-      <w:r>
-        <w:t>nodemon</w:t>
-      </w:r>
-      <w:proofErr w:type="spellEnd"/>
+    </w:p>
+    <w:p>
+      <w:r>
+        <w:t>install nodemon</w:t>
+      </w:r>
     </w:p>
     <w:p>
       <w:r>

</xml_diff>

<commit_message>
fixing file preview with default value of already in database files
</commit_message>
<xml_diff>
--- a/notes.docx
+++ b/notes.docx
@@ -44,17 +44,6 @@
         </w:numPr>
       </w:pPr>
       <w:r>
-        <w:t>from db</w:t>
-      </w:r>
-    </w:p>
-    <w:p>
-      <w:pPr>
-        <w:numPr>
-          <w:ilvl w:val="1"/>
-          <w:numId w:val="14"/>
-        </w:numPr>
-      </w:pPr>
-      <w:r>
         <w:t>default value for file</w:t>
       </w:r>
     </w:p>
@@ -267,8 +256,13 @@
         <w:t>write</w:t>
       </w:r>
       <w:r>
-        <w:t xml:space="preserve"> onSubmit</w:t>
-      </w:r>
+        <w:t xml:space="preserve"> </w:t>
+      </w:r>
+      <w:proofErr w:type="spellStart"/>
+      <w:r>
+        <w:t>onSubmit</w:t>
+      </w:r>
+      <w:proofErr w:type="spellEnd"/>
     </w:p>
     <w:p>
       <w:pPr>
@@ -278,7 +272,15 @@
         </w:numPr>
       </w:pPr>
       <w:r>
-        <w:t>Send to api (with file / without file (direct values) difference)</w:t>
+        <w:t xml:space="preserve">Send to </w:t>
+      </w:r>
+      <w:proofErr w:type="spellStart"/>
+      <w:r>
+        <w:t>api</w:t>
+      </w:r>
+      <w:proofErr w:type="spellEnd"/>
+      <w:r>
+        <w:t xml:space="preserve"> (with file / without file (direct values) difference)</w:t>
       </w:r>
     </w:p>
     <w:p>
@@ -289,7 +291,23 @@
         </w:numPr>
       </w:pPr>
       <w:r>
-        <w:t>add db queries errors in onSubmit to RFH (on field) e.g. for add records with</w:t>
+        <w:t xml:space="preserve">add </w:t>
+      </w:r>
+      <w:proofErr w:type="spellStart"/>
+      <w:r>
+        <w:t>db</w:t>
+      </w:r>
+      <w:proofErr w:type="spellEnd"/>
+      <w:r>
+        <w:t xml:space="preserve"> queries errors in </w:t>
+      </w:r>
+      <w:proofErr w:type="spellStart"/>
+      <w:r>
+        <w:t>onSubmit</w:t>
+      </w:r>
+      <w:proofErr w:type="spellEnd"/>
+      <w:r>
+        <w:t xml:space="preserve"> to RFH (on field) e.g. for add records with</w:t>
       </w:r>
       <w:r>
         <w:t xml:space="preserve"> </w:t>
@@ -315,7 +333,15 @@
         <w:t xml:space="preserve">(test) </w:t>
       </w:r>
       <w:r>
-        <w:t>(with ui) *Axios*</w:t>
+        <w:t xml:space="preserve">(with </w:t>
+      </w:r>
+      <w:proofErr w:type="spellStart"/>
+      <w:r>
+        <w:t>ui</w:t>
+      </w:r>
+      <w:proofErr w:type="spellEnd"/>
+      <w:r>
+        <w:t>) *Axios*</w:t>
       </w:r>
     </w:p>
     <w:p/>
@@ -342,7 +368,15 @@
         </w:numPr>
       </w:pPr>
       <w:r>
-        <w:t xml:space="preserve">Add making form with useForm </w:t>
+        <w:t xml:space="preserve">Add making form with </w:t>
+      </w:r>
+      <w:proofErr w:type="spellStart"/>
+      <w:r>
+        <w:t>useForm</w:t>
+      </w:r>
+      <w:proofErr w:type="spellEnd"/>
+      <w:r>
+        <w:t xml:space="preserve"> </w:t>
       </w:r>
       <w:r>
         <w:t>form</w:t>
@@ -357,293 +391,723 @@
     <w:p/>
     <w:p>
       <w:r>
-        <w:lastRenderedPageBreak/>
-        <w:t>Create zod schema file template</w:t>
-      </w:r>
-    </w:p>
-    <w:p>
-      <w:r>
-        <w:t>create CRUD DB drizzle file template</w:t>
-      </w:r>
-    </w:p>
-    <w:p>
-      <w:r>
-        <w:t>Read media file (</w:t>
-      </w:r>
-      <w:r>
-        <w:t>from file manager</w:t>
-      </w:r>
-      <w:r>
-        <w:t>) (test)</w:t>
-      </w:r>
-    </w:p>
-    <w:p>
-      <w:r>
-        <w:t>create creating DB template (</w:t>
-      </w:r>
-      <w:r>
-        <w:t>Uuid for pg table</w:t>
-      </w:r>
-      <w:r>
-        <w:t>)</w:t>
-      </w:r>
-    </w:p>
-    <w:p>
-      <w:r>
-        <w:t>Next auth file template</w:t>
-      </w:r>
-    </w:p>
-    <w:p>
-      <w:r>
-        <w:t>??? CRUD Endpoint logic (DB getBys function)</w:t>
-      </w:r>
-    </w:p>
-    <w:p>
-      <w:r>
-        <w:t>upgrade endpoint template with new controller</w:t>
-      </w:r>
-    </w:p>
-    <w:p>
-      <w:r>
-        <w:t>React query (live templates)</w:t>
-      </w:r>
-    </w:p>
-    <w:p>
-      <w:r>
-        <w:t>DAL template (auth</w:t>
-      </w:r>
-      <w:r>
-        <w:t>, validation</w:t>
-      </w:r>
-      <w:r>
-        <w:t xml:space="preserve"> and cache manager layer)</w:t>
-      </w:r>
-    </w:p>
-    <w:p>
-      <w:r>
-        <w:t>?? Use DAL in client - or - API</w:t>
-      </w:r>
-    </w:p>
-    <w:p>
-      <w:r>
-        <w:t>Class Dark mode in tailwind</w:t>
-      </w:r>
-    </w:p>
-    <w:p>
-      <w:r>
-        <w:t>Zustland(file template ?? And live template)</w:t>
-      </w:r>
-    </w:p>
-    <w:p>
-      <w:r>
-        <w:t>Zarinpal API</w:t>
-      </w:r>
-    </w:p>
-    <w:p>
-      <w:r>
-        <w:t>Motion</w:t>
-      </w:r>
-    </w:p>
-    <w:p>
-      <w:r>
-        <w:t>Create dragble div</w:t>
-      </w:r>
-    </w:p>
-    <w:p>
-      <w:r>
-        <w:t>??? Use memo (create use callback with use memo)</w:t>
-      </w:r>
-    </w:p>
-    <w:p>
-      <w:r>
-        <w:t>Load on scroll</w:t>
-      </w:r>
-    </w:p>
-    <w:p>
-      <w:r>
-        <w:t>GenerateStaticParams tips</w:t>
-      </w:r>
-    </w:p>
-    <w:p>
-      <w:r>
-        <w:t>??? How to revalidate generateStaticParams cached pages</w:t>
-      </w:r>
-    </w:p>
-    <w:p>
-      <w:pPr>
-        <w:numPr>
-          <w:ilvl w:val="0"/>
-          <w:numId w:val="5"/>
-        </w:numPr>
-      </w:pPr>
-      <w:r>
-        <w:t>Return ?? [] in generateStaticParams after data fetch for when fetch data is undefined</w:t>
-      </w:r>
-    </w:p>
-    <w:p>
-      <w:pPr>
-        <w:numPr>
-          <w:ilvl w:val="0"/>
-          <w:numId w:val="5"/>
-        </w:numPr>
-      </w:pPr>
-      <w:r>
-        <w:t>Can’t use dynamic component in cached pages (with generateStaticParams) without cache components unless get error</w:t>
-      </w:r>
-    </w:p>
-    <w:p>
-      <w:r>
-        <w:t>Add generateStaticParams to route file template</w:t>
-      </w:r>
-    </w:p>
-    <w:p>
-      <w:r>
-        <w:t>Next pwa template (offline service worker)</w:t>
-      </w:r>
-    </w:p>
-    <w:p>
-      <w:r>
-        <w:t>PWA service workers (with offline support) - (with push notifications)</w:t>
-      </w:r>
-    </w:p>
-    <w:p>
-      <w:r>
-        <w:t>-------- through</w:t>
-      </w:r>
-    </w:p>
-    <w:p>
-      <w:r>
-        <w:lastRenderedPageBreak/>
-        <w:t xml:space="preserve">Re-touch </w:t>
-      </w:r>
-      <w:r>
-        <w:t>errorMap file</w:t>
-      </w:r>
-      <w:r>
-        <w:t xml:space="preserve"> errors</w:t>
-      </w:r>
-    </w:p>
-    <w:p/>
-    <w:p>
-      <w:r>
-        <w:t>Video player</w:t>
-      </w:r>
-    </w:p>
-    <w:p>
-      <w:r>
-        <w:t>Sending email</w:t>
-      </w:r>
-    </w:p>
-    <w:p>
-      <w:r>
-        <w:t>show ui guide on first load</w:t>
-      </w:r>
-    </w:p>
-    <w:p>
-      <w:r>
-        <w:t>websocket</w:t>
-      </w:r>
-    </w:p>
-    <w:p>
-      <w:r>
-        <w:t>Create chat system</w:t>
-      </w:r>
-    </w:p>
-    <w:p>
-      <w:r>
-        <w:t>Ai integration</w:t>
-      </w:r>
-    </w:p>
-    <w:p>
-      <w:r>
-        <w:t>Js note</w:t>
-      </w:r>
-    </w:p>
-    <w:p>
-      <w:r>
-        <w:t>Use (()=&gt;{ // function statements })() for run function when creating function</w:t>
-      </w:r>
-    </w:p>
-    <w:p>
-      <w:r>
-        <w:t>use || for return a value when a variable is null (what is the difference between ?? and || )</w:t>
-      </w:r>
-    </w:p>
-    <w:p>
-      <w:r>
-        <w:t>??? Why e.target.files?.[0] and e.target.files![0] are different sytaxes (same for objects e.g. controller.data![”user”] / controller.data?.[”user”])</w:t>
-      </w:r>
-    </w:p>
-    <w:p>
-      <w:r>
-        <w:t>Use [”key”] for convert string to object key</w:t>
-      </w:r>
-    </w:p>
-    <w:p>
-      <w:r>
-        <w:t>!! converts value to boolean *true if it exist and false if it's not*</w:t>
-      </w:r>
-    </w:p>
-    <w:p>
-      <w:r>
-        <w:t>difference bewteen .toString() and String(value)</w:t>
-      </w:r>
-    </w:p>
-    <w:p>
-      <w:r>
-        <w:t>??? use .toFixed(0) of Number class to remove decimals</w:t>
-      </w:r>
-    </w:p>
-    <w:p>
-      <w:r>
-        <w:t>What Object.bind does</w:t>
-      </w:r>
-    </w:p>
-    <w:p>
-      <w:r>
-        <w:t>replace const object with another object using object.assign</w:t>
-      </w:r>
-    </w:p>
-    <w:p>
-      <w:r>
-        <w:t>Adding ! in front of possibely undefine value will throw error if value is undefiend, caused remove ts error (add when you sure it’s not null)</w:t>
-      </w:r>
-    </w:p>
-    <w:p>
-      <w:r>
-        <w:t>For deleting field in object, distructur object with key names that wanted to be deleted and ...rest, and use rest object as deleted object</w:t>
-      </w:r>
-    </w:p>
-    <w:p>
-      <w:r>
-        <w:t>Create uuid with crypto.randomUUID() method</w:t>
-      </w:r>
-    </w:p>
-    <w:p>
-      <w:r>
-        <w:t>Distructure nested values with nested disctructure e.g. const {register, handleSubmit, formState: {errors}} = useForm *access nested “errors” object in formState object from useForm*</w:t>
-      </w:r>
-    </w:p>
-    <w:p>
-      <w:r>
-        <w:lastRenderedPageBreak/>
-        <w:t>??? .bind() for passing id to server action</w:t>
-      </w:r>
-    </w:p>
-    <w:p>
-      <w:r>
-        <w:t>??? use entries(), Object.formEntries() for catch form fields</w:t>
-      </w:r>
-    </w:p>
-    <w:p>
-      <w:r>
-        <w:t xml:space="preserve">Turn object to array for </w:t>
-      </w:r>
-      <w:r>
+        <w:t xml:space="preserve">Create </w:t>
+      </w:r>
+      <w:proofErr w:type="spellStart"/>
+      <w:r>
+        <w:t>zod</w:t>
+      </w:r>
+      <w:proofErr w:type="spellEnd"/>
+      <w:r>
+        <w:t xml:space="preserve"> schema file template</w:t>
+      </w:r>
+    </w:p>
+    <w:p>
+      <w:pPr>
         <w:rPr>
           <w:rtl/>
         </w:rPr>
-        <w:t>لیست گردشی</w:t>
+      </w:pPr>
+      <w:r>
+        <w:lastRenderedPageBreak/>
+        <w:t xml:space="preserve">create </w:t>
+      </w:r>
+      <w:r>
+        <w:t xml:space="preserve">DB </w:t>
+      </w:r>
+      <w:r>
+        <w:t>CRUD drizzle file template</w:t>
+      </w:r>
+    </w:p>
+    <w:p>
+      <w:r>
+        <w:t>create DB CRUD live templates</w:t>
+      </w:r>
+    </w:p>
+    <w:p>
+      <w:r>
+        <w:t>Read media file (</w:t>
+      </w:r>
+      <w:r>
+        <w:t>from file manager</w:t>
+      </w:r>
+      <w:r>
+        <w:t>) (test)</w:t>
+      </w:r>
+    </w:p>
+    <w:p>
+      <w:r>
+        <w:t>create creating DB template (</w:t>
+      </w:r>
+      <w:proofErr w:type="spellStart"/>
+      <w:r>
+        <w:t>Uuid</w:t>
+      </w:r>
+      <w:proofErr w:type="spellEnd"/>
+      <w:r>
+        <w:t xml:space="preserve"> for </w:t>
+      </w:r>
+      <w:proofErr w:type="spellStart"/>
+      <w:r>
+        <w:t>pg</w:t>
+      </w:r>
+      <w:proofErr w:type="spellEnd"/>
+      <w:r>
+        <w:t xml:space="preserve"> table</w:t>
+      </w:r>
+      <w:r>
+        <w:t>)</w:t>
+      </w:r>
+    </w:p>
+    <w:p>
+      <w:r>
+        <w:t>Next auth file template</w:t>
+      </w:r>
+    </w:p>
+    <w:p>
+      <w:r>
+        <w:t xml:space="preserve">??? CRUD Endpoint logic (DB </w:t>
+      </w:r>
+      <w:proofErr w:type="spellStart"/>
+      <w:r>
+        <w:t>getBys</w:t>
+      </w:r>
+      <w:proofErr w:type="spellEnd"/>
+      <w:r>
+        <w:t xml:space="preserve"> function)</w:t>
+      </w:r>
+    </w:p>
+    <w:p>
+      <w:r>
+        <w:t>upgrade endpoint template with new controller</w:t>
+      </w:r>
+    </w:p>
+    <w:p>
+      <w:r>
+        <w:t>DAL template (auth</w:t>
+      </w:r>
+      <w:r>
+        <w:t>, validation</w:t>
+      </w:r>
+      <w:r>
+        <w:t xml:space="preserve"> and cache manager layer)</w:t>
+      </w:r>
+    </w:p>
+    <w:p>
+      <w:r>
+        <w:t xml:space="preserve">?? Use DAL in client - or </w:t>
+      </w:r>
+      <w:r>
+        <w:t>–</w:t>
+      </w:r>
+      <w:r>
+        <w:t xml:space="preserve"> API</w:t>
+      </w:r>
+    </w:p>
+    <w:p>
+      <w:r>
+        <w:t>Class Dark mode in tailwind</w:t>
+      </w:r>
+    </w:p>
+    <w:p>
+      <w:proofErr w:type="spellStart"/>
+      <w:proofErr w:type="gramStart"/>
+      <w:r>
+        <w:t>Zustland</w:t>
+      </w:r>
+      <w:proofErr w:type="spellEnd"/>
+      <w:r>
+        <w:t>(</w:t>
+      </w:r>
+      <w:proofErr w:type="gramEnd"/>
+      <w:r>
+        <w:t xml:space="preserve">file </w:t>
+      </w:r>
+      <w:proofErr w:type="gramStart"/>
+      <w:r>
+        <w:t>template ??</w:t>
+      </w:r>
+      <w:proofErr w:type="gramEnd"/>
+      <w:r>
+        <w:t xml:space="preserve"> And live template)</w:t>
+      </w:r>
+    </w:p>
+    <w:p>
+      <w:proofErr w:type="spellStart"/>
+      <w:r>
+        <w:t>Zarinpal</w:t>
+      </w:r>
+      <w:proofErr w:type="spellEnd"/>
+      <w:r>
+        <w:t xml:space="preserve"> API</w:t>
+      </w:r>
+    </w:p>
+    <w:p>
+      <w:r>
+        <w:t>Motion</w:t>
+      </w:r>
+    </w:p>
+    <w:p>
+      <w:r>
+        <w:t xml:space="preserve">Create </w:t>
+      </w:r>
+      <w:proofErr w:type="spellStart"/>
+      <w:r>
+        <w:t>dragble</w:t>
+      </w:r>
+      <w:proofErr w:type="spellEnd"/>
+      <w:r>
+        <w:t xml:space="preserve"> div</w:t>
+      </w:r>
+    </w:p>
+    <w:p>
+      <w:r>
+        <w:t>??? Use memo (create use callback with use memo)</w:t>
+      </w:r>
+    </w:p>
+    <w:p>
+      <w:r>
+        <w:t>Load on scroll</w:t>
+      </w:r>
+    </w:p>
+    <w:p>
+      <w:proofErr w:type="spellStart"/>
+      <w:r>
+        <w:t>GenerateStaticParams</w:t>
+      </w:r>
+      <w:proofErr w:type="spellEnd"/>
+      <w:r>
+        <w:t xml:space="preserve"> tips</w:t>
+      </w:r>
+    </w:p>
+    <w:p>
+      <w:r>
+        <w:t xml:space="preserve">??? How to revalidate </w:t>
+      </w:r>
+      <w:proofErr w:type="spellStart"/>
+      <w:r>
+        <w:t>generateStaticParams</w:t>
+      </w:r>
+      <w:proofErr w:type="spellEnd"/>
+      <w:r>
+        <w:t xml:space="preserve"> cached pages</w:t>
+      </w:r>
+    </w:p>
+    <w:p>
+      <w:pPr>
+        <w:numPr>
+          <w:ilvl w:val="0"/>
+          <w:numId w:val="5"/>
+        </w:numPr>
+      </w:pPr>
+      <w:proofErr w:type="gramStart"/>
+      <w:r>
+        <w:t>Return ??</w:t>
+      </w:r>
+      <w:proofErr w:type="gramEnd"/>
+      <w:r>
+        <w:t xml:space="preserve"> [] in </w:t>
+      </w:r>
+      <w:proofErr w:type="spellStart"/>
+      <w:r>
+        <w:t>generateStaticParams</w:t>
+      </w:r>
+      <w:proofErr w:type="spellEnd"/>
+      <w:r>
+        <w:t xml:space="preserve"> after data fetch for when fetch data is undefined</w:t>
+      </w:r>
+    </w:p>
+    <w:p>
+      <w:pPr>
+        <w:numPr>
+          <w:ilvl w:val="0"/>
+          <w:numId w:val="5"/>
+        </w:numPr>
+      </w:pPr>
+      <w:r>
+        <w:t xml:space="preserve">Can’t use dynamic component in cached pages (with </w:t>
+      </w:r>
+      <w:proofErr w:type="spellStart"/>
+      <w:r>
+        <w:t>generateStaticParams</w:t>
+      </w:r>
+      <w:proofErr w:type="spellEnd"/>
+      <w:r>
+        <w:t>) without cache components unless get error</w:t>
+      </w:r>
+    </w:p>
+    <w:p>
+      <w:r>
+        <w:t xml:space="preserve">Add </w:t>
+      </w:r>
+      <w:proofErr w:type="spellStart"/>
+      <w:r>
+        <w:t>generateStaticParams</w:t>
+      </w:r>
+      <w:proofErr w:type="spellEnd"/>
+      <w:r>
+        <w:t xml:space="preserve"> to route file template</w:t>
+      </w:r>
+    </w:p>
+    <w:p>
+      <w:r>
+        <w:t xml:space="preserve">Next </w:t>
+      </w:r>
+      <w:proofErr w:type="spellStart"/>
+      <w:r>
+        <w:t>pwa</w:t>
+      </w:r>
+      <w:proofErr w:type="spellEnd"/>
+      <w:r>
+        <w:t xml:space="preserve"> template (offline service worker)</w:t>
+      </w:r>
+    </w:p>
+    <w:p>
+      <w:r>
+        <w:t>PWA service workers (with offline support) - (with push notifications)</w:t>
+      </w:r>
+    </w:p>
+    <w:p>
+      <w:r>
+        <w:t>-------- through</w:t>
+      </w:r>
+    </w:p>
+    <w:p>
+      <w:r>
+        <w:t>React query (live templates)</w:t>
+      </w:r>
+    </w:p>
+    <w:p>
+      <w:pPr>
+        <w:rPr>
+          <w:rFonts w:hint="cs"/>
+          <w:rtl/>
+          <w:lang w:bidi="prs-AF"/>
+        </w:rPr>
+      </w:pPr>
+      <w:r>
+        <w:lastRenderedPageBreak/>
+        <w:t>Video playe</w:t>
+      </w:r>
+      <w:r>
+        <w:t>r</w:t>
+      </w:r>
+    </w:p>
+    <w:p>
+      <w:r>
+        <w:t>Sending email</w:t>
+      </w:r>
+    </w:p>
+    <w:p>
+      <w:r>
+        <w:t xml:space="preserve">show </w:t>
+      </w:r>
+      <w:proofErr w:type="spellStart"/>
+      <w:r>
+        <w:t>ui</w:t>
+      </w:r>
+      <w:proofErr w:type="spellEnd"/>
+      <w:r>
+        <w:t xml:space="preserve"> guide on first load</w:t>
+      </w:r>
+    </w:p>
+    <w:p>
+      <w:proofErr w:type="spellStart"/>
+      <w:r>
+        <w:t>websocket</w:t>
+      </w:r>
+      <w:proofErr w:type="spellEnd"/>
+    </w:p>
+    <w:p>
+      <w:r>
+        <w:t>Create chat system</w:t>
+      </w:r>
+    </w:p>
+    <w:p>
+      <w:r>
+        <w:t>Ai integration</w:t>
+      </w:r>
+    </w:p>
+    <w:p>
+      <w:proofErr w:type="spellStart"/>
+      <w:r>
+        <w:t>Js</w:t>
+      </w:r>
+      <w:proofErr w:type="spellEnd"/>
+      <w:r>
+        <w:t xml:space="preserve"> note</w:t>
+      </w:r>
+    </w:p>
+    <w:p>
+      <w:r>
+        <w:t>Use (</w:t>
+      </w:r>
+      <w:proofErr w:type="gramStart"/>
+      <w:r>
+        <w:t>()=&gt;{ /</w:t>
+      </w:r>
+      <w:proofErr w:type="gramEnd"/>
+      <w:r>
+        <w:t xml:space="preserve">/ function </w:t>
+      </w:r>
+      <w:proofErr w:type="gramStart"/>
+      <w:r>
+        <w:t>statements })(</w:t>
+      </w:r>
+      <w:proofErr w:type="gramEnd"/>
+      <w:r>
+        <w:t>) for run function when creating function</w:t>
+      </w:r>
+    </w:p>
+    <w:p>
+      <w:r>
+        <w:t>use || for return a value when a variable is null (what is the difference between ?? and |</w:t>
+      </w:r>
+      <w:proofErr w:type="gramStart"/>
+      <w:r>
+        <w:t>| )</w:t>
+      </w:r>
+      <w:proofErr w:type="gramEnd"/>
+    </w:p>
+    <w:p>
+      <w:r>
+        <w:t xml:space="preserve">??? Why </w:t>
+      </w:r>
+      <w:proofErr w:type="spellStart"/>
+      <w:proofErr w:type="gramStart"/>
+      <w:r>
+        <w:t>e.target</w:t>
+      </w:r>
+      <w:proofErr w:type="gramEnd"/>
+      <w:r>
+        <w:t>.files</w:t>
+      </w:r>
+      <w:proofErr w:type="spellEnd"/>
+      <w:r>
+        <w:t xml:space="preserve">?.[0] and </w:t>
+      </w:r>
+      <w:proofErr w:type="spellStart"/>
+      <w:proofErr w:type="gramStart"/>
+      <w:r>
+        <w:t>e.target</w:t>
+      </w:r>
+      <w:proofErr w:type="gramEnd"/>
+      <w:r>
+        <w:t>.files</w:t>
+      </w:r>
+      <w:proofErr w:type="spellEnd"/>
+      <w:r>
+        <w:t xml:space="preserve">![0] are different </w:t>
+      </w:r>
+      <w:proofErr w:type="spellStart"/>
+      <w:r>
+        <w:t>sytaxes</w:t>
+      </w:r>
+      <w:proofErr w:type="spellEnd"/>
+      <w:r>
+        <w:t xml:space="preserve"> (same for objects e.g. </w:t>
+      </w:r>
+      <w:proofErr w:type="spellStart"/>
+      <w:r>
+        <w:t>controller.</w:t>
+      </w:r>
+      <w:proofErr w:type="gramStart"/>
+      <w:r>
+        <w:t>data</w:t>
+      </w:r>
+      <w:proofErr w:type="spellEnd"/>
+      <w:r>
+        <w:t>![</w:t>
+      </w:r>
+      <w:proofErr w:type="gramEnd"/>
+      <w:r>
+        <w:t xml:space="preserve">”user”] / </w:t>
+      </w:r>
+      <w:proofErr w:type="spellStart"/>
+      <w:r>
+        <w:t>controller.data</w:t>
+      </w:r>
+      <w:proofErr w:type="spellEnd"/>
+      <w:proofErr w:type="gramStart"/>
+      <w:r>
+        <w:t>?.[</w:t>
+      </w:r>
+      <w:proofErr w:type="gramEnd"/>
+      <w:r>
+        <w:t>”user”])</w:t>
+      </w:r>
+    </w:p>
+    <w:p>
+      <w:r>
+        <w:t>Use [”key”] for convert string to object key</w:t>
+      </w:r>
+    </w:p>
+    <w:p>
+      <w:r>
+        <w:t xml:space="preserve">!! converts value to </w:t>
+      </w:r>
+      <w:proofErr w:type="spellStart"/>
+      <w:r>
+        <w:t>boolean</w:t>
+      </w:r>
+      <w:proofErr w:type="spellEnd"/>
+      <w:r>
+        <w:t xml:space="preserve"> *true if it </w:t>
+      </w:r>
+      <w:proofErr w:type="gramStart"/>
+      <w:r>
+        <w:t>exist</w:t>
+      </w:r>
+      <w:proofErr w:type="gramEnd"/>
+      <w:r>
+        <w:t xml:space="preserve"> and false if it's not*</w:t>
+      </w:r>
+    </w:p>
+    <w:p>
+      <w:r>
+        <w:t xml:space="preserve">difference </w:t>
+      </w:r>
+      <w:proofErr w:type="spellStart"/>
+      <w:proofErr w:type="gramStart"/>
+      <w:r>
+        <w:t>bewteen</w:t>
+      </w:r>
+      <w:proofErr w:type="spellEnd"/>
+      <w:r>
+        <w:t xml:space="preserve"> .</w:t>
+      </w:r>
+      <w:proofErr w:type="spellStart"/>
+      <w:r>
+        <w:t>toString</w:t>
+      </w:r>
+      <w:proofErr w:type="spellEnd"/>
+      <w:proofErr w:type="gramEnd"/>
+      <w:r>
+        <w:t>() and String(value)</w:t>
+      </w:r>
+    </w:p>
+    <w:p>
+      <w:r>
+        <w:t xml:space="preserve">??? </w:t>
+      </w:r>
+      <w:proofErr w:type="gramStart"/>
+      <w:r>
+        <w:t>use .</w:t>
+      </w:r>
+      <w:proofErr w:type="spellStart"/>
+      <w:r>
+        <w:t>toFixed</w:t>
+      </w:r>
+      <w:proofErr w:type="spellEnd"/>
+      <w:proofErr w:type="gramEnd"/>
+      <w:r>
+        <w:t>(0) of Number class to remove decimals</w:t>
+      </w:r>
+    </w:p>
+    <w:p>
+      <w:r>
+        <w:t xml:space="preserve">What </w:t>
+      </w:r>
+      <w:proofErr w:type="spellStart"/>
+      <w:r>
+        <w:t>Object.bind</w:t>
+      </w:r>
+      <w:proofErr w:type="spellEnd"/>
+      <w:r>
+        <w:t xml:space="preserve"> does</w:t>
+      </w:r>
+    </w:p>
+    <w:p>
+      <w:r>
+        <w:t xml:space="preserve">replace const object with another object using </w:t>
+      </w:r>
+      <w:proofErr w:type="spellStart"/>
+      <w:proofErr w:type="gramStart"/>
+      <w:r>
+        <w:t>object.assign</w:t>
+      </w:r>
+      <w:proofErr w:type="spellEnd"/>
+      <w:proofErr w:type="gramEnd"/>
+    </w:p>
+    <w:p>
+      <w:proofErr w:type="gramStart"/>
+      <w:r>
+        <w:t>Adding !</w:t>
+      </w:r>
+      <w:proofErr w:type="gramEnd"/>
+      <w:r>
+        <w:t xml:space="preserve"> in front of </w:t>
+      </w:r>
+      <w:proofErr w:type="spellStart"/>
+      <w:r>
+        <w:t>possibely</w:t>
+      </w:r>
+      <w:proofErr w:type="spellEnd"/>
+      <w:r>
+        <w:t xml:space="preserve"> undefine value will throw error if value is </w:t>
+      </w:r>
+      <w:proofErr w:type="spellStart"/>
+      <w:r>
+        <w:t>undefiend</w:t>
+      </w:r>
+      <w:proofErr w:type="spellEnd"/>
+      <w:r>
+        <w:t xml:space="preserve">, caused remove </w:t>
+      </w:r>
+      <w:proofErr w:type="spellStart"/>
+      <w:r>
+        <w:t>ts</w:t>
+      </w:r>
+      <w:proofErr w:type="spellEnd"/>
+      <w:r>
+        <w:t xml:space="preserve"> error (add when you sure it’s not null)</w:t>
+      </w:r>
+    </w:p>
+    <w:p>
+      <w:r>
+        <w:t xml:space="preserve">For deleting field in object, </w:t>
+      </w:r>
+      <w:proofErr w:type="spellStart"/>
+      <w:r>
+        <w:t>distructur</w:t>
+      </w:r>
+      <w:proofErr w:type="spellEnd"/>
+      <w:r>
+        <w:t xml:space="preserve"> object with key names that wanted to be deleted and ...rest, and use rest object as deleted object</w:t>
+      </w:r>
+    </w:p>
+    <w:p>
+      <w:r>
+        <w:t xml:space="preserve">Create </w:t>
+      </w:r>
+      <w:proofErr w:type="spellStart"/>
+      <w:r>
+        <w:t>uuid</w:t>
+      </w:r>
+      <w:proofErr w:type="spellEnd"/>
+      <w:r>
+        <w:t xml:space="preserve"> with </w:t>
+      </w:r>
+      <w:proofErr w:type="spellStart"/>
+      <w:proofErr w:type="gramStart"/>
+      <w:r>
+        <w:t>crypto.randomUUID</w:t>
+      </w:r>
+      <w:proofErr w:type="spellEnd"/>
+      <w:proofErr w:type="gramEnd"/>
+      <w:r>
+        <w:t>() method</w:t>
+      </w:r>
+    </w:p>
+    <w:p>
+      <w:proofErr w:type="spellStart"/>
+      <w:r>
+        <w:t>Distructure</w:t>
+      </w:r>
+      <w:proofErr w:type="spellEnd"/>
+      <w:r>
+        <w:t xml:space="preserve"> nested values with nested </w:t>
+      </w:r>
+      <w:proofErr w:type="spellStart"/>
+      <w:r>
+        <w:t>disctructure</w:t>
+      </w:r>
+      <w:proofErr w:type="spellEnd"/>
+      <w:r>
+        <w:t xml:space="preserve"> e.g. const {register, </w:t>
+      </w:r>
+      <w:proofErr w:type="spellStart"/>
+      <w:r>
+        <w:t>handleSubmit</w:t>
+      </w:r>
+      <w:proofErr w:type="spellEnd"/>
+      <w:r>
+        <w:t xml:space="preserve">, </w:t>
+      </w:r>
+      <w:proofErr w:type="spellStart"/>
+      <w:r>
+        <w:t>formState</w:t>
+      </w:r>
+      <w:proofErr w:type="spellEnd"/>
+      <w:r>
+        <w:t xml:space="preserve">: {errors}} = </w:t>
+      </w:r>
+      <w:proofErr w:type="spellStart"/>
+      <w:r>
+        <w:t>useForm</w:t>
+      </w:r>
+      <w:proofErr w:type="spellEnd"/>
+      <w:r>
+        <w:t xml:space="preserve"> *access nested “errors” object in </w:t>
+      </w:r>
+      <w:proofErr w:type="spellStart"/>
+      <w:r>
+        <w:t>formState</w:t>
+      </w:r>
+      <w:proofErr w:type="spellEnd"/>
+      <w:r>
+        <w:t xml:space="preserve"> object from </w:t>
+      </w:r>
+      <w:proofErr w:type="spellStart"/>
+      <w:r>
+        <w:t>useForm</w:t>
+      </w:r>
+      <w:proofErr w:type="spellEnd"/>
+      <w:r>
+        <w:t>*</w:t>
+      </w:r>
+    </w:p>
+    <w:p>
+      <w:r>
+        <w:t xml:space="preserve">??? </w:t>
+      </w:r>
+      <w:proofErr w:type="gramStart"/>
+      <w:r>
+        <w:t>.bind</w:t>
+      </w:r>
+      <w:proofErr w:type="gramEnd"/>
+      <w:r>
+        <w:t>() for passing id to server action</w:t>
+      </w:r>
+    </w:p>
+    <w:p>
+      <w:r>
+        <w:t xml:space="preserve">??? use </w:t>
+      </w:r>
+      <w:proofErr w:type="gramStart"/>
+      <w:r>
+        <w:t>entries(</w:t>
+      </w:r>
+      <w:proofErr w:type="gramEnd"/>
+      <w:r>
+        <w:t xml:space="preserve">), </w:t>
+      </w:r>
+      <w:proofErr w:type="spellStart"/>
+      <w:r>
+        <w:t>Object.formEntries</w:t>
+      </w:r>
+      <w:proofErr w:type="spellEnd"/>
+      <w:r>
+        <w:t>() for catch form fields</w:t>
+      </w:r>
+    </w:p>
+    <w:p>
+      <w:r>
+        <w:lastRenderedPageBreak/>
+        <w:t xml:space="preserve">Turn object to array for </w:t>
+      </w:r>
+      <w:r>
+        <w:rPr>
+          <w:rtl/>
+        </w:rPr>
+        <w:t xml:space="preserve">لیست </w:t>
+      </w:r>
+      <w:proofErr w:type="gramStart"/>
+      <w:r>
+        <w:rPr>
+          <w:rtl/>
+        </w:rPr>
+        <w:t>گردشی</w:t>
       </w:r>
       <w:r>
         <w:t xml:space="preserve"> </w:t>
@@ -657,6 +1121,7 @@
       <w:r>
         <w:t>operations</w:t>
       </w:r>
+      <w:proofErr w:type="gramEnd"/>
     </w:p>
     <w:p>
       <w:pPr>
@@ -683,7 +1148,15 @@
         <w:t>Create</w:t>
       </w:r>
       <w:r>
-        <w:t xml:space="preserve"> file input with hidden class and label with HTMLfor linked to input for manage </w:t>
+        <w:t xml:space="preserve"> file input with hidden class and label with </w:t>
+      </w:r>
+      <w:proofErr w:type="spellStart"/>
+      <w:r>
+        <w:t>HTMLfor</w:t>
+      </w:r>
+      <w:proofErr w:type="spellEnd"/>
+      <w:r>
+        <w:t xml:space="preserve"> linked to input for manage </w:t>
       </w:r>
       <w:r>
         <w:t xml:space="preserve">form input </w:t>
@@ -736,7 +1209,23 @@
         </w:numPr>
       </w:pPr>
       <w:r>
-        <w:t>??? menu[number] for array - keyof typeof Object for object - Object[”key”] for object</w:t>
+        <w:t xml:space="preserve">??? menu[number] for array - </w:t>
+      </w:r>
+      <w:proofErr w:type="spellStart"/>
+      <w:r>
+        <w:t>keyof</w:t>
+      </w:r>
+      <w:proofErr w:type="spellEnd"/>
+      <w:r>
+        <w:t xml:space="preserve"> </w:t>
+      </w:r>
+      <w:proofErr w:type="spellStart"/>
+      <w:r>
+        <w:t>typeof</w:t>
+      </w:r>
+      <w:proofErr w:type="spellEnd"/>
+      <w:r>
+        <w:t xml:space="preserve"> Object for object - Object[”key”] for object</w:t>
       </w:r>
     </w:p>
     <w:p>
@@ -758,7 +1247,15 @@
         </w:numPr>
       </w:pPr>
       <w:r>
-        <w:t>with optional members on define &amp; use if(not_exists) return</w:t>
+        <w:t>with optional members on define &amp; use if(</w:t>
+      </w:r>
+      <w:proofErr w:type="spellStart"/>
+      <w:r>
+        <w:t>not_exists</w:t>
+      </w:r>
+      <w:proofErr w:type="spellEnd"/>
+      <w:r>
+        <w:t>) return</w:t>
       </w:r>
     </w:p>
     <w:p>
@@ -769,7 +1266,31 @@
         </w:numPr>
       </w:pPr>
       <w:r>
-        <w:t>Add generic type to arrow object with &lt;T&gt; before () e.g. const setSomething = &lt;T&gt;() =&gt; {} / async &lt;T&gt; ()=&gt;{}</w:t>
+        <w:t xml:space="preserve">Add generic type to arrow object with &lt;T&gt; before () e.g. const </w:t>
+      </w:r>
+      <w:proofErr w:type="spellStart"/>
+      <w:r>
+        <w:t>setSomething</w:t>
+      </w:r>
+      <w:proofErr w:type="spellEnd"/>
+      <w:r>
+        <w:t xml:space="preserve"> = &lt;T</w:t>
+      </w:r>
+      <w:proofErr w:type="gramStart"/>
+      <w:r>
+        <w:t>&gt;(</w:t>
+      </w:r>
+      <w:proofErr w:type="gramEnd"/>
+      <w:r>
+        <w:t xml:space="preserve">) =&gt; {} / async &lt;T&gt; </w:t>
+      </w:r>
+      <w:proofErr w:type="gramStart"/>
+      <w:r>
+        <w:t>()=&gt;{</w:t>
+      </w:r>
+      <w:proofErr w:type="gramEnd"/>
+      <w:r>
+        <w:t>}</w:t>
       </w:r>
     </w:p>
     <w:p>
@@ -779,13 +1300,23 @@
     </w:p>
     <w:p>
       <w:r>
-        <w:t>Note prisma</w:t>
-      </w:r>
-    </w:p>
-    <w:p>
-      <w:r>
-        <w:t>Note zod</w:t>
-      </w:r>
+        <w:t xml:space="preserve">Note </w:t>
+      </w:r>
+      <w:proofErr w:type="spellStart"/>
+      <w:r>
+        <w:t>prisma</w:t>
+      </w:r>
+      <w:proofErr w:type="spellEnd"/>
+    </w:p>
+    <w:p>
+      <w:r>
+        <w:t xml:space="preserve">Note </w:t>
+      </w:r>
+      <w:proofErr w:type="spellStart"/>
+      <w:r>
+        <w:t>zod</w:t>
+      </w:r>
+      <w:proofErr w:type="spellEnd"/>
     </w:p>
     <w:p>
       <w:pPr>
@@ -795,7 +1326,36 @@
         </w:numPr>
       </w:pPr>
       <w:r>
-        <w:t>Pick member from zod object validation (with .pick({key-name:true}) method)</w:t>
+        <w:t xml:space="preserve">Pick member from </w:t>
+      </w:r>
+      <w:proofErr w:type="spellStart"/>
+      <w:r>
+        <w:t>zod</w:t>
+      </w:r>
+      <w:proofErr w:type="spellEnd"/>
+      <w:r>
+        <w:t xml:space="preserve"> object validation (</w:t>
+      </w:r>
+      <w:proofErr w:type="gramStart"/>
+      <w:r>
+        <w:t>with .pick</w:t>
+      </w:r>
+      <w:proofErr w:type="gramEnd"/>
+      <w:r>
+        <w:t>({</w:t>
+      </w:r>
+      <w:proofErr w:type="spellStart"/>
+      <w:r>
+        <w:t>key-</w:t>
+      </w:r>
+      <w:proofErr w:type="gramStart"/>
+      <w:r>
+        <w:t>name:true</w:t>
+      </w:r>
+      <w:proofErr w:type="spellEnd"/>
+      <w:proofErr w:type="gramEnd"/>
+      <w:r>
+        <w:t>}) method)</w:t>
       </w:r>
     </w:p>
     <w:p>
@@ -806,7 +1366,15 @@
         </w:numPr>
       </w:pPr>
       <w:r>
-        <w:t>Extend schema into new schema via .extend(second schema) with another schema</w:t>
+        <w:t xml:space="preserve">Extend schema into new schema </w:t>
+      </w:r>
+      <w:proofErr w:type="gramStart"/>
+      <w:r>
+        <w:t>via .extend</w:t>
+      </w:r>
+      <w:proofErr w:type="gramEnd"/>
+      <w:r>
+        <w:t>(second schema) with another schema</w:t>
       </w:r>
     </w:p>
     <w:p>
@@ -817,8 +1385,13 @@
         </w:numPr>
       </w:pPr>
       <w:r>
-        <w:t>Manage file input (type, size, …) with superRefine</w:t>
-      </w:r>
+        <w:t xml:space="preserve">Manage file input (type, size, …) with </w:t>
+      </w:r>
+      <w:proofErr w:type="spellStart"/>
+      <w:r>
+        <w:t>superRefine</w:t>
+      </w:r>
+      <w:proofErr w:type="spellEnd"/>
       <w:r>
         <w:t xml:space="preserve"> after </w:t>
       </w:r>
@@ -849,8 +1422,67 @@
         </w:numPr>
       </w:pPr>
       <w:r>
+        <w:t>install packages (drizzle-</w:t>
+      </w:r>
+      <w:proofErr w:type="spellStart"/>
+      <w:r>
+        <w:t>orm</w:t>
+      </w:r>
+      <w:proofErr w:type="spellEnd"/>
+      <w:r>
+        <w:t xml:space="preserve">, </w:t>
+      </w:r>
+      <w:proofErr w:type="spellStart"/>
+      <w:proofErr w:type="gramStart"/>
+      <w:r>
+        <w:t>postgres</w:t>
+      </w:r>
+      <w:proofErr w:type="spellEnd"/>
+      <w:r>
+        <w:t xml:space="preserve"> ,drizzle</w:t>
+      </w:r>
+      <w:proofErr w:type="gramEnd"/>
+      <w:r>
+        <w:t>-kit -D, drizzle-</w:t>
+      </w:r>
+      <w:proofErr w:type="spellStart"/>
+      <w:r>
+        <w:t>zod</w:t>
+      </w:r>
+      <w:proofErr w:type="spellEnd"/>
+      <w:r>
+        <w:t>)</w:t>
+      </w:r>
+    </w:p>
+    <w:p>
+      <w:pPr>
+        <w:numPr>
+          <w:ilvl w:val="0"/>
+          <w:numId w:val="8"/>
+        </w:numPr>
+      </w:pPr>
+      <w:r>
+        <w:t>add DB_URL env</w:t>
+      </w:r>
+    </w:p>
+    <w:p>
+      <w:pPr>
+        <w:numPr>
+          <w:ilvl w:val="0"/>
+          <w:numId w:val="8"/>
+        </w:numPr>
+      </w:pPr>
+      <w:r>
         <w:lastRenderedPageBreak/>
-        <w:t>install packages (drizzle-orm, postgres ,drizzle-kit -D, drizzle-zod)</w:t>
+        <w:t xml:space="preserve">create </w:t>
+      </w:r>
+      <w:proofErr w:type="spellStart"/>
+      <w:r>
+        <w:t>drizzle.config.ts</w:t>
+      </w:r>
+      <w:proofErr w:type="spellEnd"/>
+      <w:r>
+        <w:t xml:space="preserve"> in root</w:t>
       </w:r>
     </w:p>
     <w:p>
@@ -860,9 +1492,6 @@
           <w:numId w:val="8"/>
         </w:numPr>
       </w:pPr>
-      <w:r>
-        <w:t>add DB_URL env</w:t>
-      </w:r>
     </w:p>
     <w:p>
       <w:pPr>
@@ -872,7 +1501,33 @@
         </w:numPr>
       </w:pPr>
       <w:r>
-        <w:t>create drizzle.config.ts in root</w:t>
+        <w:t xml:space="preserve">create </w:t>
+      </w:r>
+      <w:proofErr w:type="spellStart"/>
+      <w:proofErr w:type="gramStart"/>
+      <w:r>
+        <w:t>DB.schema</w:t>
+      </w:r>
+      <w:proofErr w:type="spellEnd"/>
+      <w:proofErr w:type="gramEnd"/>
+      <w:r>
+        <w:t xml:space="preserve"> file (import table entities from drizzle-</w:t>
+      </w:r>
+      <w:proofErr w:type="spellStart"/>
+      <w:r>
+        <w:t>orm</w:t>
+      </w:r>
+      <w:proofErr w:type="spellEnd"/>
+      <w:r>
+        <w:t>/</w:t>
+      </w:r>
+      <w:proofErr w:type="spellStart"/>
+      <w:r>
+        <w:t>pg</w:t>
+      </w:r>
+      <w:proofErr w:type="spellEnd"/>
+      <w:r>
+        <w:t>-core)</w:t>
       </w:r>
     </w:p>
     <w:p>
@@ -882,6 +1537,14 @@
           <w:numId w:val="8"/>
         </w:numPr>
       </w:pPr>
+      <w:r>
+        <w:t xml:space="preserve">run push for push schema to </w:t>
+      </w:r>
+      <w:proofErr w:type="spellStart"/>
+      <w:r>
+        <w:t>db</w:t>
+      </w:r>
+      <w:proofErr w:type="spellEnd"/>
     </w:p>
     <w:p>
       <w:pPr>
@@ -890,9 +1553,6 @@
           <w:numId w:val="8"/>
         </w:numPr>
       </w:pPr>
-      <w:r>
-        <w:t>create DB.schema file (import table entities from drizzle-orm/pg-core)</w:t>
-      </w:r>
     </w:p>
     <w:p>
       <w:pPr>
@@ -902,7 +1562,65 @@
         </w:numPr>
       </w:pPr>
       <w:r>
-        <w:t>run push for push schema to db</w:t>
+        <w:t xml:space="preserve">create </w:t>
+      </w:r>
+      <w:proofErr w:type="spellStart"/>
+      <w:proofErr w:type="gramStart"/>
+      <w:r>
+        <w:t>DB.connection</w:t>
+      </w:r>
+      <w:proofErr w:type="spellEnd"/>
+      <w:proofErr w:type="gramEnd"/>
+      <w:r>
+        <w:t xml:space="preserve"> for connect to </w:t>
+      </w:r>
+      <w:proofErr w:type="spellStart"/>
+      <w:r>
+        <w:t>db</w:t>
+      </w:r>
+      <w:proofErr w:type="spellEnd"/>
+      <w:r>
+        <w:t xml:space="preserve"> (import drizzle from drizzle-</w:t>
+      </w:r>
+      <w:proofErr w:type="spellStart"/>
+      <w:r>
+        <w:t>orm</w:t>
+      </w:r>
+      <w:proofErr w:type="spellEnd"/>
+      <w:r>
+        <w:t>/</w:t>
+      </w:r>
+      <w:proofErr w:type="spellStart"/>
+      <w:r>
+        <w:t>postgres-js</w:t>
+      </w:r>
+      <w:proofErr w:type="spellEnd"/>
+      <w:r>
+        <w:t xml:space="preserve">, </w:t>
+      </w:r>
+      <w:proofErr w:type="spellStart"/>
+      <w:r>
+        <w:t>postgres</w:t>
+      </w:r>
+      <w:proofErr w:type="spellEnd"/>
+      <w:r>
+        <w:t xml:space="preserve"> from </w:t>
+      </w:r>
+      <w:proofErr w:type="spellStart"/>
+      <w:r>
+        <w:t>postgres</w:t>
+      </w:r>
+      <w:proofErr w:type="spellEnd"/>
+      <w:r>
+        <w:t>, * as schema from DB/</w:t>
+      </w:r>
+      <w:proofErr w:type="spellStart"/>
+      <w:r>
+        <w:t>init</w:t>
+      </w:r>
+      <w:proofErr w:type="spellEnd"/>
+      <w:r>
+        <w:t>/schema)</w:t>
       </w:r>
     </w:p>
     <w:p>
@@ -921,7 +1639,25 @@
         </w:numPr>
       </w:pPr>
       <w:r>
-        <w:t>create DB.connection for connect to db (import drizzle from drizzle-orm/postgres-js, postgres from postgres, * as schema from DB/init/schema)</w:t>
+        <w:t xml:space="preserve">create </w:t>
+      </w:r>
+      <w:proofErr w:type="spellStart"/>
+      <w:proofErr w:type="gramStart"/>
+      <w:r>
+        <w:t>DB.migration</w:t>
+      </w:r>
+      <w:proofErr w:type="spellEnd"/>
+      <w:proofErr w:type="gramEnd"/>
+      <w:r>
+        <w:t xml:space="preserve"> for migrate schema changes to </w:t>
+      </w:r>
+      <w:proofErr w:type="spellStart"/>
+      <w:r>
+        <w:t>db</w:t>
+      </w:r>
+      <w:proofErr w:type="spellEnd"/>
+      <w:r>
+        <w:t xml:space="preserve"> (instead of drizzle-kit push (with saving history) (generate needed before using migration file) (migration file needed to run))</w:t>
       </w:r>
     </w:p>
     <w:p>
@@ -940,7 +1676,47 @@
         </w:numPr>
       </w:pPr>
       <w:r>
-        <w:t>create DB.migration for migrate schema changes to db (instead of drizzle-kit push (with saving history) (generate needed before using migration file) (migration file needed to run))</w:t>
+        <w:t xml:space="preserve">Use in code for create </w:t>
+      </w:r>
+      <w:proofErr w:type="spellStart"/>
+      <w:r>
+        <w:t>sql</w:t>
+      </w:r>
+      <w:proofErr w:type="spellEnd"/>
+      <w:r>
+        <w:t xml:space="preserve"> and export type with </w:t>
+      </w:r>
+      <w:proofErr w:type="spellStart"/>
+      <w:r>
+        <w:t>inferInsertModel</w:t>
+      </w:r>
+      <w:proofErr w:type="spellEnd"/>
+      <w:r>
+        <w:t xml:space="preserve"> and </w:t>
+      </w:r>
+      <w:proofErr w:type="spellStart"/>
+      <w:r>
+        <w:t>inferSelectModel</w:t>
+      </w:r>
+      <w:proofErr w:type="spellEnd"/>
+      <w:r>
+        <w:t xml:space="preserve"> (</w:t>
+      </w:r>
+      <w:proofErr w:type="spellStart"/>
+      <w:r>
+        <w:t>InferSelectModel</w:t>
+      </w:r>
+      <w:proofErr w:type="spellEnd"/>
+      <w:r>
+        <w:t xml:space="preserve"> returns type of all fields, </w:t>
+      </w:r>
+      <w:proofErr w:type="spellStart"/>
+      <w:r>
+        <w:t>InferInsertModel</w:t>
+      </w:r>
+      <w:proofErr w:type="spellEnd"/>
+      <w:r>
+        <w:t xml:space="preserve"> returns required fields with optional type for optional DB fields (those have default value in table))</w:t>
       </w:r>
     </w:p>
     <w:p>
@@ -950,6 +1726,9 @@
           <w:numId w:val="8"/>
         </w:numPr>
       </w:pPr>
+      <w:r>
+        <w:t>SQL behind the scene workflow</w:t>
+      </w:r>
     </w:p>
     <w:p>
       <w:pPr>
@@ -959,7 +1738,7 @@
         </w:numPr>
       </w:pPr>
       <w:r>
-        <w:t>Use in code for create sql and export type with inferInsertModel and inferSelectModel (InferSelectModel returns type of all fields, InferInsertModel returns required fields with optional type for optional DB fields (those have default value in table))</w:t>
+        <w:t>1. get all records from table (FROM)</w:t>
       </w:r>
     </w:p>
     <w:p>
@@ -970,7 +1749,7 @@
         </w:numPr>
       </w:pPr>
       <w:r>
-        <w:t>SQL behind the scene workflow</w:t>
+        <w:t>2. join records with another tables (JOINs)</w:t>
       </w:r>
     </w:p>
     <w:p>
@@ -981,7 +1760,7 @@
         </w:numPr>
       </w:pPr>
       <w:r>
-        <w:t>1. get all records from table (FROM)</w:t>
+        <w:t>3. field selection condition (WHERE)</w:t>
       </w:r>
     </w:p>
     <w:p>
@@ -992,7 +1771,7 @@
         </w:numPr>
       </w:pPr>
       <w:r>
-        <w:t>2. join records with another tables (JOINs)</w:t>
+        <w:t>4. grouping records (GROUP BY)</w:t>
       </w:r>
     </w:p>
     <w:p>
@@ -1003,7 +1782,7 @@
         </w:numPr>
       </w:pPr>
       <w:r>
-        <w:t>3. field selection condition (WHERE)</w:t>
+        <w:t>5. grouped field condition (HAVING)</w:t>
       </w:r>
     </w:p>
     <w:p>
@@ -1014,7 +1793,15 @@
         </w:numPr>
       </w:pPr>
       <w:r>
-        <w:t>4. grouping records (GROUP BY)</w:t>
+        <w:t>6. aggregates (if exists) (</w:t>
+      </w:r>
+      <w:proofErr w:type="spellStart"/>
+      <w:r>
+        <w:t>agg</w:t>
+      </w:r>
+      <w:proofErr w:type="spellEnd"/>
+      <w:r>
+        <w:t xml:space="preserve"> functions)</w:t>
       </w:r>
     </w:p>
     <w:p>
@@ -1025,7 +1812,7 @@
         </w:numPr>
       </w:pPr>
       <w:r>
-        <w:t>5. grouped field condition (HAVING)</w:t>
+        <w:t>7. select fields (SELECT)</w:t>
       </w:r>
     </w:p>
     <w:p>
@@ -1036,7 +1823,23 @@
         </w:numPr>
       </w:pPr>
       <w:r>
-        <w:t>6. aggregates (if exists) (agg functions)</w:t>
+        <w:t xml:space="preserve">type </w:t>
+      </w:r>
+      <w:proofErr w:type="spellStart"/>
+      <w:r>
+        <w:t>Tresult</w:t>
+      </w:r>
+      <w:proofErr w:type="spellEnd"/>
+      <w:r>
+        <w:t xml:space="preserve"> = </w:t>
+      </w:r>
+      <w:proofErr w:type="spellStart"/>
+      <w:r>
+        <w:t>typeof</w:t>
+      </w:r>
+      <w:proofErr w:type="spellEnd"/>
+      <w:r>
+        <w:t xml:space="preserve"> result, would get type of executed query automatically</w:t>
       </w:r>
     </w:p>
     <w:p>
@@ -1047,7 +1850,60 @@
         </w:numPr>
       </w:pPr>
       <w:r>
-        <w:t>7. select fields (SELECT)</w:t>
+        <w:t xml:space="preserve">On creating entity, name argument (as string) is require beside </w:t>
+      </w:r>
+      <w:proofErr w:type="spellStart"/>
+      <w:r>
+        <w:t>ts</w:t>
+      </w:r>
+      <w:proofErr w:type="spellEnd"/>
+      <w:r>
+        <w:t xml:space="preserve"> key name for separate </w:t>
+      </w:r>
+      <w:proofErr w:type="spellStart"/>
+      <w:r>
+        <w:t>sql</w:t>
+      </w:r>
+      <w:proofErr w:type="spellEnd"/>
+      <w:r>
+        <w:t xml:space="preserve"> logic from </w:t>
+      </w:r>
+      <w:proofErr w:type="spellStart"/>
+      <w:r>
+        <w:t>ts</w:t>
+      </w:r>
+      <w:proofErr w:type="spellEnd"/>
+      <w:r>
+        <w:t xml:space="preserve"> logic e.g. </w:t>
+      </w:r>
+      <w:proofErr w:type="spellStart"/>
+      <w:r>
+        <w:t>createdAt</w:t>
+      </w:r>
+      <w:proofErr w:type="spellEnd"/>
+      <w:r>
+        <w:t>: serial(“</w:t>
+      </w:r>
+      <w:proofErr w:type="spellStart"/>
+      <w:r>
+        <w:t>created_at</w:t>
+      </w:r>
+      <w:proofErr w:type="spellEnd"/>
+      <w:r>
+        <w:t>”</w:t>
+      </w:r>
+      <w:proofErr w:type="gramStart"/>
+      <w:r>
+        <w:t>).</w:t>
+      </w:r>
+      <w:proofErr w:type="spellStart"/>
+      <w:r>
+        <w:t>primaryKey</w:t>
+      </w:r>
+      <w:proofErr w:type="spellEnd"/>
+      <w:proofErr w:type="gramEnd"/>
+      <w:r>
+        <w:t>()</w:t>
       </w:r>
     </w:p>
     <w:p>
@@ -1058,7 +1914,73 @@
         </w:numPr>
       </w:pPr>
       <w:r>
-        <w:t>type Tresult = typeof result, would get type of executed query automatically</w:t>
+        <w:t xml:space="preserve">Passing arrays as value </w:t>
+      </w:r>
+      <w:proofErr w:type="gramStart"/>
+      <w:r>
+        <w:t>to .insert</w:t>
+      </w:r>
+      <w:proofErr w:type="gramEnd"/>
+      <w:r>
+        <w:t>(</w:t>
+      </w:r>
+      <w:proofErr w:type="spellStart"/>
+      <w:r>
+        <w:t>table_name</w:t>
+      </w:r>
+      <w:proofErr w:type="spellEnd"/>
+      <w:proofErr w:type="gramStart"/>
+      <w:r>
+        <w:t>).values</w:t>
+      </w:r>
+      <w:proofErr w:type="gramEnd"/>
+      <w:r>
+        <w:t xml:space="preserve">() makes multiple records </w:t>
+      </w:r>
+      <w:proofErr w:type="gramStart"/>
+      <w:r>
+        <w:t>e.g. .insert</w:t>
+      </w:r>
+      <w:proofErr w:type="gramEnd"/>
+      <w:r>
+        <w:t>(</w:t>
+      </w:r>
+      <w:proofErr w:type="spellStart"/>
+      <w:r>
+        <w:t>table_name</w:t>
+      </w:r>
+      <w:proofErr w:type="spellEnd"/>
+      <w:proofErr w:type="gramStart"/>
+      <w:r>
+        <w:t>).values</w:t>
+      </w:r>
+      <w:proofErr w:type="gramEnd"/>
+      <w:r>
+        <w:t>([{name: “</w:t>
+      </w:r>
+      <w:proofErr w:type="spellStart"/>
+      <w:r>
+        <w:t>ali</w:t>
+      </w:r>
+      <w:proofErr w:type="spellEnd"/>
+      <w:r>
+        <w:t>”, age: 25</w:t>
+      </w:r>
+      <w:proofErr w:type="gramStart"/>
+      <w:r>
+        <w:t>},{</w:t>
+      </w:r>
+      <w:proofErr w:type="gramEnd"/>
+      <w:r>
+        <w:t>name:"</w:t>
+      </w:r>
+      <w:proofErr w:type="spellStart"/>
+      <w:r>
+        <w:t>mamad</w:t>
+      </w:r>
+      <w:proofErr w:type="spellEnd"/>
+      <w:r>
+        <w:t>”, age: 20}])</w:t>
       </w:r>
     </w:p>
     <w:p>
@@ -1068,32 +1990,28 @@
           <w:numId w:val="8"/>
         </w:numPr>
       </w:pPr>
-      <w:r>
-        <w:t>On creating entity, name argument (as string) is require beside ts key name for separate sql logic from ts logic e.g. createdAt: serial(“created_at”).primaryKey()</w:t>
-      </w:r>
-    </w:p>
-    <w:p>
-      <w:pPr>
-        <w:numPr>
-          <w:ilvl w:val="0"/>
-          <w:numId w:val="8"/>
-        </w:numPr>
-      </w:pPr>
+      <w:proofErr w:type="gramStart"/>
       <w:r>
         <w:lastRenderedPageBreak/>
-        <w:t>Passing arrays as value to .insert(table_name).values() makes multiple records e.g. .insert(table_name).values([{name: “ali”, age: 25},{name:"mamad”, age: 20}])</w:t>
-      </w:r>
-    </w:p>
-    <w:p>
-      <w:pPr>
-        <w:numPr>
-          <w:ilvl w:val="0"/>
-          <w:numId w:val="8"/>
-        </w:numPr>
-      </w:pPr>
-      <w:r>
-        <w:t>.returning() for (end of) creating / updating / deleting, returns just created / updated / deleted record values (returns specific values with passing object to it e.g. .returning({id: users.id, name: users.name}) )</w:t>
-      </w:r>
+        <w:t>.returning</w:t>
+      </w:r>
+      <w:proofErr w:type="gramEnd"/>
+      <w:r>
+        <w:t xml:space="preserve">() for (end of) creating / updating / deleting, returns just created / updated / deleted record values (returns specific values with passing object to it </w:t>
+      </w:r>
+      <w:proofErr w:type="gramStart"/>
+      <w:r>
+        <w:t>e.g. .returning</w:t>
+      </w:r>
+      <w:proofErr w:type="gramEnd"/>
+      <w:r>
+        <w:t>({id: users.id, name: users.name}</w:t>
+      </w:r>
+      <w:proofErr w:type="gramStart"/>
+      <w:r>
+        <w:t>) )</w:t>
+      </w:r>
+      <w:proofErr w:type="gramEnd"/>
     </w:p>
     <w:p>
       <w:pPr>
@@ -1191,7 +2109,36 @@
         </w:numPr>
       </w:pPr>
       <w:r>
-        <w:t>think joins as two step operation (step one. Join all rows of two tables (full join). Step two. Consider which rows to select (left join: only rows that first table’s primary key is not null, right join: only rows that second table’s primary key is not null, inner join: only rows that both and first table’s primary key are not null )) (all could be created with WHERE isNotNull(), but joins has more performance)</w:t>
+        <w:t xml:space="preserve">think joins as two step operation (step one. Join all rows of two tables (full join). Step two. Consider which rows to select (left join: only rows that first table’s primary key is not null, right join: only rows that second table’s primary key is not null, inner join: only rows that both and first table’s primary key are not </w:t>
+      </w:r>
+      <w:proofErr w:type="gramStart"/>
+      <w:r>
+        <w:t>null )</w:t>
+      </w:r>
+      <w:proofErr w:type="gramEnd"/>
+      <w:r>
+        <w:t xml:space="preserve">) (all could be created with WHERE </w:t>
+      </w:r>
+      <w:proofErr w:type="spellStart"/>
+      <w:proofErr w:type="gramStart"/>
+      <w:r>
+        <w:t>isNotNull</w:t>
+      </w:r>
+      <w:proofErr w:type="spellEnd"/>
+      <w:r>
+        <w:t>(</w:t>
+      </w:r>
+      <w:proofErr w:type="gramEnd"/>
+      <w:r>
+        <w:t xml:space="preserve">), but joins </w:t>
+      </w:r>
+      <w:proofErr w:type="gramStart"/>
+      <w:r>
+        <w:t>has</w:t>
+      </w:r>
+      <w:proofErr w:type="gramEnd"/>
+      <w:r>
+        <w:t xml:space="preserve"> more performance)</w:t>
       </w:r>
     </w:p>
     <w:p>
@@ -1202,7 +2149,52 @@
         </w:numPr>
       </w:pPr>
       <w:r>
-        <w:t>Get all when a filter is null using (filter ? Filter condition : undefined) e.g. city ? eq(table.city, city) : undefined</w:t>
+        <w:t>Get all when a filter is null using (</w:t>
+      </w:r>
+      <w:proofErr w:type="gramStart"/>
+      <w:r>
+        <w:t>filter ?</w:t>
+      </w:r>
+      <w:proofErr w:type="gramEnd"/>
+      <w:r>
+        <w:t xml:space="preserve"> Filter </w:t>
+      </w:r>
+      <w:proofErr w:type="gramStart"/>
+      <w:r>
+        <w:t>condition :</w:t>
+      </w:r>
+      <w:proofErr w:type="gramEnd"/>
+      <w:r>
+        <w:t xml:space="preserve"> undefined) e.g. </w:t>
+      </w:r>
+      <w:proofErr w:type="gramStart"/>
+      <w:r>
+        <w:t>city ?</w:t>
+      </w:r>
+      <w:proofErr w:type="gramEnd"/>
+      <w:r>
+        <w:t xml:space="preserve"> </w:t>
+      </w:r>
+      <w:proofErr w:type="gramStart"/>
+      <w:r>
+        <w:t>eq(</w:t>
+      </w:r>
+      <w:proofErr w:type="spellStart"/>
+      <w:r>
+        <w:t>table.city</w:t>
+      </w:r>
+      <w:proofErr w:type="spellEnd"/>
+      <w:proofErr w:type="gramEnd"/>
+      <w:r>
+        <w:t>, city</w:t>
+      </w:r>
+      <w:proofErr w:type="gramStart"/>
+      <w:r>
+        <w:t>) :</w:t>
+      </w:r>
+      <w:proofErr w:type="gramEnd"/>
+      <w:r>
+        <w:t xml:space="preserve"> undefined</w:t>
       </w:r>
     </w:p>
     <w:p>
@@ -1213,7 +2205,23 @@
         </w:numPr>
       </w:pPr>
       <w:r>
-        <w:t>COALESCE = returning value if a value is null (COALESCE( ${value}, 80 )) (if value was null, output will be 80)</w:t>
+        <w:t>COALESCE = returning value if a value is null (</w:t>
+      </w:r>
+      <w:proofErr w:type="gramStart"/>
+      <w:r>
+        <w:t>COALESCE( $</w:t>
+      </w:r>
+      <w:proofErr w:type="gramEnd"/>
+      <w:r>
+        <w:t xml:space="preserve">{value}, </w:t>
+      </w:r>
+      <w:proofErr w:type="gramStart"/>
+      <w:r>
+        <w:t>80 )</w:t>
+      </w:r>
+      <w:proofErr w:type="gramEnd"/>
+      <w:r>
+        <w:t>) (if value was null, output will be 80)</w:t>
       </w:r>
     </w:p>
     <w:p>
@@ -1224,7 +2232,28 @@
         </w:numPr>
       </w:pPr>
       <w:r>
-        <w:t>join many-to-many (by adding two leftJoins chaining (from first table to doc table and doc table to second table - consider each .leftjoin as new table with joined values))</w:t>
+        <w:t xml:space="preserve">join many-to-many (by adding two </w:t>
+      </w:r>
+      <w:proofErr w:type="spellStart"/>
+      <w:r>
+        <w:t>leftJoins</w:t>
+      </w:r>
+      <w:proofErr w:type="spellEnd"/>
+      <w:r>
+        <w:t xml:space="preserve"> chaining (from first table to doc table and doc table to second table - consider </w:t>
+      </w:r>
+      <w:proofErr w:type="gramStart"/>
+      <w:r>
+        <w:t>each .</w:t>
+      </w:r>
+      <w:proofErr w:type="spellStart"/>
+      <w:r>
+        <w:t>leftjoin</w:t>
+      </w:r>
+      <w:proofErr w:type="spellEnd"/>
+      <w:proofErr w:type="gramEnd"/>
+      <w:r>
+        <w:t xml:space="preserve"> as new table with joined values))</w:t>
       </w:r>
     </w:p>
     <w:p>
@@ -1301,8 +2330,59 @@
         </w:numPr>
       </w:pPr>
       <w:r>
+        <w:t>functions (AVG, MAX, MIN, …)</w:t>
+      </w:r>
+    </w:p>
+    <w:p>
+      <w:pPr>
+        <w:numPr>
+          <w:ilvl w:val="0"/>
+          <w:numId w:val="8"/>
+        </w:numPr>
+      </w:pPr>
+      <w:proofErr w:type="spellStart"/>
+      <w:r>
+        <w:t>sqls</w:t>
+      </w:r>
+      <w:proofErr w:type="spellEnd"/>
+      <w:r>
+        <w:t xml:space="preserve"> (</w:t>
+      </w:r>
+      <w:proofErr w:type="spellStart"/>
+      <w:r>
+        <w:t>json_agg</w:t>
+      </w:r>
+      <w:proofErr w:type="spellEnd"/>
+      <w:r>
+        <w:t>, …)</w:t>
+      </w:r>
+    </w:p>
+    <w:p>
+      <w:pPr>
+        <w:numPr>
+          <w:ilvl w:val="0"/>
+          <w:numId w:val="8"/>
+        </w:numPr>
+      </w:pPr>
+      <w:r>
         <w:lastRenderedPageBreak/>
-        <w:t>functions (AVG, MAX, MIN, …)</w:t>
+        <w:t xml:space="preserve">Turning table type from string to </w:t>
+      </w:r>
+      <w:proofErr w:type="spellStart"/>
+      <w:r>
+        <w:t>enum</w:t>
+      </w:r>
+      <w:proofErr w:type="spellEnd"/>
+      <w:r>
+        <w:t xml:space="preserve"> (Must change </w:t>
+      </w:r>
+      <w:proofErr w:type="spellStart"/>
+      <w:r>
+        <w:t>sql</w:t>
+      </w:r>
+      <w:proofErr w:type="spellEnd"/>
+      <w:r>
+        <w:t xml:space="preserve"> manually)</w:t>
       </w:r>
     </w:p>
     <w:p>
@@ -1313,8 +2393,45 @@
         </w:numPr>
       </w:pPr>
       <w:r>
-        <w:t>sqls (json_agg, …)</w:t>
-      </w:r>
+        <w:t xml:space="preserve">must use </w:t>
+      </w:r>
+      <w:proofErr w:type="spellStart"/>
+      <w:r>
+        <w:t>sql</w:t>
+      </w:r>
+      <w:proofErr w:type="spellEnd"/>
+      <w:r>
+        <w:t xml:space="preserve"> USING keyword to convert types (ALTER TABLE "users" ALTER COLUMN "role" SET DATA TYPE "</w:t>
+      </w:r>
+      <w:proofErr w:type="spellStart"/>
+      <w:r>
+        <w:t>public"."role</w:t>
+      </w:r>
+      <w:proofErr w:type="spellEnd"/>
+      <w:r>
+        <w:t>" USING "role</w:t>
+      </w:r>
+      <w:proofErr w:type="gramStart"/>
+      <w:r>
+        <w:t>"::text::</w:t>
+      </w:r>
+      <w:proofErr w:type="gramEnd"/>
+      <w:r>
+        <w:t>"</w:t>
+      </w:r>
+      <w:proofErr w:type="spellStart"/>
+      <w:r>
+        <w:t>public"."role</w:t>
+      </w:r>
+      <w:proofErr w:type="spellEnd"/>
+      <w:r>
+        <w:t>"</w:t>
+      </w:r>
+      <w:proofErr w:type="gramStart"/>
+      <w:r>
+        <w:t>; )</w:t>
+      </w:r>
+      <w:proofErr w:type="gramEnd"/>
     </w:p>
     <w:p>
       <w:pPr>
@@ -1324,7 +2441,7 @@
         </w:numPr>
       </w:pPr>
       <w:r>
-        <w:t>Turning table type from string to enum (Must change sql manually)</w:t>
+        <w:t>If had default must drop first, then convert type, then set default again</w:t>
       </w:r>
     </w:p>
     <w:p>
@@ -1335,7 +2452,7 @@
         </w:numPr>
       </w:pPr>
       <w:r>
-        <w:t>must use sql USING keyword to convert types (ALTER TABLE "users" ALTER COLUMN "role" SET DATA TYPE "public"."role" USING "role"::text::"public"."role"; )</w:t>
+        <w:t>CURD template (functions)</w:t>
       </w:r>
     </w:p>
     <w:p>
@@ -1346,7 +2463,7 @@
         </w:numPr>
       </w:pPr>
       <w:r>
-        <w:t>If had default must drop first, then convert type, then set default again</w:t>
+        <w:t>CREATE</w:t>
       </w:r>
     </w:p>
     <w:p>
@@ -1357,7 +2474,7 @@
         </w:numPr>
       </w:pPr>
       <w:r>
-        <w:t>CURD template (functions)</w:t>
+        <w:t>READ all (basic usage)</w:t>
       </w:r>
     </w:p>
     <w:p>
@@ -1368,29 +2485,15 @@
         </w:numPr>
       </w:pPr>
       <w:r>
-        <w:t>CREATE</w:t>
-      </w:r>
-    </w:p>
-    <w:p>
-      <w:pPr>
-        <w:numPr>
-          <w:ilvl w:val="0"/>
-          <w:numId w:val="8"/>
-        </w:numPr>
-      </w:pPr>
-      <w:r>
-        <w:t>READ all (basic usage)</w:t>
-      </w:r>
-    </w:p>
-    <w:p>
-      <w:pPr>
-        <w:numPr>
-          <w:ilvl w:val="0"/>
-          <w:numId w:val="8"/>
-        </w:numPr>
-      </w:pPr>
-      <w:r>
-        <w:t>All unique fields must have READ function (readBy)</w:t>
+        <w:t>All unique fields must have READ function (</w:t>
+      </w:r>
+      <w:proofErr w:type="spellStart"/>
+      <w:r>
+        <w:t>readBy</w:t>
+      </w:r>
+      <w:proofErr w:type="spellEnd"/>
+      <w:r>
+        <w:t>)</w:t>
       </w:r>
     </w:p>
     <w:p>
@@ -1449,7 +2552,31 @@
         </w:numPr>
       </w:pPr>
       <w:r>
-        <w:t>Zod errorMap must defined in form with z.config (because it’s client-side and global (server-side layout.tsx) is not readable in client-side) (set in dedicated client-side file and import to form</w:t>
+        <w:t xml:space="preserve">Zod </w:t>
+      </w:r>
+      <w:proofErr w:type="spellStart"/>
+      <w:r>
+        <w:t>errorMap</w:t>
+      </w:r>
+      <w:proofErr w:type="spellEnd"/>
+      <w:r>
+        <w:t xml:space="preserve"> must defined in form with </w:t>
+      </w:r>
+      <w:proofErr w:type="spellStart"/>
+      <w:r>
+        <w:t>z.config</w:t>
+      </w:r>
+      <w:proofErr w:type="spellEnd"/>
+      <w:r>
+        <w:t xml:space="preserve"> (because it’s client-side and global (server-side </w:t>
+      </w:r>
+      <w:proofErr w:type="spellStart"/>
+      <w:r>
+        <w:t>layout.tsx</w:t>
+      </w:r>
+      <w:proofErr w:type="spellEnd"/>
+      <w:r>
+        <w:t>) is not readable in client-side) (set in dedicated client-side file and import to form</w:t>
       </w:r>
       <w:r>
         <w:t xml:space="preserve"> for </w:t>
@@ -1466,7 +2593,15 @@
         </w:numPr>
       </w:pPr>
       <w:r>
-        <w:t>Manage looking with label (with HTMLfor linked to input) with hidden input</w:t>
+        <w:t xml:space="preserve">Manage looking with label (with </w:t>
+      </w:r>
+      <w:proofErr w:type="spellStart"/>
+      <w:r>
+        <w:t>HTMLfor</w:t>
+      </w:r>
+      <w:proofErr w:type="spellEnd"/>
+      <w:r>
+        <w:t xml:space="preserve"> linked to input) with hidden input</w:t>
       </w:r>
     </w:p>
     <w:p>
@@ -1477,7 +2612,23 @@
         </w:numPr>
       </w:pPr>
       <w:r>
-        <w:t>Display file name with const file = watch(“inputName”) (get from useForm)</w:t>
+        <w:t>Display file name with const file = watch(“</w:t>
+      </w:r>
+      <w:proofErr w:type="spellStart"/>
+      <w:r>
+        <w:t>inputName</w:t>
+      </w:r>
+      <w:proofErr w:type="spellEnd"/>
+      <w:r>
+        <w:t xml:space="preserve">”) (get from </w:t>
+      </w:r>
+      <w:proofErr w:type="spellStart"/>
+      <w:r>
+        <w:t>useForm</w:t>
+      </w:r>
+      <w:proofErr w:type="spellEnd"/>
+      <w:r>
+        <w:t>)</w:t>
       </w:r>
     </w:p>
     <w:p>
@@ -1494,7 +2645,23 @@
       </w:pPr>
       <w:r>
         <w:lastRenderedPageBreak/>
-        <w:t>delete file input using resetFiled and clearErrors in clear button click handler</w:t>
+        <w:t xml:space="preserve">delete file input using </w:t>
+      </w:r>
+      <w:proofErr w:type="spellStart"/>
+      <w:r>
+        <w:t>resetFiled</w:t>
+      </w:r>
+      <w:proofErr w:type="spellEnd"/>
+      <w:r>
+        <w:t xml:space="preserve"> and </w:t>
+      </w:r>
+      <w:proofErr w:type="spellStart"/>
+      <w:r>
+        <w:t>clearErrors</w:t>
+      </w:r>
+      <w:proofErr w:type="spellEnd"/>
+      <w:r>
+        <w:t xml:space="preserve"> in clear button click handler</w:t>
       </w:r>
     </w:p>
     <w:p>
@@ -1505,10 +2672,31 @@
         </w:numPr>
       </w:pPr>
       <w:r>
-        <w:t xml:space="preserve">Display file preview with &lt;img </w:t>
-      </w:r>
-      <w:r>
-        <w:t>src={URL.createObjectURL(file)}</w:t>
+        <w:t>Display file preview with &lt;</w:t>
+      </w:r>
+      <w:proofErr w:type="spellStart"/>
+      <w:r>
+        <w:t>img</w:t>
+      </w:r>
+      <w:proofErr w:type="spellEnd"/>
+      <w:r>
+        <w:t xml:space="preserve"> </w:t>
+      </w:r>
+      <w:proofErr w:type="spellStart"/>
+      <w:r>
+        <w:t>src</w:t>
+      </w:r>
+      <w:proofErr w:type="spellEnd"/>
+      <w:r>
+        <w:t>={</w:t>
+      </w:r>
+      <w:proofErr w:type="spellStart"/>
+      <w:r>
+        <w:t>URL.createObjectURL</w:t>
+      </w:r>
+      <w:proofErr w:type="spellEnd"/>
+      <w:r>
+        <w:t>(file)}</w:t>
       </w:r>
       <w:r>
         <w:t xml:space="preserve"> /&gt;</w:t>
@@ -1537,7 +2725,15 @@
         <w:t>Create a single</w:t>
       </w:r>
       <w:r>
-        <w:t xml:space="preserve"> zod schema</w:t>
+        <w:t xml:space="preserve"> </w:t>
+      </w:r>
+      <w:proofErr w:type="spellStart"/>
+      <w:r>
+        <w:t>zod</w:t>
+      </w:r>
+      <w:proofErr w:type="spellEnd"/>
+      <w:r>
+        <w:t xml:space="preserve"> schema</w:t>
       </w:r>
       <w:r>
         <w:t xml:space="preserve"> </w:t>
@@ -1557,8 +2753,83 @@
         </w:numPr>
       </w:pPr>
       <w:r>
-        <w:t>(For multi mode operations (additional fields e.g. file), create custom zod schema) (For multi table (CURD in multiple tables operations e.g. users + orders) nest theyr schemas) create custom -&gt; use z.object({tableOne: drizzleZodSchema1, tableTwo: drizzleZodSchema2}) (register name converts to “nested_object_member.name" e.g. &lt;input {...form.register("db.title")} /&gt; )</w:t>
-      </w:r>
+        <w:t xml:space="preserve">(For </w:t>
+      </w:r>
+      <w:proofErr w:type="spellStart"/>
+      <w:r>
+        <w:t>multi mode</w:t>
+      </w:r>
+      <w:proofErr w:type="spellEnd"/>
+      <w:r>
+        <w:t xml:space="preserve"> operations (additional fields e.g. file), create custom </w:t>
+      </w:r>
+      <w:proofErr w:type="spellStart"/>
+      <w:r>
+        <w:t>zod</w:t>
+      </w:r>
+      <w:proofErr w:type="spellEnd"/>
+      <w:r>
+        <w:t xml:space="preserve"> schema) (For multi table (CURD in multiple tables operations e.g. users + orders) nest </w:t>
+      </w:r>
+      <w:proofErr w:type="spellStart"/>
+      <w:r>
+        <w:t>theyr</w:t>
+      </w:r>
+      <w:proofErr w:type="spellEnd"/>
+      <w:r>
+        <w:t xml:space="preserve"> schemas) create custom -&gt; use </w:t>
+      </w:r>
+      <w:proofErr w:type="spellStart"/>
+      <w:proofErr w:type="gramStart"/>
+      <w:r>
+        <w:t>z.object</w:t>
+      </w:r>
+      <w:proofErr w:type="spellEnd"/>
+      <w:proofErr w:type="gramEnd"/>
+      <w:r>
+        <w:t>({</w:t>
+      </w:r>
+      <w:proofErr w:type="spellStart"/>
+      <w:r>
+        <w:t>tableOne</w:t>
+      </w:r>
+      <w:proofErr w:type="spellEnd"/>
+      <w:r>
+        <w:t xml:space="preserve">: drizzleZodSchema1, </w:t>
+      </w:r>
+      <w:proofErr w:type="spellStart"/>
+      <w:r>
+        <w:t>tableTwo</w:t>
+      </w:r>
+      <w:proofErr w:type="spellEnd"/>
+      <w:r>
+        <w:t>: drizzleZodSchema2}) (register name converts to “nested_object_member.name" e.g. &lt;input {...</w:t>
+      </w:r>
+      <w:proofErr w:type="spellStart"/>
+      <w:proofErr w:type="gramStart"/>
+      <w:r>
+        <w:t>form.register</w:t>
+      </w:r>
+      <w:proofErr w:type="spellEnd"/>
+      <w:proofErr w:type="gramEnd"/>
+      <w:r>
+        <w:t>("</w:t>
+      </w:r>
+      <w:proofErr w:type="spellStart"/>
+      <w:proofErr w:type="gramStart"/>
+      <w:r>
+        <w:t>db.title</w:t>
+      </w:r>
+      <w:proofErr w:type="spellEnd"/>
+      <w:proofErr w:type="gramEnd"/>
+      <w:r>
+        <w:t>")} /</w:t>
+      </w:r>
+      <w:proofErr w:type="gramStart"/>
+      <w:r>
+        <w:t>&gt; )</w:t>
+      </w:r>
+      <w:proofErr w:type="gramEnd"/>
     </w:p>
     <w:p>
       <w:pPr>
@@ -1569,7 +2840,23 @@
         <w:spacing w:line="276" w:lineRule="auto"/>
       </w:pPr>
       <w:r>
-        <w:t>Use Extended zod DB schema with additional wanted values and for Append more-of-DB-schema values to useForm form</w:t>
+        <w:t xml:space="preserve">Use Extended </w:t>
+      </w:r>
+      <w:proofErr w:type="spellStart"/>
+      <w:r>
+        <w:t>zod</w:t>
+      </w:r>
+      <w:proofErr w:type="spellEnd"/>
+      <w:r>
+        <w:t xml:space="preserve"> DB schema with additional wanted values and for Append more-of-DB-schema values to </w:t>
+      </w:r>
+      <w:proofErr w:type="spellStart"/>
+      <w:r>
+        <w:t>useForm</w:t>
+      </w:r>
+      <w:proofErr w:type="spellEnd"/>
+      <w:r>
+        <w:t xml:space="preserve"> form</w:t>
       </w:r>
     </w:p>
     <w:p>
@@ -1594,8 +2881,13 @@
     <w:p/>
     <w:p>
       <w:r>
-        <w:t>Note next js</w:t>
-      </w:r>
+        <w:t xml:space="preserve">Note next </w:t>
+      </w:r>
+      <w:proofErr w:type="spellStart"/>
+      <w:r>
+        <w:t>js</w:t>
+      </w:r>
+      <w:proofErr w:type="spellEnd"/>
     </w:p>
     <w:p>
       <w:pPr>
@@ -1638,7 +2930,71 @@
         </w:numPr>
       </w:pPr>
       <w:r>
-        <w:t>Auto detect .env only works in next js bootstrap (run with npx next …..), for files outside next js bootstrap (run with tsx file_name) dotenv package is needed</w:t>
+        <w:t xml:space="preserve">Auto </w:t>
+      </w:r>
+      <w:proofErr w:type="gramStart"/>
+      <w:r>
+        <w:t>detect .env</w:t>
+      </w:r>
+      <w:proofErr w:type="gramEnd"/>
+      <w:r>
+        <w:t xml:space="preserve"> only works in next </w:t>
+      </w:r>
+      <w:proofErr w:type="spellStart"/>
+      <w:r>
+        <w:t>js</w:t>
+      </w:r>
+      <w:proofErr w:type="spellEnd"/>
+      <w:r>
+        <w:t xml:space="preserve"> bootstrap (run with </w:t>
+      </w:r>
+      <w:proofErr w:type="spellStart"/>
+      <w:r>
+        <w:t>npx</w:t>
+      </w:r>
+      <w:proofErr w:type="spellEnd"/>
+      <w:r>
+        <w:t xml:space="preserve"> next </w:t>
+      </w:r>
+      <w:proofErr w:type="gramStart"/>
+      <w:r>
+        <w:t>…..</w:t>
+      </w:r>
+      <w:proofErr w:type="gramEnd"/>
+      <w:r>
+        <w:t xml:space="preserve">), for files outside next </w:t>
+      </w:r>
+      <w:proofErr w:type="spellStart"/>
+      <w:r>
+        <w:t>js</w:t>
+      </w:r>
+      <w:proofErr w:type="spellEnd"/>
+      <w:r>
+        <w:t xml:space="preserve"> bootstrap (run with </w:t>
+      </w:r>
+      <w:proofErr w:type="spellStart"/>
+      <w:r>
+        <w:t>tsx</w:t>
+      </w:r>
+      <w:proofErr w:type="spellEnd"/>
+      <w:r>
+        <w:t xml:space="preserve"> </w:t>
+      </w:r>
+      <w:proofErr w:type="spellStart"/>
+      <w:r>
+        <w:t>file_name</w:t>
+      </w:r>
+      <w:proofErr w:type="spellEnd"/>
+      <w:r>
+        <w:t xml:space="preserve">) </w:t>
+      </w:r>
+      <w:proofErr w:type="spellStart"/>
+      <w:r>
+        <w:t>dotenv</w:t>
+      </w:r>
+      <w:proofErr w:type="spellEnd"/>
+      <w:r>
+        <w:t xml:space="preserve"> package is needed</w:t>
       </w:r>
     </w:p>
     <w:p>
@@ -1648,9 +3004,35 @@
           <w:numId w:val="9"/>
         </w:numPr>
       </w:pPr>
-      <w:r>
-        <w:t>Ssr data is readble throw same HTTPS connection for seo bots even with suspense loading placholder</w:t>
-      </w:r>
+      <w:proofErr w:type="spellStart"/>
+      <w:r>
+        <w:t>Ssr</w:t>
+      </w:r>
+      <w:proofErr w:type="spellEnd"/>
+      <w:r>
+        <w:t xml:space="preserve"> data is </w:t>
+      </w:r>
+      <w:proofErr w:type="spellStart"/>
+      <w:r>
+        <w:t>readble</w:t>
+      </w:r>
+      <w:proofErr w:type="spellEnd"/>
+      <w:r>
+        <w:t xml:space="preserve"> throw same HTTPS connection for </w:t>
+      </w:r>
+      <w:proofErr w:type="spellStart"/>
+      <w:r>
+        <w:t>seo</w:t>
+      </w:r>
+      <w:proofErr w:type="spellEnd"/>
+      <w:r>
+        <w:t xml:space="preserve"> bots even with suspense loading </w:t>
+      </w:r>
+      <w:proofErr w:type="spellStart"/>
+      <w:r>
+        <w:t>placholder</w:t>
+      </w:r>
+      <w:proofErr w:type="spellEnd"/>
     </w:p>
     <w:p>
       <w:pPr>
@@ -1660,8 +3042,13 @@
         </w:numPr>
       </w:pPr>
       <w:r>
-        <w:t>add article in next js</w:t>
-      </w:r>
+        <w:t xml:space="preserve">add article in next </w:t>
+      </w:r>
+      <w:proofErr w:type="spellStart"/>
+      <w:r>
+        <w:t>js</w:t>
+      </w:r>
+      <w:proofErr w:type="spellEnd"/>
     </w:p>
     <w:p>
       <w:r>
@@ -1692,7 +3079,15 @@
         </w:numPr>
       </w:pPr>
       <w:r>
-        <w:t>headers (cookie vs authorazation)</w:t>
+        <w:t xml:space="preserve">headers (cookie vs </w:t>
+      </w:r>
+      <w:proofErr w:type="spellStart"/>
+      <w:r>
+        <w:t>authorazation</w:t>
+      </w:r>
+      <w:proofErr w:type="spellEnd"/>
+      <w:r>
+        <w:t>)</w:t>
       </w:r>
     </w:p>
     <w:p>
@@ -1713,7 +3108,15 @@
     </w:p>
     <w:p>
       <w:r>
-        <w:t>- Manage user access with middlewares in protected pages to keep pages static</w:t>
+        <w:t xml:space="preserve">- Manage user access with </w:t>
+      </w:r>
+      <w:proofErr w:type="spellStart"/>
+      <w:r>
+        <w:t>middlewares</w:t>
+      </w:r>
+      <w:proofErr w:type="spellEnd"/>
+      <w:r>
+        <w:t xml:space="preserve"> in protected pages to keep pages static</w:t>
       </w:r>
     </w:p>
     <w:p>
@@ -1742,18 +3145,46 @@
       </w:r>
     </w:p>
     <w:p>
-      <w:r>
-        <w:t>init typecsript</w:t>
-      </w:r>
-    </w:p>
-    <w:p>
-      <w:r>
-        <w:t>install cors</w:t>
-      </w:r>
-    </w:p>
-    <w:p>
-      <w:r>
-        <w:t>init cors (for allow access from client)</w:t>
+      <w:proofErr w:type="spellStart"/>
+      <w:r>
+        <w:t>init</w:t>
+      </w:r>
+      <w:proofErr w:type="spellEnd"/>
+      <w:r>
+        <w:t xml:space="preserve"> </w:t>
+      </w:r>
+      <w:proofErr w:type="spellStart"/>
+      <w:r>
+        <w:t>typecsript</w:t>
+      </w:r>
+      <w:proofErr w:type="spellEnd"/>
+    </w:p>
+    <w:p>
+      <w:r>
+        <w:t xml:space="preserve">install </w:t>
+      </w:r>
+      <w:proofErr w:type="spellStart"/>
+      <w:r>
+        <w:t>cors</w:t>
+      </w:r>
+      <w:proofErr w:type="spellEnd"/>
+    </w:p>
+    <w:p>
+      <w:proofErr w:type="spellStart"/>
+      <w:r>
+        <w:t>init</w:t>
+      </w:r>
+      <w:proofErr w:type="spellEnd"/>
+      <w:r>
+        <w:t xml:space="preserve"> </w:t>
+      </w:r>
+      <w:proofErr w:type="spellStart"/>
+      <w:r>
+        <w:t>cors</w:t>
+      </w:r>
+      <w:proofErr w:type="spellEnd"/>
+      <w:r>
+        <w:t xml:space="preserve"> (for allow access from client)</w:t>
       </w:r>
     </w:p>
     <w:p>
@@ -1762,29 +3193,51 @@
       </w:r>
     </w:p>
     <w:p>
-      <w:r>
-        <w:t>init cookie parser</w:t>
-      </w:r>
-    </w:p>
-    <w:p>
-      <w:r>
-        <w:t>add esmod</w:t>
-      </w:r>
-    </w:p>
-    <w:p>
-      <w:r>
-        <w:t>type module package json</w:t>
-      </w:r>
-    </w:p>
-    <w:p>
+      <w:proofErr w:type="spellStart"/>
+      <w:r>
+        <w:t>init</w:t>
+      </w:r>
+      <w:proofErr w:type="spellEnd"/>
+      <w:r>
+        <w:t xml:space="preserve"> cookie parser</w:t>
+      </w:r>
+    </w:p>
+    <w:p>
+      <w:r>
+        <w:t xml:space="preserve">add </w:t>
+      </w:r>
+      <w:proofErr w:type="spellStart"/>
+      <w:r>
+        <w:t>esmod</w:t>
+      </w:r>
+      <w:proofErr w:type="spellEnd"/>
+    </w:p>
+    <w:p>
+      <w:r>
+        <w:t xml:space="preserve">type module package </w:t>
+      </w:r>
+      <w:proofErr w:type="spellStart"/>
+      <w:r>
+        <w:t>json</w:t>
+      </w:r>
+      <w:proofErr w:type="spellEnd"/>
+    </w:p>
+    <w:p>
+      <w:proofErr w:type="spellStart"/>
       <w:r>
         <w:t>allowImportingTsExtensions</w:t>
       </w:r>
-    </w:p>
-    <w:p>
-      <w:r>
-        <w:t>install nodemon</w:t>
-      </w:r>
+      <w:proofErr w:type="spellEnd"/>
+    </w:p>
+    <w:p>
+      <w:r>
+        <w:t xml:space="preserve">install </w:t>
+      </w:r>
+      <w:proofErr w:type="spellStart"/>
+      <w:r>
+        <w:t>nodemon</w:t>
+      </w:r>
+      <w:proofErr w:type="spellEnd"/>
     </w:p>
     <w:p>
       <w:r>

</xml_diff>

<commit_message>
trying haard to fix RHF file upload system :)
</commit_message>
<xml_diff>
--- a/notes.docx
+++ b/notes.docx
@@ -8,45 +8,107 @@
       </w:r>
     </w:p>
     <w:p>
+      <w:pPr>
+        <w:rPr>
+          <w:lang w:bidi="prs-AF"/>
+        </w:rPr>
+      </w:pPr>
       <w:r>
         <w:t>-</w:t>
       </w:r>
     </w:p>
     <w:p>
-      <w:pPr>
-        <w:rPr>
-          <w:rtl/>
-        </w:rPr>
-      </w:pPr>
-      <w:r>
-        <w:t>RHF basic</w:t>
-      </w:r>
-    </w:p>
-    <w:p>
-      <w:pPr>
-        <w:numPr>
-          <w:ilvl w:val="0"/>
-          <w:numId w:val="14"/>
-        </w:numPr>
-      </w:pPr>
-      <w:r>
-        <w:t>Add Default</w:t>
-      </w:r>
-      <w:r>
-        <w:t xml:space="preserve"> value</w:t>
-      </w:r>
-    </w:p>
-    <w:p>
-      <w:pPr>
+      <w:r>
+        <w:t>RHF</w:t>
+      </w:r>
+    </w:p>
+    <w:p>
+      <w:pPr>
+        <w:pStyle w:val="ListParagraph"/>
+        <w:numPr>
+          <w:ilvl w:val="0"/>
+          <w:numId w:val="1"/>
+        </w:numPr>
+      </w:pPr>
+      <w:r>
+        <w:t>Find file</w:t>
+      </w:r>
+    </w:p>
+    <w:p>
+      <w:pPr>
+        <w:pStyle w:val="ListParagraph"/>
         <w:numPr>
           <w:ilvl w:val="1"/>
-          <w:numId w:val="14"/>
-        </w:numPr>
-      </w:pPr>
-      <w:r>
-        <w:t>default value for file</w:t>
-      </w:r>
-    </w:p>
+          <w:numId w:val="1"/>
+        </w:numPr>
+      </w:pPr>
+      <w:r>
+        <w:t>Prevent re-upload existing files (with two states: 1. Existing file state (URL to show) 2. New files (files)</w:t>
+      </w:r>
+      <w:r>
+        <w:t xml:space="preserve"> logic</w:t>
+      </w:r>
+      <w:r>
+        <w:t>)</w:t>
+      </w:r>
+    </w:p>
+    <w:p>
+      <w:pPr>
+        <w:pStyle w:val="ListParagraph"/>
+        <w:numPr>
+          <w:ilvl w:val="1"/>
+          <w:numId w:val="1"/>
+        </w:numPr>
+      </w:pPr>
+      <w:r>
+        <w:t>Prevent upload duplicated</w:t>
+      </w:r>
+      <w:r>
+        <w:t xml:space="preserve"> (not checking name)</w:t>
+      </w:r>
+    </w:p>
+    <w:p>
+      <w:pPr>
+        <w:pStyle w:val="ListParagraph"/>
+        <w:numPr>
+          <w:ilvl w:val="1"/>
+          <w:numId w:val="1"/>
+        </w:numPr>
+      </w:pPr>
+      <w:r>
+        <w:t>Remove client removed</w:t>
+      </w:r>
+      <w:r>
+        <w:t xml:space="preserve"> (with deleted)</w:t>
+      </w:r>
+    </w:p>
+    <w:p>
+      <w:pPr>
+        <w:pStyle w:val="ListParagraph"/>
+        <w:numPr>
+          <w:ilvl w:val="0"/>
+          <w:numId w:val="1"/>
+        </w:numPr>
+      </w:pPr>
+      <w:r>
+        <w:t>Preview based on file type</w:t>
+      </w:r>
+    </w:p>
+    <w:p>
+      <w:pPr>
+        <w:numPr>
+          <w:ilvl w:val="0"/>
+          <w:numId w:val="1"/>
+        </w:numPr>
+      </w:pPr>
+      <w:r>
+        <w:t>Upload media file in form</w:t>
+      </w:r>
+      <w:r>
+        <w:t xml:space="preserve"> (test) (with ui) *Axios*</w:t>
+      </w:r>
+    </w:p>
+    <w:p/>
     <w:p>
       <w:pPr>
         <w:pStyle w:val="ListParagraph"/>
@@ -247,101 +309,19 @@
     </w:p>
     <w:p>
       <w:pPr>
-        <w:numPr>
-          <w:ilvl w:val="0"/>
-          <w:numId w:val="1"/>
-        </w:numPr>
-      </w:pPr>
-      <w:r>
-        <w:t>write</w:t>
-      </w:r>
-      <w:r>
-        <w:t xml:space="preserve"> </w:t>
-      </w:r>
-      <w:proofErr w:type="spellStart"/>
-      <w:r>
-        <w:t>onSubmit</w:t>
-      </w:r>
-      <w:proofErr w:type="spellEnd"/>
-    </w:p>
-    <w:p>
-      <w:pPr>
-        <w:numPr>
-          <w:ilvl w:val="1"/>
-          <w:numId w:val="1"/>
-        </w:numPr>
-      </w:pPr>
-      <w:r>
-        <w:t xml:space="preserve">Send to </w:t>
-      </w:r>
-      <w:proofErr w:type="spellStart"/>
-      <w:r>
-        <w:t>api</w:t>
-      </w:r>
-      <w:proofErr w:type="spellEnd"/>
-      <w:r>
-        <w:t xml:space="preserve"> (with file / without file (direct values) difference)</w:t>
-      </w:r>
-    </w:p>
-    <w:p>
-      <w:pPr>
-        <w:numPr>
-          <w:ilvl w:val="1"/>
-          <w:numId w:val="1"/>
-        </w:numPr>
-      </w:pPr>
-      <w:r>
-        <w:t xml:space="preserve">add </w:t>
-      </w:r>
-      <w:proofErr w:type="spellStart"/>
-      <w:r>
-        <w:t>db</w:t>
-      </w:r>
-      <w:proofErr w:type="spellEnd"/>
-      <w:r>
-        <w:t xml:space="preserve"> queries errors in </w:t>
-      </w:r>
-      <w:proofErr w:type="spellStart"/>
-      <w:r>
-        <w:t>onSubmit</w:t>
-      </w:r>
-      <w:proofErr w:type="spellEnd"/>
-      <w:r>
-        <w:t xml:space="preserve"> to RFH (on field) e.g. for add records with</w:t>
-      </w:r>
-      <w:r>
-        <w:t xml:space="preserve"> </w:t>
-      </w:r>
-      <w:r>
-        <w:t>same unique field</w:t>
-      </w:r>
-    </w:p>
-    <w:p>
-      <w:pPr>
-        <w:numPr>
-          <w:ilvl w:val="0"/>
-          <w:numId w:val="1"/>
-        </w:numPr>
-      </w:pPr>
-      <w:r>
-        <w:t>Upload media file in form</w:t>
-      </w:r>
-      <w:r>
-        <w:t xml:space="preserve"> </w:t>
-      </w:r>
-      <w:r>
-        <w:t xml:space="preserve">(test) </w:t>
-      </w:r>
-      <w:r>
-        <w:t xml:space="preserve">(with </w:t>
-      </w:r>
-      <w:proofErr w:type="spellStart"/>
-      <w:r>
-        <w:t>ui</w:t>
-      </w:r>
-      <w:proofErr w:type="spellEnd"/>
-      <w:r>
-        <w:t>) *Axios*</w:t>
+        <w:pStyle w:val="ListParagraph"/>
+      </w:pPr>
+    </w:p>
+    <w:p>
+      <w:pPr>
+        <w:pStyle w:val="ListParagraph"/>
+        <w:numPr>
+          <w:ilvl w:val="0"/>
+          <w:numId w:val="17"/>
+        </w:numPr>
+      </w:pPr>
+      <w:r>
+        <w:t>Fine tune Zod validation</w:t>
       </w:r>
     </w:p>
     <w:p/>
@@ -368,18 +348,10 @@
         </w:numPr>
       </w:pPr>
       <w:r>
-        <w:t xml:space="preserve">Add making form with </w:t>
-      </w:r>
-      <w:proofErr w:type="spellStart"/>
-      <w:r>
-        <w:t>useForm</w:t>
-      </w:r>
-      <w:proofErr w:type="spellEnd"/>
-      <w:r>
-        <w:t xml:space="preserve"> </w:t>
-      </w:r>
-      <w:r>
-        <w:t>form</w:t>
+        <w:t xml:space="preserve">Add </w:t>
+      </w:r>
+      <w:r>
+        <w:t>RHF file</w:t>
       </w:r>
       <w:r>
         <w:t xml:space="preserve"> template</w:t>
@@ -387,713 +359,443 @@
     </w:p>
     <w:p/>
     <w:p/>
+    <w:p>
+      <w:r>
+        <w:t>endpoint template</w:t>
+      </w:r>
+    </w:p>
+    <w:p>
+      <w:pPr>
+        <w:ind w:firstLine="720"/>
+      </w:pPr>
+      <w:r>
+        <w:t>upgrade endpoint template with new controller</w:t>
+      </w:r>
+    </w:p>
+    <w:p>
+      <w:r>
+        <w:lastRenderedPageBreak/>
+        <w:t xml:space="preserve">Create </w:t>
+      </w:r>
+      <w:r>
+        <w:t>Z</w:t>
+      </w:r>
+      <w:r>
+        <w:t>od schema file template</w:t>
+      </w:r>
+    </w:p>
+    <w:p/>
+    <w:p>
+      <w:r>
+        <w:t xml:space="preserve">create </w:t>
+      </w:r>
+      <w:r>
+        <w:t xml:space="preserve">DB </w:t>
+      </w:r>
+      <w:r>
+        <w:t>CRUD drizzle file template</w:t>
+      </w:r>
+    </w:p>
+    <w:p/>
+    <w:p>
+      <w:r>
+        <w:t>DB</w:t>
+      </w:r>
+      <w:r>
+        <w:t xml:space="preserve"> schema file (add essential tables e.g. </w:t>
+      </w:r>
+      <w:r>
+        <w:t>users, articles, …</w:t>
+      </w:r>
+      <w:r>
+        <w:t xml:space="preserve">) </w:t>
+      </w:r>
+      <w:r>
+        <w:t>(</w:t>
+      </w:r>
+      <w:r>
+        <w:t>use U</w:t>
+      </w:r>
+      <w:r>
+        <w:t>id</w:t>
+      </w:r>
+      <w:r>
+        <w:t>)</w:t>
+      </w:r>
+    </w:p>
+    <w:p/>
+    <w:p>
+      <w:r>
+        <w:t>Test cache function with (</w:t>
+      </w:r>
+      <w:proofErr w:type="gramStart"/>
+      <w:r>
+        <w:t>()=&gt;{ “</w:t>
+      </w:r>
+      <w:proofErr w:type="gramEnd"/>
+      <w:r>
+        <w:t>use cache</w:t>
+      </w:r>
+      <w:proofErr w:type="gramStart"/>
+      <w:r>
+        <w:t>” })() ??</w:t>
+      </w:r>
+      <w:proofErr w:type="gramEnd"/>
+    </w:p>
+    <w:p/>
+    <w:p>
+      <w:r>
+        <w:t>Next auth file template</w:t>
+      </w:r>
+    </w:p>
+    <w:p/>
+    <w:p>
+      <w:r>
+        <w:t>Zustland</w:t>
+      </w:r>
+      <w:r>
+        <w:t xml:space="preserve"> </w:t>
+      </w:r>
+      <w:r>
+        <w:t xml:space="preserve">(file template </w:t>
+      </w:r>
+      <w:r>
+        <w:t>&amp;</w:t>
+      </w:r>
+      <w:r>
+        <w:t xml:space="preserve"> live template)</w:t>
+      </w:r>
+    </w:p>
+    <w:p/>
+    <w:p>
+      <w:r>
+        <w:t>Class Dark mode in tailwind</w:t>
+      </w:r>
+    </w:p>
+    <w:p/>
+    <w:p>
+      <w:r>
+        <w:t>Zarinpal API</w:t>
+      </w:r>
+    </w:p>
+    <w:p>
+      <w:r>
+        <w:t>Motion</w:t>
+      </w:r>
+    </w:p>
+    <w:p>
+      <w:r>
+        <w:t>Create dragble div</w:t>
+      </w:r>
+    </w:p>
+    <w:p>
+      <w:r>
+        <w:t>??? Use memo (create use callback with use memo)</w:t>
+      </w:r>
+    </w:p>
+    <w:p>
+      <w:r>
+        <w:t>Load on scroll</w:t>
+      </w:r>
+    </w:p>
+    <w:p>
+      <w:r>
+        <w:t>GenerateStaticParams tips</w:t>
+      </w:r>
+    </w:p>
+    <w:p>
+      <w:r>
+        <w:t>??? How to revalidate generateStaticParams cached pages</w:t>
+      </w:r>
+    </w:p>
+    <w:p>
+      <w:pPr>
+        <w:numPr>
+          <w:ilvl w:val="0"/>
+          <w:numId w:val="5"/>
+        </w:numPr>
+      </w:pPr>
+      <w:proofErr w:type="gramStart"/>
+      <w:r>
+        <w:t>Return ??</w:t>
+      </w:r>
+      <w:proofErr w:type="gramEnd"/>
+      <w:r>
+        <w:t xml:space="preserve"> [] in generateStaticParams after data fetch for when fetch data is undefined</w:t>
+      </w:r>
+    </w:p>
+    <w:p>
+      <w:pPr>
+        <w:numPr>
+          <w:ilvl w:val="0"/>
+          <w:numId w:val="5"/>
+        </w:numPr>
+      </w:pPr>
+      <w:r>
+        <w:t>Can’t use dynamic component in cached pages (with generateStaticParams) without cache components unless get error</w:t>
+      </w:r>
+    </w:p>
+    <w:p>
+      <w:r>
+        <w:t>Add generateStaticParams to route file template</w:t>
+      </w:r>
+    </w:p>
+    <w:p>
+      <w:r>
+        <w:t>Next pwa template (offline service worker)</w:t>
+      </w:r>
+    </w:p>
+    <w:p>
+      <w:r>
+        <w:lastRenderedPageBreak/>
+        <w:t>PWA service workers (with offline support) - (with push notifications)</w:t>
+      </w:r>
+    </w:p>
     <w:p/>
     <w:p/>
     <w:p>
       <w:r>
-        <w:t xml:space="preserve">Create </w:t>
-      </w:r>
-      <w:proofErr w:type="spellStart"/>
-      <w:r>
-        <w:t>zod</w:t>
-      </w:r>
-      <w:proofErr w:type="spellEnd"/>
-      <w:r>
-        <w:t xml:space="preserve"> schema file template</w:t>
+        <w:t>-------- through</w:t>
+      </w:r>
+    </w:p>
+    <w:p>
+      <w:r>
+        <w:t>React query (live templates)</w:t>
       </w:r>
     </w:p>
     <w:p>
       <w:pPr>
         <w:rPr>
-          <w:rtl/>
-        </w:rPr>
-      </w:pPr>
-      <w:r>
-        <w:lastRenderedPageBreak/>
-        <w:t xml:space="preserve">create </w:t>
-      </w:r>
-      <w:r>
-        <w:t xml:space="preserve">DB </w:t>
-      </w:r>
-      <w:r>
-        <w:t>CRUD drizzle file template</w:t>
-      </w:r>
-    </w:p>
-    <w:p>
-      <w:r>
-        <w:t>create DB CRUD live templates</w:t>
-      </w:r>
-    </w:p>
-    <w:p>
-      <w:r>
-        <w:t>Read media file (</w:t>
-      </w:r>
-      <w:r>
-        <w:t>from file manager</w:t>
-      </w:r>
-      <w:r>
-        <w:t>) (test)</w:t>
-      </w:r>
-    </w:p>
-    <w:p>
-      <w:r>
-        <w:t>create creating DB template (</w:t>
-      </w:r>
-      <w:proofErr w:type="spellStart"/>
-      <w:r>
-        <w:t>Uuid</w:t>
-      </w:r>
-      <w:proofErr w:type="spellEnd"/>
-      <w:r>
-        <w:t xml:space="preserve"> for </w:t>
-      </w:r>
-      <w:proofErr w:type="spellStart"/>
-      <w:r>
-        <w:t>pg</w:t>
-      </w:r>
-      <w:proofErr w:type="spellEnd"/>
-      <w:r>
-        <w:t xml:space="preserve"> table</w:t>
-      </w:r>
-      <w:r>
-        <w:t>)</w:t>
-      </w:r>
-    </w:p>
-    <w:p>
-      <w:r>
-        <w:t>Next auth file template</w:t>
-      </w:r>
-    </w:p>
-    <w:p>
-      <w:r>
-        <w:t xml:space="preserve">??? CRUD Endpoint logic (DB </w:t>
-      </w:r>
-      <w:proofErr w:type="spellStart"/>
-      <w:r>
-        <w:t>getBys</w:t>
-      </w:r>
-      <w:proofErr w:type="spellEnd"/>
-      <w:r>
-        <w:t xml:space="preserve"> function)</w:t>
-      </w:r>
-    </w:p>
-    <w:p>
-      <w:r>
-        <w:t>upgrade endpoint template with new controller</w:t>
-      </w:r>
-    </w:p>
-    <w:p>
-      <w:r>
-        <w:t>DAL template (auth</w:t>
-      </w:r>
-      <w:r>
-        <w:t>, validation</w:t>
-      </w:r>
-      <w:r>
-        <w:t xml:space="preserve"> and cache manager layer)</w:t>
-      </w:r>
-    </w:p>
-    <w:p>
-      <w:r>
-        <w:t xml:space="preserve">?? Use DAL in client - or </w:t>
-      </w:r>
-      <w:r>
-        <w:t>–</w:t>
-      </w:r>
-      <w:r>
-        <w:t xml:space="preserve"> API</w:t>
-      </w:r>
-    </w:p>
-    <w:p>
-      <w:r>
-        <w:t>Class Dark mode in tailwind</w:t>
-      </w:r>
-    </w:p>
-    <w:p>
-      <w:proofErr w:type="spellStart"/>
-      <w:proofErr w:type="gramStart"/>
-      <w:r>
-        <w:t>Zustland</w:t>
-      </w:r>
-      <w:proofErr w:type="spellEnd"/>
-      <w:r>
-        <w:t>(</w:t>
-      </w:r>
-      <w:proofErr w:type="gramEnd"/>
-      <w:r>
-        <w:t xml:space="preserve">file </w:t>
-      </w:r>
-      <w:proofErr w:type="gramStart"/>
-      <w:r>
-        <w:t>template ??</w:t>
-      </w:r>
-      <w:proofErr w:type="gramEnd"/>
-      <w:r>
-        <w:t xml:space="preserve"> And live template)</w:t>
-      </w:r>
-    </w:p>
-    <w:p>
-      <w:proofErr w:type="spellStart"/>
-      <w:r>
-        <w:t>Zarinpal</w:t>
-      </w:r>
-      <w:proofErr w:type="spellEnd"/>
-      <w:r>
-        <w:t xml:space="preserve"> API</w:t>
-      </w:r>
-    </w:p>
-    <w:p>
-      <w:r>
-        <w:t>Motion</w:t>
-      </w:r>
-    </w:p>
-    <w:p>
-      <w:r>
-        <w:t xml:space="preserve">Create </w:t>
-      </w:r>
-      <w:proofErr w:type="spellStart"/>
-      <w:r>
-        <w:t>dragble</w:t>
-      </w:r>
-      <w:proofErr w:type="spellEnd"/>
-      <w:r>
-        <w:t xml:space="preserve"> div</w:t>
-      </w:r>
-    </w:p>
-    <w:p>
-      <w:r>
-        <w:t>??? Use memo (create use callback with use memo)</w:t>
-      </w:r>
-    </w:p>
-    <w:p>
-      <w:r>
-        <w:t>Load on scroll</w:t>
-      </w:r>
-    </w:p>
-    <w:p>
-      <w:proofErr w:type="spellStart"/>
-      <w:r>
-        <w:t>GenerateStaticParams</w:t>
-      </w:r>
-      <w:proofErr w:type="spellEnd"/>
-      <w:r>
-        <w:t xml:space="preserve"> tips</w:t>
-      </w:r>
-    </w:p>
-    <w:p>
-      <w:r>
-        <w:t xml:space="preserve">??? How to revalidate </w:t>
-      </w:r>
-      <w:proofErr w:type="spellStart"/>
-      <w:r>
-        <w:t>generateStaticParams</w:t>
-      </w:r>
-      <w:proofErr w:type="spellEnd"/>
-      <w:r>
-        <w:t xml:space="preserve"> cached pages</w:t>
-      </w:r>
-    </w:p>
-    <w:p>
-      <w:pPr>
-        <w:numPr>
-          <w:ilvl w:val="0"/>
-          <w:numId w:val="5"/>
-        </w:numPr>
-      </w:pPr>
-      <w:proofErr w:type="gramStart"/>
-      <w:r>
-        <w:t>Return ??</w:t>
-      </w:r>
-      <w:proofErr w:type="gramEnd"/>
-      <w:r>
-        <w:t xml:space="preserve"> [] in </w:t>
-      </w:r>
-      <w:proofErr w:type="spellStart"/>
-      <w:r>
-        <w:t>generateStaticParams</w:t>
-      </w:r>
-      <w:proofErr w:type="spellEnd"/>
-      <w:r>
-        <w:t xml:space="preserve"> after data fetch for when fetch data is undefined</w:t>
-      </w:r>
-    </w:p>
-    <w:p>
-      <w:pPr>
-        <w:numPr>
-          <w:ilvl w:val="0"/>
-          <w:numId w:val="5"/>
-        </w:numPr>
-      </w:pPr>
-      <w:r>
-        <w:t xml:space="preserve">Can’t use dynamic component in cached pages (with </w:t>
-      </w:r>
-      <w:proofErr w:type="spellStart"/>
-      <w:r>
-        <w:t>generateStaticParams</w:t>
-      </w:r>
-      <w:proofErr w:type="spellEnd"/>
-      <w:r>
-        <w:t>) without cache components unless get error</w:t>
-      </w:r>
-    </w:p>
-    <w:p>
-      <w:r>
-        <w:t xml:space="preserve">Add </w:t>
-      </w:r>
-      <w:proofErr w:type="spellStart"/>
-      <w:r>
-        <w:t>generateStaticParams</w:t>
-      </w:r>
-      <w:proofErr w:type="spellEnd"/>
-      <w:r>
-        <w:t xml:space="preserve"> to route file template</w:t>
-      </w:r>
-    </w:p>
-    <w:p>
-      <w:r>
-        <w:t xml:space="preserve">Next </w:t>
-      </w:r>
-      <w:proofErr w:type="spellStart"/>
-      <w:r>
-        <w:t>pwa</w:t>
-      </w:r>
-      <w:proofErr w:type="spellEnd"/>
-      <w:r>
-        <w:t xml:space="preserve"> template (offline service worker)</w:t>
-      </w:r>
-    </w:p>
-    <w:p>
-      <w:r>
-        <w:t>PWA service workers (with offline support) - (with push notifications)</w:t>
-      </w:r>
-    </w:p>
-    <w:p>
-      <w:r>
-        <w:t>-------- through</w:t>
-      </w:r>
-    </w:p>
-    <w:p>
-      <w:r>
-        <w:t>React query (live templates)</w:t>
-      </w:r>
-    </w:p>
-    <w:p>
-      <w:pPr>
-        <w:rPr>
-          <w:rFonts w:hint="cs"/>
           <w:rtl/>
           <w:lang w:bidi="prs-AF"/>
         </w:rPr>
       </w:pPr>
       <w:r>
+        <w:t>Video playe</w:t>
+      </w:r>
+      <w:r>
+        <w:t>r</w:t>
+      </w:r>
+    </w:p>
+    <w:p>
+      <w:r>
+        <w:t>Sending email</w:t>
+      </w:r>
+    </w:p>
+    <w:p>
+      <w:r>
+        <w:t>show ui guide on first load</w:t>
+      </w:r>
+    </w:p>
+    <w:p>
+      <w:r>
+        <w:t>websocket</w:t>
+      </w:r>
+    </w:p>
+    <w:p>
+      <w:r>
+        <w:t>Create chat system</w:t>
+      </w:r>
+    </w:p>
+    <w:p>
+      <w:r>
+        <w:t>Ai integration</w:t>
+      </w:r>
+    </w:p>
+    <w:p>
+      <w:r>
+        <w:t>Js note</w:t>
+      </w:r>
+    </w:p>
+    <w:p>
+      <w:r>
+        <w:t>Use (</w:t>
+      </w:r>
+      <w:proofErr w:type="gramStart"/>
+      <w:r>
+        <w:t>()=&gt;{ /</w:t>
+      </w:r>
+      <w:proofErr w:type="gramEnd"/>
+      <w:r>
+        <w:t xml:space="preserve">/ function </w:t>
+      </w:r>
+      <w:proofErr w:type="gramStart"/>
+      <w:r>
+        <w:t>statements })(</w:t>
+      </w:r>
+      <w:proofErr w:type="gramEnd"/>
+      <w:r>
+        <w:t>) for run function when creating function</w:t>
+      </w:r>
+    </w:p>
+    <w:p>
+      <w:r>
+        <w:t>use || for return a value when a variable is null (what is the difference between ?? and |</w:t>
+      </w:r>
+      <w:proofErr w:type="gramStart"/>
+      <w:r>
+        <w:t>| )</w:t>
+      </w:r>
+      <w:proofErr w:type="gramEnd"/>
+    </w:p>
+    <w:p>
+      <w:r>
+        <w:t xml:space="preserve">??? Why </w:t>
+      </w:r>
+      <w:proofErr w:type="gramStart"/>
+      <w:r>
+        <w:t>e.target</w:t>
+      </w:r>
+      <w:proofErr w:type="gramEnd"/>
+      <w:r>
+        <w:t xml:space="preserve">.files?.[0] and </w:t>
+      </w:r>
+      <w:proofErr w:type="gramStart"/>
+      <w:r>
+        <w:t>e.target</w:t>
+      </w:r>
+      <w:proofErr w:type="gramEnd"/>
+      <w:r>
+        <w:t>.files![0] are different sytaxes (same for objects e.g. controller.</w:t>
+      </w:r>
+      <w:proofErr w:type="gramStart"/>
+      <w:r>
+        <w:t>data![</w:t>
+      </w:r>
+      <w:proofErr w:type="gramEnd"/>
+      <w:r>
+        <w:t>”user”] / controller.data</w:t>
+      </w:r>
+      <w:proofErr w:type="gramStart"/>
+      <w:r>
+        <w:t>?.[</w:t>
+      </w:r>
+      <w:proofErr w:type="gramEnd"/>
+      <w:r>
+        <w:t>”user”])</w:t>
+      </w:r>
+    </w:p>
+    <w:p>
+      <w:r>
+        <w:t>Use [”key”] for convert string to object key</w:t>
+      </w:r>
+    </w:p>
+    <w:p>
+      <w:r>
+        <w:t xml:space="preserve">!! converts value to boolean *true if it </w:t>
+      </w:r>
+      <w:proofErr w:type="gramStart"/>
+      <w:r>
+        <w:t>exist</w:t>
+      </w:r>
+      <w:proofErr w:type="gramEnd"/>
+      <w:r>
+        <w:t xml:space="preserve"> and false if it's not*</w:t>
+      </w:r>
+    </w:p>
+    <w:p>
+      <w:r>
+        <w:t xml:space="preserve">difference </w:t>
+      </w:r>
+      <w:proofErr w:type="gramStart"/>
+      <w:r>
+        <w:t>bewteen .toString</w:t>
+      </w:r>
+      <w:proofErr w:type="gramEnd"/>
+      <w:r>
+        <w:t>() and String(value)</w:t>
+      </w:r>
+    </w:p>
+    <w:p>
+      <w:r>
+        <w:t xml:space="preserve">??? </w:t>
+      </w:r>
+      <w:proofErr w:type="gramStart"/>
+      <w:r>
+        <w:t>use .toFixed</w:t>
+      </w:r>
+      <w:proofErr w:type="gramEnd"/>
+      <w:r>
+        <w:t>(0) of Number class to remove decimals</w:t>
+      </w:r>
+    </w:p>
+    <w:p>
+      <w:r>
+        <w:t>What Object.bind does</w:t>
+      </w:r>
+    </w:p>
+    <w:p>
+      <w:r>
+        <w:t xml:space="preserve">replace const object with another object using </w:t>
+      </w:r>
+      <w:proofErr w:type="gramStart"/>
+      <w:r>
+        <w:t>object.assign</w:t>
+      </w:r>
+      <w:proofErr w:type="gramEnd"/>
+    </w:p>
+    <w:p>
+      <w:proofErr w:type="gramStart"/>
+      <w:r>
+        <w:t>Adding !</w:t>
+      </w:r>
+      <w:proofErr w:type="gramEnd"/>
+      <w:r>
+        <w:t xml:space="preserve"> in front of possibely undefine value will throw error if value is undefiend, caused remove ts error (add when you sure it’s not null)</w:t>
+      </w:r>
+    </w:p>
+    <w:p>
+      <w:r>
+        <w:t>For deleting field in object, distructur object with key names that wanted to be deleted and ...rest, and use rest object as deleted object</w:t>
+      </w:r>
+    </w:p>
+    <w:p>
+      <w:r>
+        <w:t xml:space="preserve">Create uuid with </w:t>
+      </w:r>
+      <w:proofErr w:type="gramStart"/>
+      <w:r>
+        <w:t>crypto.randomUUID</w:t>
+      </w:r>
+      <w:proofErr w:type="gramEnd"/>
+      <w:r>
+        <w:t>() method</w:t>
+      </w:r>
+    </w:p>
+    <w:p>
+      <w:r>
         <w:lastRenderedPageBreak/>
-        <w:t>Video playe</w:t>
-      </w:r>
-      <w:r>
-        <w:t>r</w:t>
-      </w:r>
-    </w:p>
-    <w:p>
-      <w:r>
-        <w:t>Sending email</w:t>
-      </w:r>
-    </w:p>
-    <w:p>
-      <w:r>
-        <w:t xml:space="preserve">show </w:t>
-      </w:r>
-      <w:proofErr w:type="spellStart"/>
-      <w:r>
-        <w:t>ui</w:t>
-      </w:r>
-      <w:proofErr w:type="spellEnd"/>
-      <w:r>
-        <w:t xml:space="preserve"> guide on first load</w:t>
-      </w:r>
-    </w:p>
-    <w:p>
-      <w:proofErr w:type="spellStart"/>
-      <w:r>
-        <w:t>websocket</w:t>
-      </w:r>
-      <w:proofErr w:type="spellEnd"/>
-    </w:p>
-    <w:p>
-      <w:r>
-        <w:t>Create chat system</w:t>
-      </w:r>
-    </w:p>
-    <w:p>
-      <w:r>
-        <w:t>Ai integration</w:t>
-      </w:r>
-    </w:p>
-    <w:p>
-      <w:proofErr w:type="spellStart"/>
-      <w:r>
-        <w:t>Js</w:t>
-      </w:r>
-      <w:proofErr w:type="spellEnd"/>
-      <w:r>
-        <w:t xml:space="preserve"> note</w:t>
-      </w:r>
-    </w:p>
-    <w:p>
-      <w:r>
-        <w:t>Use (</w:t>
+        <w:t>Distructure nested values with nested disctructure e.g. const {register, handleSubmit, formState: {errors}} = useForm *access nested “errors” object in formState object from useForm*</w:t>
+      </w:r>
+    </w:p>
+    <w:p>
+      <w:r>
+        <w:t xml:space="preserve">??? </w:t>
       </w:r>
       <w:proofErr w:type="gramStart"/>
       <w:r>
-        <w:t>()=&gt;{ /</w:t>
+        <w:t>.bind</w:t>
       </w:r>
       <w:proofErr w:type="gramEnd"/>
       <w:r>
-        <w:t xml:space="preserve">/ function </w:t>
+        <w:t>() for passing id to server action</w:t>
+      </w:r>
+    </w:p>
+    <w:p>
+      <w:r>
+        <w:t xml:space="preserve">??? use </w:t>
       </w:r>
       <w:proofErr w:type="gramStart"/>
       <w:r>
-        <w:t>statements })(</w:t>
+        <w:t>entries(</w:t>
       </w:r>
       <w:proofErr w:type="gramEnd"/>
       <w:r>
-        <w:t>) for run function when creating function</w:t>
-      </w:r>
-    </w:p>
-    <w:p>
-      <w:r>
-        <w:t>use || for return a value when a variable is null (what is the difference between ?? and |</w:t>
-      </w:r>
-      <w:proofErr w:type="gramStart"/>
-      <w:r>
-        <w:t>| )</w:t>
-      </w:r>
-      <w:proofErr w:type="gramEnd"/>
-    </w:p>
-    <w:p>
-      <w:r>
-        <w:t xml:space="preserve">??? Why </w:t>
-      </w:r>
-      <w:proofErr w:type="spellStart"/>
-      <w:proofErr w:type="gramStart"/>
-      <w:r>
-        <w:t>e.target</w:t>
-      </w:r>
-      <w:proofErr w:type="gramEnd"/>
-      <w:r>
-        <w:t>.files</w:t>
-      </w:r>
-      <w:proofErr w:type="spellEnd"/>
-      <w:r>
-        <w:t xml:space="preserve">?.[0] and </w:t>
-      </w:r>
-      <w:proofErr w:type="spellStart"/>
-      <w:proofErr w:type="gramStart"/>
-      <w:r>
-        <w:t>e.target</w:t>
-      </w:r>
-      <w:proofErr w:type="gramEnd"/>
-      <w:r>
-        <w:t>.files</w:t>
-      </w:r>
-      <w:proofErr w:type="spellEnd"/>
-      <w:r>
-        <w:t xml:space="preserve">![0] are different </w:t>
-      </w:r>
-      <w:proofErr w:type="spellStart"/>
-      <w:r>
-        <w:t>sytaxes</w:t>
-      </w:r>
-      <w:proofErr w:type="spellEnd"/>
-      <w:r>
-        <w:t xml:space="preserve"> (same for objects e.g. </w:t>
-      </w:r>
-      <w:proofErr w:type="spellStart"/>
-      <w:r>
-        <w:t>controller.</w:t>
-      </w:r>
-      <w:proofErr w:type="gramStart"/>
-      <w:r>
-        <w:t>data</w:t>
-      </w:r>
-      <w:proofErr w:type="spellEnd"/>
-      <w:r>
-        <w:t>![</w:t>
-      </w:r>
-      <w:proofErr w:type="gramEnd"/>
-      <w:r>
-        <w:t xml:space="preserve">”user”] / </w:t>
-      </w:r>
-      <w:proofErr w:type="spellStart"/>
-      <w:r>
-        <w:t>controller.data</w:t>
-      </w:r>
-      <w:proofErr w:type="spellEnd"/>
-      <w:proofErr w:type="gramStart"/>
-      <w:r>
-        <w:t>?.[</w:t>
-      </w:r>
-      <w:proofErr w:type="gramEnd"/>
-      <w:r>
-        <w:t>”user”])</w:t>
-      </w:r>
-    </w:p>
-    <w:p>
-      <w:r>
-        <w:t>Use [”key”] for convert string to object key</w:t>
-      </w:r>
-    </w:p>
-    <w:p>
-      <w:r>
-        <w:t xml:space="preserve">!! converts value to </w:t>
-      </w:r>
-      <w:proofErr w:type="spellStart"/>
-      <w:r>
-        <w:t>boolean</w:t>
-      </w:r>
-      <w:proofErr w:type="spellEnd"/>
-      <w:r>
-        <w:t xml:space="preserve"> *true if it </w:t>
-      </w:r>
-      <w:proofErr w:type="gramStart"/>
-      <w:r>
-        <w:t>exist</w:t>
-      </w:r>
-      <w:proofErr w:type="gramEnd"/>
-      <w:r>
-        <w:t xml:space="preserve"> and false if it's not*</w:t>
-      </w:r>
-    </w:p>
-    <w:p>
-      <w:r>
-        <w:t xml:space="preserve">difference </w:t>
-      </w:r>
-      <w:proofErr w:type="spellStart"/>
-      <w:proofErr w:type="gramStart"/>
-      <w:r>
-        <w:t>bewteen</w:t>
-      </w:r>
-      <w:proofErr w:type="spellEnd"/>
-      <w:r>
-        <w:t xml:space="preserve"> .</w:t>
-      </w:r>
-      <w:proofErr w:type="spellStart"/>
-      <w:r>
-        <w:t>toString</w:t>
-      </w:r>
-      <w:proofErr w:type="spellEnd"/>
-      <w:proofErr w:type="gramEnd"/>
-      <w:r>
-        <w:t>() and String(value)</w:t>
-      </w:r>
-    </w:p>
-    <w:p>
-      <w:r>
-        <w:t xml:space="preserve">??? </w:t>
-      </w:r>
-      <w:proofErr w:type="gramStart"/>
-      <w:r>
-        <w:t>use .</w:t>
-      </w:r>
-      <w:proofErr w:type="spellStart"/>
-      <w:r>
-        <w:t>toFixed</w:t>
-      </w:r>
-      <w:proofErr w:type="spellEnd"/>
-      <w:proofErr w:type="gramEnd"/>
-      <w:r>
-        <w:t>(0) of Number class to remove decimals</w:t>
-      </w:r>
-    </w:p>
-    <w:p>
-      <w:r>
-        <w:t xml:space="preserve">What </w:t>
-      </w:r>
-      <w:proofErr w:type="spellStart"/>
-      <w:r>
-        <w:t>Object.bind</w:t>
-      </w:r>
-      <w:proofErr w:type="spellEnd"/>
-      <w:r>
-        <w:t xml:space="preserve"> does</w:t>
-      </w:r>
-    </w:p>
-    <w:p>
-      <w:r>
-        <w:t xml:space="preserve">replace const object with another object using </w:t>
-      </w:r>
-      <w:proofErr w:type="spellStart"/>
-      <w:proofErr w:type="gramStart"/>
-      <w:r>
-        <w:t>object.assign</w:t>
-      </w:r>
-      <w:proofErr w:type="spellEnd"/>
-      <w:proofErr w:type="gramEnd"/>
-    </w:p>
-    <w:p>
-      <w:proofErr w:type="gramStart"/>
-      <w:r>
-        <w:t>Adding !</w:t>
-      </w:r>
-      <w:proofErr w:type="gramEnd"/>
-      <w:r>
-        <w:t xml:space="preserve"> in front of </w:t>
-      </w:r>
-      <w:proofErr w:type="spellStart"/>
-      <w:r>
-        <w:t>possibely</w:t>
-      </w:r>
-      <w:proofErr w:type="spellEnd"/>
-      <w:r>
-        <w:t xml:space="preserve"> undefine value will throw error if value is </w:t>
-      </w:r>
-      <w:proofErr w:type="spellStart"/>
-      <w:r>
-        <w:t>undefiend</w:t>
-      </w:r>
-      <w:proofErr w:type="spellEnd"/>
-      <w:r>
-        <w:t xml:space="preserve">, caused remove </w:t>
-      </w:r>
-      <w:proofErr w:type="spellStart"/>
-      <w:r>
-        <w:t>ts</w:t>
-      </w:r>
-      <w:proofErr w:type="spellEnd"/>
-      <w:r>
-        <w:t xml:space="preserve"> error (add when you sure it’s not null)</w:t>
-      </w:r>
-    </w:p>
-    <w:p>
-      <w:r>
-        <w:t xml:space="preserve">For deleting field in object, </w:t>
-      </w:r>
-      <w:proofErr w:type="spellStart"/>
-      <w:r>
-        <w:t>distructur</w:t>
-      </w:r>
-      <w:proofErr w:type="spellEnd"/>
-      <w:r>
-        <w:t xml:space="preserve"> object with key names that wanted to be deleted and ...rest, and use rest object as deleted object</w:t>
-      </w:r>
-    </w:p>
-    <w:p>
-      <w:r>
-        <w:t xml:space="preserve">Create </w:t>
-      </w:r>
-      <w:proofErr w:type="spellStart"/>
-      <w:r>
-        <w:t>uuid</w:t>
-      </w:r>
-      <w:proofErr w:type="spellEnd"/>
-      <w:r>
-        <w:t xml:space="preserve"> with </w:t>
-      </w:r>
-      <w:proofErr w:type="spellStart"/>
-      <w:proofErr w:type="gramStart"/>
-      <w:r>
-        <w:t>crypto.randomUUID</w:t>
-      </w:r>
-      <w:proofErr w:type="spellEnd"/>
-      <w:proofErr w:type="gramEnd"/>
-      <w:r>
-        <w:t>() method</w:t>
-      </w:r>
-    </w:p>
-    <w:p>
-      <w:proofErr w:type="spellStart"/>
-      <w:r>
-        <w:t>Distructure</w:t>
-      </w:r>
-      <w:proofErr w:type="spellEnd"/>
-      <w:r>
-        <w:t xml:space="preserve"> nested values with nested </w:t>
-      </w:r>
-      <w:proofErr w:type="spellStart"/>
-      <w:r>
-        <w:t>disctructure</w:t>
-      </w:r>
-      <w:proofErr w:type="spellEnd"/>
-      <w:r>
-        <w:t xml:space="preserve"> e.g. const {register, </w:t>
-      </w:r>
-      <w:proofErr w:type="spellStart"/>
-      <w:r>
-        <w:t>handleSubmit</w:t>
-      </w:r>
-      <w:proofErr w:type="spellEnd"/>
-      <w:r>
-        <w:t xml:space="preserve">, </w:t>
-      </w:r>
-      <w:proofErr w:type="spellStart"/>
-      <w:r>
-        <w:t>formState</w:t>
-      </w:r>
-      <w:proofErr w:type="spellEnd"/>
-      <w:r>
-        <w:t xml:space="preserve">: {errors}} = </w:t>
-      </w:r>
-      <w:proofErr w:type="spellStart"/>
-      <w:r>
-        <w:t>useForm</w:t>
-      </w:r>
-      <w:proofErr w:type="spellEnd"/>
-      <w:r>
-        <w:t xml:space="preserve"> *access nested “errors” object in </w:t>
-      </w:r>
-      <w:proofErr w:type="spellStart"/>
-      <w:r>
-        <w:t>formState</w:t>
-      </w:r>
-      <w:proofErr w:type="spellEnd"/>
-      <w:r>
-        <w:t xml:space="preserve"> object from </w:t>
-      </w:r>
-      <w:proofErr w:type="spellStart"/>
-      <w:r>
-        <w:t>useForm</w:t>
-      </w:r>
-      <w:proofErr w:type="spellEnd"/>
-      <w:r>
-        <w:t>*</w:t>
-      </w:r>
-    </w:p>
-    <w:p>
-      <w:r>
-        <w:t xml:space="preserve">??? </w:t>
-      </w:r>
-      <w:proofErr w:type="gramStart"/>
-      <w:r>
-        <w:t>.bind</w:t>
-      </w:r>
-      <w:proofErr w:type="gramEnd"/>
-      <w:r>
-        <w:t>() for passing id to server action</w:t>
-      </w:r>
-    </w:p>
-    <w:p>
-      <w:r>
-        <w:t xml:space="preserve">??? use </w:t>
-      </w:r>
-      <w:proofErr w:type="gramStart"/>
-      <w:r>
-        <w:t>entries(</w:t>
-      </w:r>
-      <w:proofErr w:type="gramEnd"/>
-      <w:r>
-        <w:t xml:space="preserve">), </w:t>
-      </w:r>
-      <w:proofErr w:type="spellStart"/>
-      <w:r>
-        <w:t>Object.formEntries</w:t>
-      </w:r>
-      <w:proofErr w:type="spellEnd"/>
-      <w:r>
-        <w:t>() for catch form fields</w:t>
-      </w:r>
-    </w:p>
-    <w:p>
-      <w:r>
-        <w:lastRenderedPageBreak/>
+        <w:t>), Object.formEntries() for catch form fields</w:t>
+      </w:r>
+    </w:p>
+    <w:p>
+      <w:r>
         <w:t xml:space="preserve">Turn object to array for </w:t>
       </w:r>
       <w:r>
@@ -1123,12 +825,42 @@
       </w:r>
       <w:proofErr w:type="gramEnd"/>
     </w:p>
-    <w:p>
-      <w:pPr>
+    <w:p/>
+    <w:p>
+      <w:r>
+        <w:t>Note JS</w:t>
+      </w:r>
+    </w:p>
+    <w:p>
+      <w:pPr>
+        <w:pStyle w:val="ListParagraph"/>
+        <w:numPr>
+          <w:ilvl w:val="0"/>
+          <w:numId w:val="16"/>
+        </w:numPr>
         <w:rPr>
           <w:rtl/>
         </w:rPr>
       </w:pPr>
+      <w:r>
+        <w:t xml:space="preserve">For loop handles promises one after another but map / foreach loop </w:t>
+      </w:r>
+      <w:proofErr w:type="gramStart"/>
+      <w:r>
+        <w:t>execute</w:t>
+      </w:r>
+      <w:proofErr w:type="gramEnd"/>
+      <w:r>
+        <w:t xml:space="preserve"> all promises together *for handle map execution order add await </w:t>
+      </w:r>
+      <w:proofErr w:type="gramStart"/>
+      <w:r>
+        <w:t>Promise.all(</w:t>
+      </w:r>
+      <w:proofErr w:type="gramEnd"/>
+      <w:r>
+        <w:t>)*</w:t>
+      </w:r>
     </w:p>
     <w:p/>
     <w:p>
@@ -1148,15 +880,7 @@
         <w:t>Create</w:t>
       </w:r>
       <w:r>
-        <w:t xml:space="preserve"> file input with hidden class and label with </w:t>
-      </w:r>
-      <w:proofErr w:type="spellStart"/>
-      <w:r>
-        <w:t>HTMLfor</w:t>
-      </w:r>
-      <w:proofErr w:type="spellEnd"/>
-      <w:r>
-        <w:t xml:space="preserve"> linked to input for manage </w:t>
+        <w:t xml:space="preserve"> file input with hidden class and label with HTMLfor linked to input for manage </w:t>
       </w:r>
       <w:r>
         <w:t xml:space="preserve">form input </w:t>
@@ -1209,23 +933,7 @@
         </w:numPr>
       </w:pPr>
       <w:r>
-        <w:t xml:space="preserve">??? menu[number] for array - </w:t>
-      </w:r>
-      <w:proofErr w:type="spellStart"/>
-      <w:r>
-        <w:t>keyof</w:t>
-      </w:r>
-      <w:proofErr w:type="spellEnd"/>
-      <w:r>
-        <w:t xml:space="preserve"> </w:t>
-      </w:r>
-      <w:proofErr w:type="spellStart"/>
-      <w:r>
-        <w:t>typeof</w:t>
-      </w:r>
-      <w:proofErr w:type="spellEnd"/>
-      <w:r>
-        <w:t xml:space="preserve"> Object for object - Object[”key”] for object</w:t>
+        <w:t>??? menu[number] for array - keyof typeof Object for object - Object[”key”] for object</w:t>
       </w:r>
     </w:p>
     <w:p>
@@ -1247,15 +955,7 @@
         </w:numPr>
       </w:pPr>
       <w:r>
-        <w:t>with optional members on define &amp; use if(</w:t>
-      </w:r>
-      <w:proofErr w:type="spellStart"/>
-      <w:r>
-        <w:t>not_exists</w:t>
-      </w:r>
-      <w:proofErr w:type="spellEnd"/>
-      <w:r>
-        <w:t>) return</w:t>
+        <w:t>with optional members on define &amp; use if(not_exists) return</w:t>
       </w:r>
     </w:p>
     <w:p>
@@ -1266,15 +966,7 @@
         </w:numPr>
       </w:pPr>
       <w:r>
-        <w:t xml:space="preserve">Add generic type to arrow object with &lt;T&gt; before () e.g. const </w:t>
-      </w:r>
-      <w:proofErr w:type="spellStart"/>
-      <w:r>
-        <w:t>setSomething</w:t>
-      </w:r>
-      <w:proofErr w:type="spellEnd"/>
-      <w:r>
-        <w:t xml:space="preserve"> = &lt;T</w:t>
+        <w:t>Add generic type to arrow object with &lt;T&gt; before () e.g. const setSomething = &lt;T</w:t>
       </w:r>
       <w:proofErr w:type="gramStart"/>
       <w:r>
@@ -1298,25 +990,11 @@
         <w:t>Note next auth</w:t>
       </w:r>
     </w:p>
-    <w:p>
-      <w:r>
-        <w:t xml:space="preserve">Note </w:t>
-      </w:r>
-      <w:proofErr w:type="spellStart"/>
-      <w:r>
-        <w:t>prisma</w:t>
-      </w:r>
-      <w:proofErr w:type="spellEnd"/>
-    </w:p>
-    <w:p>
-      <w:r>
-        <w:t xml:space="preserve">Note </w:t>
-      </w:r>
-      <w:proofErr w:type="spellStart"/>
-      <w:r>
-        <w:t>zod</w:t>
-      </w:r>
-      <w:proofErr w:type="spellEnd"/>
+    <w:p/>
+    <w:p>
+      <w:r>
+        <w:t>Note zod</w:t>
+      </w:r>
     </w:p>
     <w:p>
       <w:pPr>
@@ -1326,15 +1004,7 @@
         </w:numPr>
       </w:pPr>
       <w:r>
-        <w:t xml:space="preserve">Pick member from </w:t>
-      </w:r>
-      <w:proofErr w:type="spellStart"/>
-      <w:r>
-        <w:t>zod</w:t>
-      </w:r>
-      <w:proofErr w:type="spellEnd"/>
-      <w:r>
-        <w:t xml:space="preserve"> object validation (</w:t>
+        <w:t>Pick member from zod object validation (</w:t>
       </w:r>
       <w:proofErr w:type="gramStart"/>
       <w:r>
@@ -1342,17 +1012,12 @@
       </w:r>
       <w:proofErr w:type="gramEnd"/>
       <w:r>
-        <w:t>({</w:t>
-      </w:r>
-      <w:proofErr w:type="spellStart"/>
-      <w:r>
-        <w:t>key-</w:t>
+        <w:t>({key-</w:t>
       </w:r>
       <w:proofErr w:type="gramStart"/>
       <w:r>
         <w:t>name:true</w:t>
       </w:r>
-      <w:proofErr w:type="spellEnd"/>
       <w:proofErr w:type="gramEnd"/>
       <w:r>
         <w:t>}) method)</w:t>
@@ -1385,13 +1050,9 @@
         </w:numPr>
       </w:pPr>
       <w:r>
-        <w:t xml:space="preserve">Manage file input (type, size, …) with </w:t>
-      </w:r>
-      <w:proofErr w:type="spellStart"/>
-      <w:r>
-        <w:t>superRefine</w:t>
-      </w:r>
-      <w:proofErr w:type="spellEnd"/>
+        <w:lastRenderedPageBreak/>
+        <w:t>Manage file input (type, size, …) with superRefine</w:t>
+      </w:r>
       <w:r>
         <w:t xml:space="preserve"> after </w:t>
       </w:r>
@@ -1422,36 +1083,15 @@
         </w:numPr>
       </w:pPr>
       <w:r>
-        <w:t>install packages (drizzle-</w:t>
-      </w:r>
-      <w:proofErr w:type="spellStart"/>
-      <w:r>
-        <w:t>orm</w:t>
-      </w:r>
-      <w:proofErr w:type="spellEnd"/>
-      <w:r>
-        <w:t xml:space="preserve">, </w:t>
-      </w:r>
-      <w:proofErr w:type="spellStart"/>
+        <w:t xml:space="preserve">install packages (drizzle-orm, </w:t>
+      </w:r>
       <w:proofErr w:type="gramStart"/>
       <w:r>
-        <w:t>postgres</w:t>
-      </w:r>
-      <w:proofErr w:type="spellEnd"/>
-      <w:r>
-        <w:t xml:space="preserve"> ,drizzle</w:t>
+        <w:t>postgres ,drizzle</w:t>
       </w:r>
       <w:proofErr w:type="gramEnd"/>
       <w:r>
-        <w:t>-kit -D, drizzle-</w:t>
-      </w:r>
-      <w:proofErr w:type="spellStart"/>
-      <w:r>
-        <w:t>zod</w:t>
-      </w:r>
-      <w:proofErr w:type="spellEnd"/>
-      <w:r>
-        <w:t>)</w:t>
+        <w:t>-kit -D, drizzle-zod)</w:t>
       </w:r>
     </w:p>
     <w:p>
@@ -1473,16 +1113,185 @@
         </w:numPr>
       </w:pPr>
       <w:r>
+        <w:t>create drizzle.config.ts in root</w:t>
+      </w:r>
+    </w:p>
+    <w:p>
+      <w:pPr>
+        <w:numPr>
+          <w:ilvl w:val="0"/>
+          <w:numId w:val="8"/>
+        </w:numPr>
+      </w:pPr>
+    </w:p>
+    <w:p>
+      <w:pPr>
+        <w:numPr>
+          <w:ilvl w:val="0"/>
+          <w:numId w:val="8"/>
+        </w:numPr>
+      </w:pPr>
+      <w:r>
+        <w:t xml:space="preserve">create </w:t>
+      </w:r>
+      <w:proofErr w:type="gramStart"/>
+      <w:r>
+        <w:t>DB.schema</w:t>
+      </w:r>
+      <w:proofErr w:type="gramEnd"/>
+      <w:r>
+        <w:t xml:space="preserve"> file (import table entities from drizzle-orm/pg-core)</w:t>
+      </w:r>
+    </w:p>
+    <w:p>
+      <w:pPr>
+        <w:numPr>
+          <w:ilvl w:val="0"/>
+          <w:numId w:val="8"/>
+        </w:numPr>
+      </w:pPr>
+      <w:r>
+        <w:t>run push for push schema to db</w:t>
+      </w:r>
+    </w:p>
+    <w:p>
+      <w:pPr>
+        <w:numPr>
+          <w:ilvl w:val="0"/>
+          <w:numId w:val="8"/>
+        </w:numPr>
+      </w:pPr>
+    </w:p>
+    <w:p>
+      <w:pPr>
+        <w:numPr>
+          <w:ilvl w:val="0"/>
+          <w:numId w:val="8"/>
+        </w:numPr>
+      </w:pPr>
+      <w:r>
+        <w:t xml:space="preserve">create </w:t>
+      </w:r>
+      <w:proofErr w:type="gramStart"/>
+      <w:r>
+        <w:t>DB.connection</w:t>
+      </w:r>
+      <w:proofErr w:type="gramEnd"/>
+      <w:r>
+        <w:t xml:space="preserve"> for connect to db (import drizzle from drizzle-orm/postgres-js, postgres from postgres, * as schema from DB/init/schema)</w:t>
+      </w:r>
+    </w:p>
+    <w:p>
+      <w:pPr>
+        <w:numPr>
+          <w:ilvl w:val="0"/>
+          <w:numId w:val="8"/>
+        </w:numPr>
+      </w:pPr>
+    </w:p>
+    <w:p>
+      <w:pPr>
+        <w:numPr>
+          <w:ilvl w:val="0"/>
+          <w:numId w:val="8"/>
+        </w:numPr>
+      </w:pPr>
+      <w:r>
+        <w:t xml:space="preserve">create </w:t>
+      </w:r>
+      <w:proofErr w:type="gramStart"/>
+      <w:r>
+        <w:t>DB.migration</w:t>
+      </w:r>
+      <w:proofErr w:type="gramEnd"/>
+      <w:r>
+        <w:t xml:space="preserve"> for migrate schema changes to db (instead of drizzle-kit push (with saving history) (generate needed before using migration file) (migration file needed to run))</w:t>
+      </w:r>
+    </w:p>
+    <w:p>
+      <w:pPr>
+        <w:numPr>
+          <w:ilvl w:val="0"/>
+          <w:numId w:val="8"/>
+        </w:numPr>
+      </w:pPr>
+    </w:p>
+    <w:p>
+      <w:pPr>
+        <w:numPr>
+          <w:ilvl w:val="0"/>
+          <w:numId w:val="8"/>
+        </w:numPr>
+      </w:pPr>
+      <w:r>
+        <w:t>Use in code for create sql and export type with inferInsertModel and inferSelectModel (InferSelectModel returns type of all fields, InferInsertModel returns required fields with optional type for optional DB fields (those have default value in table))</w:t>
+      </w:r>
+    </w:p>
+    <w:p>
+      <w:pPr>
+        <w:numPr>
+          <w:ilvl w:val="0"/>
+          <w:numId w:val="8"/>
+        </w:numPr>
+      </w:pPr>
+      <w:r>
+        <w:t>SQL behind the scene workflow</w:t>
+      </w:r>
+    </w:p>
+    <w:p>
+      <w:pPr>
+        <w:numPr>
+          <w:ilvl w:val="0"/>
+          <w:numId w:val="8"/>
+        </w:numPr>
+      </w:pPr>
+      <w:r>
+        <w:t>1. get all records from table (FROM)</w:t>
+      </w:r>
+    </w:p>
+    <w:p>
+      <w:pPr>
+        <w:numPr>
+          <w:ilvl w:val="0"/>
+          <w:numId w:val="8"/>
+        </w:numPr>
+      </w:pPr>
+      <w:r>
+        <w:t>2. join records with another tables (JOINs)</w:t>
+      </w:r>
+    </w:p>
+    <w:p>
+      <w:pPr>
+        <w:numPr>
+          <w:ilvl w:val="0"/>
+          <w:numId w:val="8"/>
+        </w:numPr>
+      </w:pPr>
+      <w:r>
+        <w:t>3. field selection condition (WHERE)</w:t>
+      </w:r>
+    </w:p>
+    <w:p>
+      <w:pPr>
+        <w:numPr>
+          <w:ilvl w:val="0"/>
+          <w:numId w:val="8"/>
+        </w:numPr>
+      </w:pPr>
+      <w:r>
+        <w:t>4. grouping records (GROUP BY)</w:t>
+      </w:r>
+    </w:p>
+    <w:p>
+      <w:pPr>
+        <w:numPr>
+          <w:ilvl w:val="0"/>
+          <w:numId w:val="8"/>
+        </w:numPr>
+      </w:pPr>
+      <w:r>
         <w:lastRenderedPageBreak/>
-        <w:t xml:space="preserve">create </w:t>
-      </w:r>
-      <w:proofErr w:type="spellStart"/>
-      <w:r>
-        <w:t>drizzle.config.ts</w:t>
-      </w:r>
-      <w:proofErr w:type="spellEnd"/>
-      <w:r>
-        <w:t xml:space="preserve"> in root</w:t>
+        <w:t>5. grouped field condition (HAVING)</w:t>
       </w:r>
     </w:p>
     <w:p>
@@ -1492,6 +1301,9 @@
           <w:numId w:val="8"/>
         </w:numPr>
       </w:pPr>
+      <w:r>
+        <w:t>6. aggregates (if exists) (agg functions)</w:t>
+      </w:r>
     </w:p>
     <w:p>
       <w:pPr>
@@ -1501,33 +1313,37 @@
         </w:numPr>
       </w:pPr>
       <w:r>
-        <w:t xml:space="preserve">create </w:t>
-      </w:r>
-      <w:proofErr w:type="spellStart"/>
+        <w:t>7. select fields (SELECT)</w:t>
+      </w:r>
+    </w:p>
+    <w:p>
+      <w:pPr>
+        <w:numPr>
+          <w:ilvl w:val="0"/>
+          <w:numId w:val="8"/>
+        </w:numPr>
+      </w:pPr>
+      <w:r>
+        <w:t>type Tresult = typeof result, would get type of executed query automatically</w:t>
+      </w:r>
+    </w:p>
+    <w:p>
+      <w:pPr>
+        <w:numPr>
+          <w:ilvl w:val="0"/>
+          <w:numId w:val="8"/>
+        </w:numPr>
+      </w:pPr>
+      <w:r>
+        <w:t>On creating entity, name argument (as string) is require beside ts key name for separate sql logic from ts logic e.g. createdAt: serial(“created_at”</w:t>
+      </w:r>
       <w:proofErr w:type="gramStart"/>
       <w:r>
-        <w:t>DB.schema</w:t>
-      </w:r>
-      <w:proofErr w:type="spellEnd"/>
+        <w:t>).primaryKey</w:t>
+      </w:r>
       <w:proofErr w:type="gramEnd"/>
       <w:r>
-        <w:t xml:space="preserve"> file (import table entities from drizzle-</w:t>
-      </w:r>
-      <w:proofErr w:type="spellStart"/>
-      <w:r>
-        <w:t>orm</w:t>
-      </w:r>
-      <w:proofErr w:type="spellEnd"/>
-      <w:r>
-        <w:t>/</w:t>
-      </w:r>
-      <w:proofErr w:type="spellStart"/>
-      <w:r>
-        <w:t>pg</w:t>
-      </w:r>
-      <w:proofErr w:type="spellEnd"/>
-      <w:r>
-        <w:t>-core)</w:t>
+        <w:t>()</w:t>
       </w:r>
     </w:p>
     <w:p>
@@ -1538,13 +1354,48 @@
         </w:numPr>
       </w:pPr>
       <w:r>
-        <w:t xml:space="preserve">run push for push schema to </w:t>
-      </w:r>
-      <w:proofErr w:type="spellStart"/>
-      <w:r>
-        <w:t>db</w:t>
-      </w:r>
-      <w:proofErr w:type="spellEnd"/>
+        <w:t xml:space="preserve">Passing arrays as value </w:t>
+      </w:r>
+      <w:proofErr w:type="gramStart"/>
+      <w:r>
+        <w:t>to .insert</w:t>
+      </w:r>
+      <w:proofErr w:type="gramEnd"/>
+      <w:r>
+        <w:t>(table_name</w:t>
+      </w:r>
+      <w:proofErr w:type="gramStart"/>
+      <w:r>
+        <w:t>).values</w:t>
+      </w:r>
+      <w:proofErr w:type="gramEnd"/>
+      <w:r>
+        <w:t xml:space="preserve">() makes multiple records </w:t>
+      </w:r>
+      <w:proofErr w:type="gramStart"/>
+      <w:r>
+        <w:t>e.g. .insert</w:t>
+      </w:r>
+      <w:proofErr w:type="gramEnd"/>
+      <w:r>
+        <w:t>(table_name</w:t>
+      </w:r>
+      <w:proofErr w:type="gramStart"/>
+      <w:r>
+        <w:t>).values</w:t>
+      </w:r>
+      <w:proofErr w:type="gramEnd"/>
+      <w:r>
+        <w:t>([{name: “ali”, age: 25</w:t>
+      </w:r>
+      <w:proofErr w:type="gramStart"/>
+      <w:r>
+        <w:t>},{</w:t>
+      </w:r>
+      <w:proofErr w:type="gramEnd"/>
+      <w:r>
+        <w:t>name:"mamad”, age: 20}])</w:t>
+      </w:r>
     </w:p>
     <w:p>
       <w:pPr>
@@ -1553,446 +1404,8 @@
           <w:numId w:val="8"/>
         </w:numPr>
       </w:pPr>
-    </w:p>
-    <w:p>
-      <w:pPr>
-        <w:numPr>
-          <w:ilvl w:val="0"/>
-          <w:numId w:val="8"/>
-        </w:numPr>
-      </w:pPr>
-      <w:r>
-        <w:t xml:space="preserve">create </w:t>
-      </w:r>
-      <w:proofErr w:type="spellStart"/>
       <w:proofErr w:type="gramStart"/>
       <w:r>
-        <w:t>DB.connection</w:t>
-      </w:r>
-      <w:proofErr w:type="spellEnd"/>
-      <w:proofErr w:type="gramEnd"/>
-      <w:r>
-        <w:t xml:space="preserve"> for connect to </w:t>
-      </w:r>
-      <w:proofErr w:type="spellStart"/>
-      <w:r>
-        <w:t>db</w:t>
-      </w:r>
-      <w:proofErr w:type="spellEnd"/>
-      <w:r>
-        <w:t xml:space="preserve"> (import drizzle from drizzle-</w:t>
-      </w:r>
-      <w:proofErr w:type="spellStart"/>
-      <w:r>
-        <w:t>orm</w:t>
-      </w:r>
-      <w:proofErr w:type="spellEnd"/>
-      <w:r>
-        <w:t>/</w:t>
-      </w:r>
-      <w:proofErr w:type="spellStart"/>
-      <w:r>
-        <w:t>postgres-js</w:t>
-      </w:r>
-      <w:proofErr w:type="spellEnd"/>
-      <w:r>
-        <w:t xml:space="preserve">, </w:t>
-      </w:r>
-      <w:proofErr w:type="spellStart"/>
-      <w:r>
-        <w:t>postgres</w:t>
-      </w:r>
-      <w:proofErr w:type="spellEnd"/>
-      <w:r>
-        <w:t xml:space="preserve"> from </w:t>
-      </w:r>
-      <w:proofErr w:type="spellStart"/>
-      <w:r>
-        <w:t>postgres</w:t>
-      </w:r>
-      <w:proofErr w:type="spellEnd"/>
-      <w:r>
-        <w:t>, * as schema from DB/</w:t>
-      </w:r>
-      <w:proofErr w:type="spellStart"/>
-      <w:r>
-        <w:t>init</w:t>
-      </w:r>
-      <w:proofErr w:type="spellEnd"/>
-      <w:r>
-        <w:t>/schema)</w:t>
-      </w:r>
-    </w:p>
-    <w:p>
-      <w:pPr>
-        <w:numPr>
-          <w:ilvl w:val="0"/>
-          <w:numId w:val="8"/>
-        </w:numPr>
-      </w:pPr>
-    </w:p>
-    <w:p>
-      <w:pPr>
-        <w:numPr>
-          <w:ilvl w:val="0"/>
-          <w:numId w:val="8"/>
-        </w:numPr>
-      </w:pPr>
-      <w:r>
-        <w:t xml:space="preserve">create </w:t>
-      </w:r>
-      <w:proofErr w:type="spellStart"/>
-      <w:proofErr w:type="gramStart"/>
-      <w:r>
-        <w:t>DB.migration</w:t>
-      </w:r>
-      <w:proofErr w:type="spellEnd"/>
-      <w:proofErr w:type="gramEnd"/>
-      <w:r>
-        <w:t xml:space="preserve"> for migrate schema changes to </w:t>
-      </w:r>
-      <w:proofErr w:type="spellStart"/>
-      <w:r>
-        <w:t>db</w:t>
-      </w:r>
-      <w:proofErr w:type="spellEnd"/>
-      <w:r>
-        <w:t xml:space="preserve"> (instead of drizzle-kit push (with saving history) (generate needed before using migration file) (migration file needed to run))</w:t>
-      </w:r>
-    </w:p>
-    <w:p>
-      <w:pPr>
-        <w:numPr>
-          <w:ilvl w:val="0"/>
-          <w:numId w:val="8"/>
-        </w:numPr>
-      </w:pPr>
-    </w:p>
-    <w:p>
-      <w:pPr>
-        <w:numPr>
-          <w:ilvl w:val="0"/>
-          <w:numId w:val="8"/>
-        </w:numPr>
-      </w:pPr>
-      <w:r>
-        <w:t xml:space="preserve">Use in code for create </w:t>
-      </w:r>
-      <w:proofErr w:type="spellStart"/>
-      <w:r>
-        <w:t>sql</w:t>
-      </w:r>
-      <w:proofErr w:type="spellEnd"/>
-      <w:r>
-        <w:t xml:space="preserve"> and export type with </w:t>
-      </w:r>
-      <w:proofErr w:type="spellStart"/>
-      <w:r>
-        <w:t>inferInsertModel</w:t>
-      </w:r>
-      <w:proofErr w:type="spellEnd"/>
-      <w:r>
-        <w:t xml:space="preserve"> and </w:t>
-      </w:r>
-      <w:proofErr w:type="spellStart"/>
-      <w:r>
-        <w:t>inferSelectModel</w:t>
-      </w:r>
-      <w:proofErr w:type="spellEnd"/>
-      <w:r>
-        <w:t xml:space="preserve"> (</w:t>
-      </w:r>
-      <w:proofErr w:type="spellStart"/>
-      <w:r>
-        <w:t>InferSelectModel</w:t>
-      </w:r>
-      <w:proofErr w:type="spellEnd"/>
-      <w:r>
-        <w:t xml:space="preserve"> returns type of all fields, </w:t>
-      </w:r>
-      <w:proofErr w:type="spellStart"/>
-      <w:r>
-        <w:t>InferInsertModel</w:t>
-      </w:r>
-      <w:proofErr w:type="spellEnd"/>
-      <w:r>
-        <w:t xml:space="preserve"> returns required fields with optional type for optional DB fields (those have default value in table))</w:t>
-      </w:r>
-    </w:p>
-    <w:p>
-      <w:pPr>
-        <w:numPr>
-          <w:ilvl w:val="0"/>
-          <w:numId w:val="8"/>
-        </w:numPr>
-      </w:pPr>
-      <w:r>
-        <w:t>SQL behind the scene workflow</w:t>
-      </w:r>
-    </w:p>
-    <w:p>
-      <w:pPr>
-        <w:numPr>
-          <w:ilvl w:val="0"/>
-          <w:numId w:val="8"/>
-        </w:numPr>
-      </w:pPr>
-      <w:r>
-        <w:t>1. get all records from table (FROM)</w:t>
-      </w:r>
-    </w:p>
-    <w:p>
-      <w:pPr>
-        <w:numPr>
-          <w:ilvl w:val="0"/>
-          <w:numId w:val="8"/>
-        </w:numPr>
-      </w:pPr>
-      <w:r>
-        <w:t>2. join records with another tables (JOINs)</w:t>
-      </w:r>
-    </w:p>
-    <w:p>
-      <w:pPr>
-        <w:numPr>
-          <w:ilvl w:val="0"/>
-          <w:numId w:val="8"/>
-        </w:numPr>
-      </w:pPr>
-      <w:r>
-        <w:t>3. field selection condition (WHERE)</w:t>
-      </w:r>
-    </w:p>
-    <w:p>
-      <w:pPr>
-        <w:numPr>
-          <w:ilvl w:val="0"/>
-          <w:numId w:val="8"/>
-        </w:numPr>
-      </w:pPr>
-      <w:r>
-        <w:t>4. grouping records (GROUP BY)</w:t>
-      </w:r>
-    </w:p>
-    <w:p>
-      <w:pPr>
-        <w:numPr>
-          <w:ilvl w:val="0"/>
-          <w:numId w:val="8"/>
-        </w:numPr>
-      </w:pPr>
-      <w:r>
-        <w:t>5. grouped field condition (HAVING)</w:t>
-      </w:r>
-    </w:p>
-    <w:p>
-      <w:pPr>
-        <w:numPr>
-          <w:ilvl w:val="0"/>
-          <w:numId w:val="8"/>
-        </w:numPr>
-      </w:pPr>
-      <w:r>
-        <w:t>6. aggregates (if exists) (</w:t>
-      </w:r>
-      <w:proofErr w:type="spellStart"/>
-      <w:r>
-        <w:t>agg</w:t>
-      </w:r>
-      <w:proofErr w:type="spellEnd"/>
-      <w:r>
-        <w:t xml:space="preserve"> functions)</w:t>
-      </w:r>
-    </w:p>
-    <w:p>
-      <w:pPr>
-        <w:numPr>
-          <w:ilvl w:val="0"/>
-          <w:numId w:val="8"/>
-        </w:numPr>
-      </w:pPr>
-      <w:r>
-        <w:t>7. select fields (SELECT)</w:t>
-      </w:r>
-    </w:p>
-    <w:p>
-      <w:pPr>
-        <w:numPr>
-          <w:ilvl w:val="0"/>
-          <w:numId w:val="8"/>
-        </w:numPr>
-      </w:pPr>
-      <w:r>
-        <w:t xml:space="preserve">type </w:t>
-      </w:r>
-      <w:proofErr w:type="spellStart"/>
-      <w:r>
-        <w:t>Tresult</w:t>
-      </w:r>
-      <w:proofErr w:type="spellEnd"/>
-      <w:r>
-        <w:t xml:space="preserve"> = </w:t>
-      </w:r>
-      <w:proofErr w:type="spellStart"/>
-      <w:r>
-        <w:t>typeof</w:t>
-      </w:r>
-      <w:proofErr w:type="spellEnd"/>
-      <w:r>
-        <w:t xml:space="preserve"> result, would get type of executed query automatically</w:t>
-      </w:r>
-    </w:p>
-    <w:p>
-      <w:pPr>
-        <w:numPr>
-          <w:ilvl w:val="0"/>
-          <w:numId w:val="8"/>
-        </w:numPr>
-      </w:pPr>
-      <w:r>
-        <w:t xml:space="preserve">On creating entity, name argument (as string) is require beside </w:t>
-      </w:r>
-      <w:proofErr w:type="spellStart"/>
-      <w:r>
-        <w:t>ts</w:t>
-      </w:r>
-      <w:proofErr w:type="spellEnd"/>
-      <w:r>
-        <w:t xml:space="preserve"> key name for separate </w:t>
-      </w:r>
-      <w:proofErr w:type="spellStart"/>
-      <w:r>
-        <w:t>sql</w:t>
-      </w:r>
-      <w:proofErr w:type="spellEnd"/>
-      <w:r>
-        <w:t xml:space="preserve"> logic from </w:t>
-      </w:r>
-      <w:proofErr w:type="spellStart"/>
-      <w:r>
-        <w:t>ts</w:t>
-      </w:r>
-      <w:proofErr w:type="spellEnd"/>
-      <w:r>
-        <w:t xml:space="preserve"> logic e.g. </w:t>
-      </w:r>
-      <w:proofErr w:type="spellStart"/>
-      <w:r>
-        <w:t>createdAt</w:t>
-      </w:r>
-      <w:proofErr w:type="spellEnd"/>
-      <w:r>
-        <w:t>: serial(“</w:t>
-      </w:r>
-      <w:proofErr w:type="spellStart"/>
-      <w:r>
-        <w:t>created_at</w:t>
-      </w:r>
-      <w:proofErr w:type="spellEnd"/>
-      <w:r>
-        <w:t>”</w:t>
-      </w:r>
-      <w:proofErr w:type="gramStart"/>
-      <w:r>
-        <w:t>).</w:t>
-      </w:r>
-      <w:proofErr w:type="spellStart"/>
-      <w:r>
-        <w:t>primaryKey</w:t>
-      </w:r>
-      <w:proofErr w:type="spellEnd"/>
-      <w:proofErr w:type="gramEnd"/>
-      <w:r>
-        <w:t>()</w:t>
-      </w:r>
-    </w:p>
-    <w:p>
-      <w:pPr>
-        <w:numPr>
-          <w:ilvl w:val="0"/>
-          <w:numId w:val="8"/>
-        </w:numPr>
-      </w:pPr>
-      <w:r>
-        <w:t xml:space="preserve">Passing arrays as value </w:t>
-      </w:r>
-      <w:proofErr w:type="gramStart"/>
-      <w:r>
-        <w:t>to .insert</w:t>
-      </w:r>
-      <w:proofErr w:type="gramEnd"/>
-      <w:r>
-        <w:t>(</w:t>
-      </w:r>
-      <w:proofErr w:type="spellStart"/>
-      <w:r>
-        <w:t>table_name</w:t>
-      </w:r>
-      <w:proofErr w:type="spellEnd"/>
-      <w:proofErr w:type="gramStart"/>
-      <w:r>
-        <w:t>).values</w:t>
-      </w:r>
-      <w:proofErr w:type="gramEnd"/>
-      <w:r>
-        <w:t xml:space="preserve">() makes multiple records </w:t>
-      </w:r>
-      <w:proofErr w:type="gramStart"/>
-      <w:r>
-        <w:t>e.g. .insert</w:t>
-      </w:r>
-      <w:proofErr w:type="gramEnd"/>
-      <w:r>
-        <w:t>(</w:t>
-      </w:r>
-      <w:proofErr w:type="spellStart"/>
-      <w:r>
-        <w:t>table_name</w:t>
-      </w:r>
-      <w:proofErr w:type="spellEnd"/>
-      <w:proofErr w:type="gramStart"/>
-      <w:r>
-        <w:t>).values</w:t>
-      </w:r>
-      <w:proofErr w:type="gramEnd"/>
-      <w:r>
-        <w:t>([{name: “</w:t>
-      </w:r>
-      <w:proofErr w:type="spellStart"/>
-      <w:r>
-        <w:t>ali</w:t>
-      </w:r>
-      <w:proofErr w:type="spellEnd"/>
-      <w:r>
-        <w:t>”, age: 25</w:t>
-      </w:r>
-      <w:proofErr w:type="gramStart"/>
-      <w:r>
-        <w:t>},{</w:t>
-      </w:r>
-      <w:proofErr w:type="gramEnd"/>
-      <w:r>
-        <w:t>name:"</w:t>
-      </w:r>
-      <w:proofErr w:type="spellStart"/>
-      <w:r>
-        <w:t>mamad</w:t>
-      </w:r>
-      <w:proofErr w:type="spellEnd"/>
-      <w:r>
-        <w:t>”, age: 20}])</w:t>
-      </w:r>
-    </w:p>
-    <w:p>
-      <w:pPr>
-        <w:numPr>
-          <w:ilvl w:val="0"/>
-          <w:numId w:val="8"/>
-        </w:numPr>
-      </w:pPr>
-      <w:proofErr w:type="gramStart"/>
-      <w:r>
-        <w:lastRenderedPageBreak/>
         <w:t>.returning</w:t>
       </w:r>
       <w:proofErr w:type="gramEnd"/>
@@ -2119,14 +1532,9 @@
       <w:r>
         <w:t xml:space="preserve">) (all could be created with WHERE </w:t>
       </w:r>
-      <w:proofErr w:type="spellStart"/>
       <w:proofErr w:type="gramStart"/>
       <w:r>
-        <w:t>isNotNull</w:t>
-      </w:r>
-      <w:proofErr w:type="spellEnd"/>
-      <w:r>
-        <w:t>(</w:t>
+        <w:t>isNotNull(</w:t>
       </w:r>
       <w:proofErr w:type="gramEnd"/>
       <w:r>
@@ -2177,13 +1585,8 @@
       </w:r>
       <w:proofErr w:type="gramStart"/>
       <w:r>
-        <w:t>eq(</w:t>
-      </w:r>
-      <w:proofErr w:type="spellStart"/>
-      <w:r>
-        <w:t>table.city</w:t>
-      </w:r>
-      <w:proofErr w:type="spellEnd"/>
+        <w:t>eq(table.city</w:t>
+      </w:r>
       <w:proofErr w:type="gramEnd"/>
       <w:r>
         <w:t>, city</w:t>
@@ -2232,25 +1635,12 @@
         </w:numPr>
       </w:pPr>
       <w:r>
-        <w:t xml:space="preserve">join many-to-many (by adding two </w:t>
-      </w:r>
-      <w:proofErr w:type="spellStart"/>
-      <w:r>
-        <w:t>leftJoins</w:t>
-      </w:r>
-      <w:proofErr w:type="spellEnd"/>
-      <w:r>
-        <w:t xml:space="preserve"> chaining (from first table to doc table and doc table to second table - consider </w:t>
+        <w:t xml:space="preserve">join many-to-many (by adding two leftJoins chaining (from first table to doc table and doc table to second table - consider </w:t>
       </w:r>
       <w:proofErr w:type="gramStart"/>
       <w:r>
-        <w:t>each .</w:t>
-      </w:r>
-      <w:proofErr w:type="spellStart"/>
-      <w:r>
-        <w:t>leftjoin</w:t>
-      </w:r>
-      <w:proofErr w:type="spellEnd"/>
+        <w:t>each .leftjoin</w:t>
+      </w:r>
       <w:proofErr w:type="gramEnd"/>
       <w:r>
         <w:t xml:space="preserve"> as new table with joined values))</w:t>
@@ -2286,6 +1676,7 @@
         </w:numPr>
       </w:pPr>
       <w:r>
+        <w:lastRenderedPageBreak/>
         <w:t>Having (only after grouping) = conditional selection for grouping results (it works like where for non-grouping selection)</w:t>
       </w:r>
     </w:p>
@@ -2340,21 +1731,8 @@
           <w:numId w:val="8"/>
         </w:numPr>
       </w:pPr>
-      <w:proofErr w:type="spellStart"/>
-      <w:r>
-        <w:t>sqls</w:t>
-      </w:r>
-      <w:proofErr w:type="spellEnd"/>
-      <w:r>
-        <w:t xml:space="preserve"> (</w:t>
-      </w:r>
-      <w:proofErr w:type="spellStart"/>
-      <w:r>
-        <w:t>json_agg</w:t>
-      </w:r>
-      <w:proofErr w:type="spellEnd"/>
-      <w:r>
-        <w:t>, …)</w:t>
+      <w:r>
+        <w:t>sqls (json_agg, …)</w:t>
       </w:r>
     </w:p>
     <w:p>
@@ -2365,24 +1743,7 @@
         </w:numPr>
       </w:pPr>
       <w:r>
-        <w:lastRenderedPageBreak/>
-        <w:t xml:space="preserve">Turning table type from string to </w:t>
-      </w:r>
-      <w:proofErr w:type="spellStart"/>
-      <w:r>
-        <w:t>enum</w:t>
-      </w:r>
-      <w:proofErr w:type="spellEnd"/>
-      <w:r>
-        <w:t xml:space="preserve"> (Must change </w:t>
-      </w:r>
-      <w:proofErr w:type="spellStart"/>
-      <w:r>
-        <w:t>sql</w:t>
-      </w:r>
-      <w:proofErr w:type="spellEnd"/>
-      <w:r>
-        <w:t xml:space="preserve"> manually)</w:t>
+        <w:t>Turning table type from string to enum (Must change sql manually)</w:t>
       </w:r>
     </w:p>
     <w:p>
@@ -2393,23 +1754,7 @@
         </w:numPr>
       </w:pPr>
       <w:r>
-        <w:t xml:space="preserve">must use </w:t>
-      </w:r>
-      <w:proofErr w:type="spellStart"/>
-      <w:r>
-        <w:t>sql</w:t>
-      </w:r>
-      <w:proofErr w:type="spellEnd"/>
-      <w:r>
-        <w:t xml:space="preserve"> USING keyword to convert types (ALTER TABLE "users" ALTER COLUMN "role" SET DATA TYPE "</w:t>
-      </w:r>
-      <w:proofErr w:type="spellStart"/>
-      <w:r>
-        <w:t>public"."role</w:t>
-      </w:r>
-      <w:proofErr w:type="spellEnd"/>
-      <w:r>
-        <w:t>" USING "role</w:t>
+        <w:t>must use sql USING keyword to convert types (ALTER TABLE "users" ALTER COLUMN "role" SET DATA TYPE "public"."role" USING "role</w:t>
       </w:r>
       <w:proofErr w:type="gramStart"/>
       <w:r>
@@ -2417,15 +1762,7 @@
       </w:r>
       <w:proofErr w:type="gramEnd"/>
       <w:r>
-        <w:t>"</w:t>
-      </w:r>
-      <w:proofErr w:type="spellStart"/>
-      <w:r>
-        <w:t>public"."role</w:t>
-      </w:r>
-      <w:proofErr w:type="spellEnd"/>
-      <w:r>
-        <w:t>"</w:t>
+        <w:t>"public"."role"</w:t>
       </w:r>
       <w:proofErr w:type="gramStart"/>
       <w:r>
@@ -2485,15 +1822,7 @@
         </w:numPr>
       </w:pPr>
       <w:r>
-        <w:t>All unique fields must have READ function (</w:t>
-      </w:r>
-      <w:proofErr w:type="spellStart"/>
-      <w:r>
-        <w:t>readBy</w:t>
-      </w:r>
-      <w:proofErr w:type="spellEnd"/>
-      <w:r>
-        <w:t>)</w:t>
+        <w:t>All unique fields must have READ function (readBy)</w:t>
       </w:r>
     </w:p>
     <w:p>
@@ -2528,6 +1857,40 @@
       <w:r>
         <w:t>Delete must be by id</w:t>
       </w:r>
+    </w:p>
+    <w:p>
+      <w:pPr>
+        <w:numPr>
+          <w:ilvl w:val="0"/>
+          <w:numId w:val="8"/>
+        </w:numPr>
+      </w:pPr>
+      <w:r>
+        <w:t>Export type of DB function using *</w:t>
+      </w:r>
+      <w:r>
+        <w:t xml:space="preserve">export type </w:t>
+      </w:r>
+      <w:r>
+        <w:t>typeName</w:t>
+      </w:r>
+      <w:r>
+        <w:t xml:space="preserve"> = Awaited&lt;ReturnType&lt;typeof </w:t>
+      </w:r>
+      <w:r>
+        <w:t>functionName</w:t>
+      </w:r>
+      <w:r>
+        <w:t>&gt;</w:t>
+      </w:r>
+      <w:proofErr w:type="gramStart"/>
+      <w:r>
+        <w:t>&gt;;</w:t>
+      </w:r>
+      <w:r>
+        <w:t>*</w:t>
+      </w:r>
+      <w:proofErr w:type="gramEnd"/>
     </w:p>
     <w:p/>
     <w:p>
@@ -2552,31 +1915,7 @@
         </w:numPr>
       </w:pPr>
       <w:r>
-        <w:t xml:space="preserve">Zod </w:t>
-      </w:r>
-      <w:proofErr w:type="spellStart"/>
-      <w:r>
-        <w:t>errorMap</w:t>
-      </w:r>
-      <w:proofErr w:type="spellEnd"/>
-      <w:r>
-        <w:t xml:space="preserve"> must defined in form with </w:t>
-      </w:r>
-      <w:proofErr w:type="spellStart"/>
-      <w:r>
-        <w:t>z.config</w:t>
-      </w:r>
-      <w:proofErr w:type="spellEnd"/>
-      <w:r>
-        <w:t xml:space="preserve"> (because it’s client-side and global (server-side </w:t>
-      </w:r>
-      <w:proofErr w:type="spellStart"/>
-      <w:r>
-        <w:t>layout.tsx</w:t>
-      </w:r>
-      <w:proofErr w:type="spellEnd"/>
-      <w:r>
-        <w:t>) is not readable in client-side) (set in dedicated client-side file and import to form</w:t>
+        <w:t>Zod errorMap must defined in form with z.config (because it’s client-side and global (server-side layout.tsx) is not readable in client-side) (set in dedicated client-side file and import to form</w:t>
       </w:r>
       <w:r>
         <w:t xml:space="preserve"> for </w:t>
@@ -2593,15 +1932,7 @@
         </w:numPr>
       </w:pPr>
       <w:r>
-        <w:t xml:space="preserve">Manage looking with label (with </w:t>
-      </w:r>
-      <w:proofErr w:type="spellStart"/>
-      <w:r>
-        <w:t>HTMLfor</w:t>
-      </w:r>
-      <w:proofErr w:type="spellEnd"/>
-      <w:r>
-        <w:t xml:space="preserve"> linked to input) with hidden input</w:t>
+        <w:t>Manage looking with label (with HTMLfor linked to input) with hidden input</w:t>
       </w:r>
     </w:p>
     <w:p>
@@ -2612,23 +1943,8 @@
         </w:numPr>
       </w:pPr>
       <w:r>
-        <w:t>Display file name with const file = watch(“</w:t>
-      </w:r>
-      <w:proofErr w:type="spellStart"/>
-      <w:r>
-        <w:t>inputName</w:t>
-      </w:r>
-      <w:proofErr w:type="spellEnd"/>
-      <w:r>
-        <w:t xml:space="preserve">”) (get from </w:t>
-      </w:r>
-      <w:proofErr w:type="spellStart"/>
-      <w:r>
-        <w:t>useForm</w:t>
-      </w:r>
-      <w:proofErr w:type="spellEnd"/>
-      <w:r>
-        <w:t>)</w:t>
+        <w:lastRenderedPageBreak/>
+        <w:t>Display file name with const file = watch(“inputName”) (get from useForm)</w:t>
       </w:r>
     </w:p>
     <w:p>
@@ -2645,23 +1961,7 @@
       </w:pPr>
       <w:r>
         <w:lastRenderedPageBreak/>
-        <w:t xml:space="preserve">delete file input using </w:t>
-      </w:r>
-      <w:proofErr w:type="spellStart"/>
-      <w:r>
-        <w:t>resetFiled</w:t>
-      </w:r>
-      <w:proofErr w:type="spellEnd"/>
-      <w:r>
-        <w:t xml:space="preserve"> and </w:t>
-      </w:r>
-      <w:proofErr w:type="spellStart"/>
-      <w:r>
-        <w:t>clearErrors</w:t>
-      </w:r>
-      <w:proofErr w:type="spellEnd"/>
-      <w:r>
-        <w:t xml:space="preserve"> in clear button click handler</w:t>
+        <w:t>delete file input using resetFiled and clearErrors in clear button click handler</w:t>
       </w:r>
     </w:p>
     <w:p>
@@ -2672,31 +1972,10 @@
         </w:numPr>
       </w:pPr>
       <w:r>
-        <w:t>Display file preview with &lt;</w:t>
-      </w:r>
-      <w:proofErr w:type="spellStart"/>
-      <w:r>
-        <w:t>img</w:t>
-      </w:r>
-      <w:proofErr w:type="spellEnd"/>
-      <w:r>
-        <w:t xml:space="preserve"> </w:t>
-      </w:r>
-      <w:proofErr w:type="spellStart"/>
-      <w:r>
-        <w:t>src</w:t>
-      </w:r>
-      <w:proofErr w:type="spellEnd"/>
-      <w:r>
-        <w:t>={</w:t>
-      </w:r>
-      <w:proofErr w:type="spellStart"/>
-      <w:r>
-        <w:t>URL.createObjectURL</w:t>
-      </w:r>
-      <w:proofErr w:type="spellEnd"/>
-      <w:r>
-        <w:t>(file)}</w:t>
+        <w:t xml:space="preserve">Display file preview with &lt;img </w:t>
+      </w:r>
+      <w:r>
+        <w:t>src={URL.createObjectURL(file)}</w:t>
       </w:r>
       <w:r>
         <w:t xml:space="preserve"> /&gt;</w:t>
@@ -2725,15 +2004,7 @@
         <w:t>Create a single</w:t>
       </w:r>
       <w:r>
-        <w:t xml:space="preserve"> </w:t>
-      </w:r>
-      <w:proofErr w:type="spellStart"/>
-      <w:r>
-        <w:t>zod</w:t>
-      </w:r>
-      <w:proofErr w:type="spellEnd"/>
-      <w:r>
-        <w:t xml:space="preserve"> schema</w:t>
+        <w:t xml:space="preserve"> zod schema</w:t>
       </w:r>
       <w:r>
         <w:t xml:space="preserve"> </w:t>
@@ -2753,74 +2024,28 @@
         </w:numPr>
       </w:pPr>
       <w:r>
-        <w:t xml:space="preserve">(For </w:t>
-      </w:r>
-      <w:proofErr w:type="spellStart"/>
-      <w:r>
-        <w:t>multi mode</w:t>
-      </w:r>
-      <w:proofErr w:type="spellEnd"/>
-      <w:r>
-        <w:t xml:space="preserve"> operations (additional fields e.g. file), create custom </w:t>
-      </w:r>
-      <w:proofErr w:type="spellStart"/>
-      <w:r>
-        <w:t>zod</w:t>
-      </w:r>
-      <w:proofErr w:type="spellEnd"/>
-      <w:r>
-        <w:t xml:space="preserve"> schema) (For multi table (CURD in multiple tables operations e.g. users + orders) nest </w:t>
-      </w:r>
-      <w:proofErr w:type="spellStart"/>
-      <w:r>
-        <w:t>theyr</w:t>
-      </w:r>
-      <w:proofErr w:type="spellEnd"/>
-      <w:r>
-        <w:t xml:space="preserve"> schemas) create custom -&gt; use </w:t>
-      </w:r>
-      <w:proofErr w:type="spellStart"/>
+        <w:t xml:space="preserve">(For multi mode operations (additional fields e.g. file), create custom zod schema) (For multi table (CURD in multiple tables operations e.g. users + orders) nest theyr schemas) create custom -&gt; use </w:t>
+      </w:r>
       <w:proofErr w:type="gramStart"/>
       <w:r>
         <w:t>z.object</w:t>
       </w:r>
-      <w:proofErr w:type="spellEnd"/>
       <w:proofErr w:type="gramEnd"/>
       <w:r>
-        <w:t>({</w:t>
-      </w:r>
-      <w:proofErr w:type="spellStart"/>
-      <w:r>
-        <w:t>tableOne</w:t>
-      </w:r>
-      <w:proofErr w:type="spellEnd"/>
-      <w:r>
-        <w:t xml:space="preserve">: drizzleZodSchema1, </w:t>
-      </w:r>
-      <w:proofErr w:type="spellStart"/>
-      <w:r>
-        <w:t>tableTwo</w:t>
-      </w:r>
-      <w:proofErr w:type="spellEnd"/>
-      <w:r>
-        <w:t>: drizzleZodSchema2}) (register name converts to “nested_object_member.name" e.g. &lt;input {...</w:t>
-      </w:r>
-      <w:proofErr w:type="spellStart"/>
+        <w:t>({tableOne: drizzleZodSchema1, tableTwo: drizzleZodSchema2}) (register name converts to “nested_object_member.name" e.g. &lt;input {...</w:t>
+      </w:r>
       <w:proofErr w:type="gramStart"/>
       <w:r>
         <w:t>form.register</w:t>
       </w:r>
-      <w:proofErr w:type="spellEnd"/>
       <w:proofErr w:type="gramEnd"/>
       <w:r>
         <w:t>("</w:t>
       </w:r>
-      <w:proofErr w:type="spellStart"/>
       <w:proofErr w:type="gramStart"/>
       <w:r>
         <w:t>db.title</w:t>
       </w:r>
-      <w:proofErr w:type="spellEnd"/>
       <w:proofErr w:type="gramEnd"/>
       <w:r>
         <w:t>")} /</w:t>
@@ -2840,23 +2065,7 @@
         <w:spacing w:line="276" w:lineRule="auto"/>
       </w:pPr>
       <w:r>
-        <w:t xml:space="preserve">Use Extended </w:t>
-      </w:r>
-      <w:proofErr w:type="spellStart"/>
-      <w:r>
-        <w:t>zod</w:t>
-      </w:r>
-      <w:proofErr w:type="spellEnd"/>
-      <w:r>
-        <w:t xml:space="preserve"> DB schema with additional wanted values and for Append more-of-DB-schema values to </w:t>
-      </w:r>
-      <w:proofErr w:type="spellStart"/>
-      <w:r>
-        <w:t>useForm</w:t>
-      </w:r>
-      <w:proofErr w:type="spellEnd"/>
-      <w:r>
-        <w:t xml:space="preserve"> form</w:t>
+        <w:t>Use Extended zod DB schema with additional wanted values and for Append more-of-DB-schema values to useForm form</w:t>
       </w:r>
     </w:p>
     <w:p>
@@ -2881,13 +2090,8 @@
     <w:p/>
     <w:p>
       <w:r>
-        <w:t xml:space="preserve">Note next </w:t>
-      </w:r>
-      <w:proofErr w:type="spellStart"/>
-      <w:r>
-        <w:t>js</w:t>
-      </w:r>
-      <w:proofErr w:type="spellEnd"/>
+        <w:t>Note next js</w:t>
+      </w:r>
     </w:p>
     <w:p>
       <w:pPr>
@@ -2897,6 +2101,17 @@
         </w:numPr>
       </w:pPr>
       <w:r>
+        <w:t>Files that are not in “public” folder are not static, so must be served from endpoint to be used on UI</w:t>
+      </w:r>
+    </w:p>
+    <w:p>
+      <w:pPr>
+        <w:numPr>
+          <w:ilvl w:val="0"/>
+          <w:numId w:val="9"/>
+        </w:numPr>
+      </w:pPr>
+      <w:r>
         <w:t>protect routes with proxy file</w:t>
       </w:r>
     </w:p>
@@ -2938,23 +2153,7 @@
       </w:r>
       <w:proofErr w:type="gramEnd"/>
       <w:r>
-        <w:t xml:space="preserve"> only works in next </w:t>
-      </w:r>
-      <w:proofErr w:type="spellStart"/>
-      <w:r>
-        <w:t>js</w:t>
-      </w:r>
-      <w:proofErr w:type="spellEnd"/>
-      <w:r>
-        <w:t xml:space="preserve"> bootstrap (run with </w:t>
-      </w:r>
-      <w:proofErr w:type="spellStart"/>
-      <w:r>
-        <w:t>npx</w:t>
-      </w:r>
-      <w:proofErr w:type="spellEnd"/>
-      <w:r>
-        <w:t xml:space="preserve"> next </w:t>
+        <w:t xml:space="preserve"> only works in next js bootstrap (run with npx next </w:t>
       </w:r>
       <w:proofErr w:type="gramStart"/>
       <w:r>
@@ -2962,39 +2161,7 @@
       </w:r>
       <w:proofErr w:type="gramEnd"/>
       <w:r>
-        <w:t xml:space="preserve">), for files outside next </w:t>
-      </w:r>
-      <w:proofErr w:type="spellStart"/>
-      <w:r>
-        <w:t>js</w:t>
-      </w:r>
-      <w:proofErr w:type="spellEnd"/>
-      <w:r>
-        <w:t xml:space="preserve"> bootstrap (run with </w:t>
-      </w:r>
-      <w:proofErr w:type="spellStart"/>
-      <w:r>
-        <w:t>tsx</w:t>
-      </w:r>
-      <w:proofErr w:type="spellEnd"/>
-      <w:r>
-        <w:t xml:space="preserve"> </w:t>
-      </w:r>
-      <w:proofErr w:type="spellStart"/>
-      <w:r>
-        <w:t>file_name</w:t>
-      </w:r>
-      <w:proofErr w:type="spellEnd"/>
-      <w:r>
-        <w:t xml:space="preserve">) </w:t>
-      </w:r>
-      <w:proofErr w:type="spellStart"/>
-      <w:r>
-        <w:t>dotenv</w:t>
-      </w:r>
-      <w:proofErr w:type="spellEnd"/>
-      <w:r>
-        <w:t xml:space="preserve"> package is needed</w:t>
+        <w:t>), for files outside next js bootstrap (run with tsx file_name) dotenv package is needed</w:t>
       </w:r>
     </w:p>
     <w:p>
@@ -3004,35 +2171,9 @@
           <w:numId w:val="9"/>
         </w:numPr>
       </w:pPr>
-      <w:proofErr w:type="spellStart"/>
-      <w:r>
-        <w:t>Ssr</w:t>
-      </w:r>
-      <w:proofErr w:type="spellEnd"/>
-      <w:r>
-        <w:t xml:space="preserve"> data is </w:t>
-      </w:r>
-      <w:proofErr w:type="spellStart"/>
-      <w:r>
-        <w:t>readble</w:t>
-      </w:r>
-      <w:proofErr w:type="spellEnd"/>
-      <w:r>
-        <w:t xml:space="preserve"> throw same HTTPS connection for </w:t>
-      </w:r>
-      <w:proofErr w:type="spellStart"/>
-      <w:r>
-        <w:t>seo</w:t>
-      </w:r>
-      <w:proofErr w:type="spellEnd"/>
-      <w:r>
-        <w:t xml:space="preserve"> bots even with suspense loading </w:t>
-      </w:r>
-      <w:proofErr w:type="spellStart"/>
-      <w:r>
-        <w:t>placholder</w:t>
-      </w:r>
-      <w:proofErr w:type="spellEnd"/>
+      <w:r>
+        <w:t>Ssr data is readble throw same HTTPS connection for seo bots even with suspense loading placholder</w:t>
+      </w:r>
     </w:p>
     <w:p>
       <w:pPr>
@@ -3042,19 +2183,11 @@
         </w:numPr>
       </w:pPr>
       <w:r>
-        <w:t xml:space="preserve">add article in next </w:t>
-      </w:r>
-      <w:proofErr w:type="spellStart"/>
-      <w:r>
-        <w:t>js</w:t>
-      </w:r>
-      <w:proofErr w:type="spellEnd"/>
-    </w:p>
-    <w:p>
-      <w:r>
-        <w:t>Note React hook form</w:t>
-      </w:r>
-    </w:p>
+        <w:t>add article in next js</w:t>
+      </w:r>
+    </w:p>
+    <w:p/>
+    <w:p/>
     <w:p>
       <w:r>
         <w:t>Note HTTP</w:t>
@@ -3068,6 +2201,7 @@
         </w:numPr>
       </w:pPr>
       <w:r>
+        <w:lastRenderedPageBreak/>
         <w:t>method difference</w:t>
       </w:r>
     </w:p>
@@ -3079,15 +2213,7 @@
         </w:numPr>
       </w:pPr>
       <w:r>
-        <w:t xml:space="preserve">headers (cookie vs </w:t>
-      </w:r>
-      <w:proofErr w:type="spellStart"/>
-      <w:r>
-        <w:t>authorazation</w:t>
-      </w:r>
-      <w:proofErr w:type="spellEnd"/>
-      <w:r>
-        <w:t>)</w:t>
+        <w:t>headers (cookie vs authorazation)</w:t>
       </w:r>
     </w:p>
     <w:p>
@@ -3097,170 +2223,127 @@
     </w:p>
     <w:p>
       <w:r>
+        <w:t>Authentication</w:t>
+      </w:r>
+    </w:p>
+    <w:p>
+      <w:pPr>
+        <w:pStyle w:val="ListParagraph"/>
+        <w:numPr>
+          <w:ilvl w:val="0"/>
+          <w:numId w:val="15"/>
+        </w:numPr>
+      </w:pPr>
+      <w:r>
+        <w:t>3 auth methods</w:t>
+      </w:r>
+    </w:p>
+    <w:p>
+      <w:pPr>
+        <w:pStyle w:val="ListParagraph"/>
+        <w:numPr>
+          <w:ilvl w:val="0"/>
+          <w:numId w:val="15"/>
+        </w:numPr>
+      </w:pPr>
+      <w:r>
+        <w:t>Manage user access with middlewares in protected pages to keep pages static</w:t>
+      </w:r>
+    </w:p>
+    <w:p/>
+    <w:p>
+      <w:r>
+        <w:t>-------- dedicated backend</w:t>
+      </w:r>
+    </w:p>
+    <w:p>
+      <w:r>
+        <w:t>Express endpoint</w:t>
+      </w:r>
+    </w:p>
+    <w:p>
+      <w:r>
+        <w:t xml:space="preserve">Install express </w:t>
+      </w:r>
+    </w:p>
+    <w:p>
+      <w:r>
+        <w:t>install express types</w:t>
+      </w:r>
+    </w:p>
+    <w:p>
+      <w:r>
+        <w:t>typescript</w:t>
+      </w:r>
+    </w:p>
+    <w:p>
+      <w:r>
+        <w:t>init typecsript</w:t>
+      </w:r>
+    </w:p>
+    <w:p>
+      <w:r>
+        <w:t>install cors</w:t>
+      </w:r>
+    </w:p>
+    <w:p>
+      <w:r>
+        <w:t>init cors (for allow access from client)</w:t>
+      </w:r>
+    </w:p>
+    <w:p>
+      <w:r>
+        <w:t>install cookie parser</w:t>
+      </w:r>
+    </w:p>
+    <w:p>
+      <w:r>
+        <w:t>init cookie parser</w:t>
+      </w:r>
+    </w:p>
+    <w:p>
+      <w:r>
+        <w:t>add esmod</w:t>
+      </w:r>
+    </w:p>
+    <w:p>
+      <w:r>
+        <w:t>type module package json</w:t>
+      </w:r>
+    </w:p>
+    <w:p>
+      <w:r>
+        <w:t>allowImportingTsExtensions</w:t>
+      </w:r>
+    </w:p>
+    <w:p>
+      <w:r>
+        <w:t>install nodemon</w:t>
+      </w:r>
+    </w:p>
+    <w:p>
+      <w:r>
+        <w:t>install body parser</w:t>
+      </w:r>
+    </w:p>
+    <w:p>
+      <w:r>
+        <w:t>read cookies</w:t>
+      </w:r>
+    </w:p>
+    <w:p>
+      <w:r>
+        <w:t>auth</w:t>
+      </w:r>
+    </w:p>
+    <w:p>
+      <w:r>
+        <w:t>- ?? create temporary cookie from client cookie in server component and send it to backend server for using client cookie via backend in server components</w:t>
+      </w:r>
+    </w:p>
+    <w:p>
+      <w:r>
         <w:lastRenderedPageBreak/>
-        <w:t>Authentication</w:t>
-      </w:r>
-    </w:p>
-    <w:p>
-      <w:r>
-        <w:t>- 3 auth methods</w:t>
-      </w:r>
-    </w:p>
-    <w:p>
-      <w:r>
-        <w:t xml:space="preserve">- Manage user access with </w:t>
-      </w:r>
-      <w:proofErr w:type="spellStart"/>
-      <w:r>
-        <w:t>middlewares</w:t>
-      </w:r>
-      <w:proofErr w:type="spellEnd"/>
-      <w:r>
-        <w:t xml:space="preserve"> in protected pages to keep pages static</w:t>
-      </w:r>
-    </w:p>
-    <w:p>
-      <w:r>
-        <w:t>-------- dedicated backend</w:t>
-      </w:r>
-    </w:p>
-    <w:p>
-      <w:r>
-        <w:t>Express endpoint</w:t>
-      </w:r>
-    </w:p>
-    <w:p>
-      <w:r>
-        <w:t xml:space="preserve">Install express </w:t>
-      </w:r>
-    </w:p>
-    <w:p>
-      <w:r>
-        <w:t>install express types</w:t>
-      </w:r>
-    </w:p>
-    <w:p>
-      <w:r>
-        <w:t>typescript</w:t>
-      </w:r>
-    </w:p>
-    <w:p>
-      <w:proofErr w:type="spellStart"/>
-      <w:r>
-        <w:t>init</w:t>
-      </w:r>
-      <w:proofErr w:type="spellEnd"/>
-      <w:r>
-        <w:t xml:space="preserve"> </w:t>
-      </w:r>
-      <w:proofErr w:type="spellStart"/>
-      <w:r>
-        <w:t>typecsript</w:t>
-      </w:r>
-      <w:proofErr w:type="spellEnd"/>
-    </w:p>
-    <w:p>
-      <w:r>
-        <w:t xml:space="preserve">install </w:t>
-      </w:r>
-      <w:proofErr w:type="spellStart"/>
-      <w:r>
-        <w:t>cors</w:t>
-      </w:r>
-      <w:proofErr w:type="spellEnd"/>
-    </w:p>
-    <w:p>
-      <w:proofErr w:type="spellStart"/>
-      <w:r>
-        <w:t>init</w:t>
-      </w:r>
-      <w:proofErr w:type="spellEnd"/>
-      <w:r>
-        <w:t xml:space="preserve"> </w:t>
-      </w:r>
-      <w:proofErr w:type="spellStart"/>
-      <w:r>
-        <w:t>cors</w:t>
-      </w:r>
-      <w:proofErr w:type="spellEnd"/>
-      <w:r>
-        <w:t xml:space="preserve"> (for allow access from client)</w:t>
-      </w:r>
-    </w:p>
-    <w:p>
-      <w:r>
-        <w:t>install cookie parser</w:t>
-      </w:r>
-    </w:p>
-    <w:p>
-      <w:proofErr w:type="spellStart"/>
-      <w:r>
-        <w:t>init</w:t>
-      </w:r>
-      <w:proofErr w:type="spellEnd"/>
-      <w:r>
-        <w:t xml:space="preserve"> cookie parser</w:t>
-      </w:r>
-    </w:p>
-    <w:p>
-      <w:r>
-        <w:t xml:space="preserve">add </w:t>
-      </w:r>
-      <w:proofErr w:type="spellStart"/>
-      <w:r>
-        <w:t>esmod</w:t>
-      </w:r>
-      <w:proofErr w:type="spellEnd"/>
-    </w:p>
-    <w:p>
-      <w:r>
-        <w:t xml:space="preserve">type module package </w:t>
-      </w:r>
-      <w:proofErr w:type="spellStart"/>
-      <w:r>
-        <w:t>json</w:t>
-      </w:r>
-      <w:proofErr w:type="spellEnd"/>
-    </w:p>
-    <w:p>
-      <w:proofErr w:type="spellStart"/>
-      <w:r>
-        <w:t>allowImportingTsExtensions</w:t>
-      </w:r>
-      <w:proofErr w:type="spellEnd"/>
-    </w:p>
-    <w:p>
-      <w:r>
-        <w:t xml:space="preserve">install </w:t>
-      </w:r>
-      <w:proofErr w:type="spellStart"/>
-      <w:r>
-        <w:t>nodemon</w:t>
-      </w:r>
-      <w:proofErr w:type="spellEnd"/>
-    </w:p>
-    <w:p>
-      <w:r>
-        <w:t>install body parser</w:t>
-      </w:r>
-    </w:p>
-    <w:p>
-      <w:r>
-        <w:t>read cookies</w:t>
-      </w:r>
-    </w:p>
-    <w:p>
-      <w:r>
-        <w:t>auth</w:t>
-      </w:r>
-    </w:p>
-    <w:p>
-      <w:r>
-        <w:t>- ?? create temporary cookie from client cookie in server component and send it to backend server for using client cookie via backend in server components</w:t>
-      </w:r>
-    </w:p>
-    <w:p>
-      <w:r>
         <w:t>- pass client cookie to backend using next server component</w:t>
       </w:r>
     </w:p>
@@ -4105,6 +3188,119 @@
     </w:lvl>
   </w:abstractNum>
   <w:abstractNum w:abstractNumId="6" w15:restartNumberingAfterBreak="0">
+    <w:nsid w:val="15656A59"/>
+    <w:multiLevelType w:val="hybridMultilevel"/>
+    <w:tmpl w:val="5A141460"/>
+    <w:lvl w:ilvl="0" w:tplc="04090001">
+      <w:start w:val="1"/>
+      <w:numFmt w:val="bullet"/>
+      <w:lvlText w:val=""/>
+      <w:lvlJc w:val="left"/>
+      <w:pPr>
+        <w:ind w:left="720" w:hanging="360"/>
+      </w:pPr>
+      <w:rPr>
+        <w:rFonts w:ascii="Symbol" w:hAnsi="Symbol" w:hint="default"/>
+      </w:rPr>
+    </w:lvl>
+    <w:lvl w:ilvl="1" w:tplc="04090003" w:tentative="1">
+      <w:start w:val="1"/>
+      <w:numFmt w:val="bullet"/>
+      <w:lvlText w:val="o"/>
+      <w:lvlJc w:val="left"/>
+      <w:pPr>
+        <w:ind w:left="1440" w:hanging="360"/>
+      </w:pPr>
+      <w:rPr>
+        <w:rFonts w:ascii="Courier New" w:hAnsi="Courier New" w:cs="Courier New" w:hint="default"/>
+      </w:rPr>
+    </w:lvl>
+    <w:lvl w:ilvl="2" w:tplc="04090005" w:tentative="1">
+      <w:start w:val="1"/>
+      <w:numFmt w:val="bullet"/>
+      <w:lvlText w:val=""/>
+      <w:lvlJc w:val="left"/>
+      <w:pPr>
+        <w:ind w:left="2160" w:hanging="360"/>
+      </w:pPr>
+      <w:rPr>
+        <w:rFonts w:ascii="Wingdings" w:hAnsi="Wingdings" w:hint="default"/>
+      </w:rPr>
+    </w:lvl>
+    <w:lvl w:ilvl="3" w:tplc="04090001" w:tentative="1">
+      <w:start w:val="1"/>
+      <w:numFmt w:val="bullet"/>
+      <w:lvlText w:val=""/>
+      <w:lvlJc w:val="left"/>
+      <w:pPr>
+        <w:ind w:left="2880" w:hanging="360"/>
+      </w:pPr>
+      <w:rPr>
+        <w:rFonts w:ascii="Symbol" w:hAnsi="Symbol" w:hint="default"/>
+      </w:rPr>
+    </w:lvl>
+    <w:lvl w:ilvl="4" w:tplc="04090003" w:tentative="1">
+      <w:start w:val="1"/>
+      <w:numFmt w:val="bullet"/>
+      <w:lvlText w:val="o"/>
+      <w:lvlJc w:val="left"/>
+      <w:pPr>
+        <w:ind w:left="3600" w:hanging="360"/>
+      </w:pPr>
+      <w:rPr>
+        <w:rFonts w:ascii="Courier New" w:hAnsi="Courier New" w:cs="Courier New" w:hint="default"/>
+      </w:rPr>
+    </w:lvl>
+    <w:lvl w:ilvl="5" w:tplc="04090005" w:tentative="1">
+      <w:start w:val="1"/>
+      <w:numFmt w:val="bullet"/>
+      <w:lvlText w:val=""/>
+      <w:lvlJc w:val="left"/>
+      <w:pPr>
+        <w:ind w:left="4320" w:hanging="360"/>
+      </w:pPr>
+      <w:rPr>
+        <w:rFonts w:ascii="Wingdings" w:hAnsi="Wingdings" w:hint="default"/>
+      </w:rPr>
+    </w:lvl>
+    <w:lvl w:ilvl="6" w:tplc="04090001" w:tentative="1">
+      <w:start w:val="1"/>
+      <w:numFmt w:val="bullet"/>
+      <w:lvlText w:val=""/>
+      <w:lvlJc w:val="left"/>
+      <w:pPr>
+        <w:ind w:left="5040" w:hanging="360"/>
+      </w:pPr>
+      <w:rPr>
+        <w:rFonts w:ascii="Symbol" w:hAnsi="Symbol" w:hint="default"/>
+      </w:rPr>
+    </w:lvl>
+    <w:lvl w:ilvl="7" w:tplc="04090003" w:tentative="1">
+      <w:start w:val="1"/>
+      <w:numFmt w:val="bullet"/>
+      <w:lvlText w:val="o"/>
+      <w:lvlJc w:val="left"/>
+      <w:pPr>
+        <w:ind w:left="5760" w:hanging="360"/>
+      </w:pPr>
+      <w:rPr>
+        <w:rFonts w:ascii="Courier New" w:hAnsi="Courier New" w:cs="Courier New" w:hint="default"/>
+      </w:rPr>
+    </w:lvl>
+    <w:lvl w:ilvl="8" w:tplc="04090005" w:tentative="1">
+      <w:start w:val="1"/>
+      <w:numFmt w:val="bullet"/>
+      <w:lvlText w:val=""/>
+      <w:lvlJc w:val="left"/>
+      <w:pPr>
+        <w:ind w:left="6480" w:hanging="360"/>
+      </w:pPr>
+      <w:rPr>
+        <w:rFonts w:ascii="Wingdings" w:hAnsi="Wingdings" w:hint="default"/>
+      </w:rPr>
+    </w:lvl>
+  </w:abstractNum>
+  <w:abstractNum w:abstractNumId="7" w15:restartNumberingAfterBreak="0">
     <w:nsid w:val="17F972B1"/>
     <w:multiLevelType w:val="multilevel"/>
     <w:tmpl w:val="667E4928"/>
@@ -4253,7 +3449,7 @@
       </w:rPr>
     </w:lvl>
   </w:abstractNum>
-  <w:abstractNum w:abstractNumId="7" w15:restartNumberingAfterBreak="0">
+  <w:abstractNum w:abstractNumId="8" w15:restartNumberingAfterBreak="0">
     <w:nsid w:val="180E0B7F"/>
     <w:multiLevelType w:val="multilevel"/>
     <w:tmpl w:val="569031B6"/>
@@ -4402,7 +3598,120 @@
       </w:rPr>
     </w:lvl>
   </w:abstractNum>
-  <w:abstractNum w:abstractNumId="8" w15:restartNumberingAfterBreak="0">
+  <w:abstractNum w:abstractNumId="9" w15:restartNumberingAfterBreak="0">
+    <w:nsid w:val="249E6AC0"/>
+    <w:multiLevelType w:val="hybridMultilevel"/>
+    <w:tmpl w:val="3F203BD0"/>
+    <w:lvl w:ilvl="0" w:tplc="04090001">
+      <w:start w:val="1"/>
+      <w:numFmt w:val="bullet"/>
+      <w:lvlText w:val=""/>
+      <w:lvlJc w:val="left"/>
+      <w:pPr>
+        <w:ind w:left="720" w:hanging="360"/>
+      </w:pPr>
+      <w:rPr>
+        <w:rFonts w:ascii="Symbol" w:hAnsi="Symbol" w:hint="default"/>
+      </w:rPr>
+    </w:lvl>
+    <w:lvl w:ilvl="1" w:tplc="04090003" w:tentative="1">
+      <w:start w:val="1"/>
+      <w:numFmt w:val="bullet"/>
+      <w:lvlText w:val="o"/>
+      <w:lvlJc w:val="left"/>
+      <w:pPr>
+        <w:ind w:left="1440" w:hanging="360"/>
+      </w:pPr>
+      <w:rPr>
+        <w:rFonts w:ascii="Courier New" w:hAnsi="Courier New" w:cs="Courier New" w:hint="default"/>
+      </w:rPr>
+    </w:lvl>
+    <w:lvl w:ilvl="2" w:tplc="04090005" w:tentative="1">
+      <w:start w:val="1"/>
+      <w:numFmt w:val="bullet"/>
+      <w:lvlText w:val=""/>
+      <w:lvlJc w:val="left"/>
+      <w:pPr>
+        <w:ind w:left="2160" w:hanging="360"/>
+      </w:pPr>
+      <w:rPr>
+        <w:rFonts w:ascii="Wingdings" w:hAnsi="Wingdings" w:hint="default"/>
+      </w:rPr>
+    </w:lvl>
+    <w:lvl w:ilvl="3" w:tplc="04090001" w:tentative="1">
+      <w:start w:val="1"/>
+      <w:numFmt w:val="bullet"/>
+      <w:lvlText w:val=""/>
+      <w:lvlJc w:val="left"/>
+      <w:pPr>
+        <w:ind w:left="2880" w:hanging="360"/>
+      </w:pPr>
+      <w:rPr>
+        <w:rFonts w:ascii="Symbol" w:hAnsi="Symbol" w:hint="default"/>
+      </w:rPr>
+    </w:lvl>
+    <w:lvl w:ilvl="4" w:tplc="04090003" w:tentative="1">
+      <w:start w:val="1"/>
+      <w:numFmt w:val="bullet"/>
+      <w:lvlText w:val="o"/>
+      <w:lvlJc w:val="left"/>
+      <w:pPr>
+        <w:ind w:left="3600" w:hanging="360"/>
+      </w:pPr>
+      <w:rPr>
+        <w:rFonts w:ascii="Courier New" w:hAnsi="Courier New" w:cs="Courier New" w:hint="default"/>
+      </w:rPr>
+    </w:lvl>
+    <w:lvl w:ilvl="5" w:tplc="04090005" w:tentative="1">
+      <w:start w:val="1"/>
+      <w:numFmt w:val="bullet"/>
+      <w:lvlText w:val=""/>
+      <w:lvlJc w:val="left"/>
+      <w:pPr>
+        <w:ind w:left="4320" w:hanging="360"/>
+      </w:pPr>
+      <w:rPr>
+        <w:rFonts w:ascii="Wingdings" w:hAnsi="Wingdings" w:hint="default"/>
+      </w:rPr>
+    </w:lvl>
+    <w:lvl w:ilvl="6" w:tplc="04090001" w:tentative="1">
+      <w:start w:val="1"/>
+      <w:numFmt w:val="bullet"/>
+      <w:lvlText w:val=""/>
+      <w:lvlJc w:val="left"/>
+      <w:pPr>
+        <w:ind w:left="5040" w:hanging="360"/>
+      </w:pPr>
+      <w:rPr>
+        <w:rFonts w:ascii="Symbol" w:hAnsi="Symbol" w:hint="default"/>
+      </w:rPr>
+    </w:lvl>
+    <w:lvl w:ilvl="7" w:tplc="04090003" w:tentative="1">
+      <w:start w:val="1"/>
+      <w:numFmt w:val="bullet"/>
+      <w:lvlText w:val="o"/>
+      <w:lvlJc w:val="left"/>
+      <w:pPr>
+        <w:ind w:left="5760" w:hanging="360"/>
+      </w:pPr>
+      <w:rPr>
+        <w:rFonts w:ascii="Courier New" w:hAnsi="Courier New" w:cs="Courier New" w:hint="default"/>
+      </w:rPr>
+    </w:lvl>
+    <w:lvl w:ilvl="8" w:tplc="04090005" w:tentative="1">
+      <w:start w:val="1"/>
+      <w:numFmt w:val="bullet"/>
+      <w:lvlText w:val=""/>
+      <w:lvlJc w:val="left"/>
+      <w:pPr>
+        <w:ind w:left="6480" w:hanging="360"/>
+      </w:pPr>
+      <w:rPr>
+        <w:rFonts w:ascii="Wingdings" w:hAnsi="Wingdings" w:hint="default"/>
+      </w:rPr>
+    </w:lvl>
+  </w:abstractNum>
+  <w:abstractNum w:abstractNumId="10" w15:restartNumberingAfterBreak="0">
     <w:nsid w:val="31361962"/>
     <w:multiLevelType w:val="multilevel"/>
     <w:tmpl w:val="DC184026"/>
@@ -4551,7 +3860,120 @@
       </w:rPr>
     </w:lvl>
   </w:abstractNum>
-  <w:abstractNum w:abstractNumId="9" w15:restartNumberingAfterBreak="0">
+  <w:abstractNum w:abstractNumId="11" w15:restartNumberingAfterBreak="0">
+    <w:nsid w:val="4EFF3FDB"/>
+    <w:multiLevelType w:val="hybridMultilevel"/>
+    <w:tmpl w:val="0F209A1E"/>
+    <w:lvl w:ilvl="0" w:tplc="04090001">
+      <w:start w:val="1"/>
+      <w:numFmt w:val="bullet"/>
+      <w:lvlText w:val=""/>
+      <w:lvlJc w:val="left"/>
+      <w:pPr>
+        <w:ind w:left="720" w:hanging="360"/>
+      </w:pPr>
+      <w:rPr>
+        <w:rFonts w:ascii="Symbol" w:hAnsi="Symbol" w:hint="default"/>
+      </w:rPr>
+    </w:lvl>
+    <w:lvl w:ilvl="1" w:tplc="04090003" w:tentative="1">
+      <w:start w:val="1"/>
+      <w:numFmt w:val="bullet"/>
+      <w:lvlText w:val="o"/>
+      <w:lvlJc w:val="left"/>
+      <w:pPr>
+        <w:ind w:left="1440" w:hanging="360"/>
+      </w:pPr>
+      <w:rPr>
+        <w:rFonts w:ascii="Courier New" w:hAnsi="Courier New" w:cs="Courier New" w:hint="default"/>
+      </w:rPr>
+    </w:lvl>
+    <w:lvl w:ilvl="2" w:tplc="04090005" w:tentative="1">
+      <w:start w:val="1"/>
+      <w:numFmt w:val="bullet"/>
+      <w:lvlText w:val=""/>
+      <w:lvlJc w:val="left"/>
+      <w:pPr>
+        <w:ind w:left="2160" w:hanging="360"/>
+      </w:pPr>
+      <w:rPr>
+        <w:rFonts w:ascii="Wingdings" w:hAnsi="Wingdings" w:hint="default"/>
+      </w:rPr>
+    </w:lvl>
+    <w:lvl w:ilvl="3" w:tplc="04090001" w:tentative="1">
+      <w:start w:val="1"/>
+      <w:numFmt w:val="bullet"/>
+      <w:lvlText w:val=""/>
+      <w:lvlJc w:val="left"/>
+      <w:pPr>
+        <w:ind w:left="2880" w:hanging="360"/>
+      </w:pPr>
+      <w:rPr>
+        <w:rFonts w:ascii="Symbol" w:hAnsi="Symbol" w:hint="default"/>
+      </w:rPr>
+    </w:lvl>
+    <w:lvl w:ilvl="4" w:tplc="04090003" w:tentative="1">
+      <w:start w:val="1"/>
+      <w:numFmt w:val="bullet"/>
+      <w:lvlText w:val="o"/>
+      <w:lvlJc w:val="left"/>
+      <w:pPr>
+        <w:ind w:left="3600" w:hanging="360"/>
+      </w:pPr>
+      <w:rPr>
+        <w:rFonts w:ascii="Courier New" w:hAnsi="Courier New" w:cs="Courier New" w:hint="default"/>
+      </w:rPr>
+    </w:lvl>
+    <w:lvl w:ilvl="5" w:tplc="04090005" w:tentative="1">
+      <w:start w:val="1"/>
+      <w:numFmt w:val="bullet"/>
+      <w:lvlText w:val=""/>
+      <w:lvlJc w:val="left"/>
+      <w:pPr>
+        <w:ind w:left="4320" w:hanging="360"/>
+      </w:pPr>
+      <w:rPr>
+        <w:rFonts w:ascii="Wingdings" w:hAnsi="Wingdings" w:hint="default"/>
+      </w:rPr>
+    </w:lvl>
+    <w:lvl w:ilvl="6" w:tplc="04090001" w:tentative="1">
+      <w:start w:val="1"/>
+      <w:numFmt w:val="bullet"/>
+      <w:lvlText w:val=""/>
+      <w:lvlJc w:val="left"/>
+      <w:pPr>
+        <w:ind w:left="5040" w:hanging="360"/>
+      </w:pPr>
+      <w:rPr>
+        <w:rFonts w:ascii="Symbol" w:hAnsi="Symbol" w:hint="default"/>
+      </w:rPr>
+    </w:lvl>
+    <w:lvl w:ilvl="7" w:tplc="04090003" w:tentative="1">
+      <w:start w:val="1"/>
+      <w:numFmt w:val="bullet"/>
+      <w:lvlText w:val="o"/>
+      <w:lvlJc w:val="left"/>
+      <w:pPr>
+        <w:ind w:left="5760" w:hanging="360"/>
+      </w:pPr>
+      <w:rPr>
+        <w:rFonts w:ascii="Courier New" w:hAnsi="Courier New" w:cs="Courier New" w:hint="default"/>
+      </w:rPr>
+    </w:lvl>
+    <w:lvl w:ilvl="8" w:tplc="04090005" w:tentative="1">
+      <w:start w:val="1"/>
+      <w:numFmt w:val="bullet"/>
+      <w:lvlText w:val=""/>
+      <w:lvlJc w:val="left"/>
+      <w:pPr>
+        <w:ind w:left="6480" w:hanging="360"/>
+      </w:pPr>
+      <w:rPr>
+        <w:rFonts w:ascii="Wingdings" w:hAnsi="Wingdings" w:hint="default"/>
+      </w:rPr>
+    </w:lvl>
+  </w:abstractNum>
+  <w:abstractNum w:abstractNumId="12" w15:restartNumberingAfterBreak="0">
     <w:nsid w:val="53DD1761"/>
     <w:multiLevelType w:val="multilevel"/>
     <w:tmpl w:val="47840A0A"/>
@@ -4700,7 +4122,7 @@
       </w:rPr>
     </w:lvl>
   </w:abstractNum>
-  <w:abstractNum w:abstractNumId="10" w15:restartNumberingAfterBreak="0">
+  <w:abstractNum w:abstractNumId="13" w15:restartNumberingAfterBreak="0">
     <w:nsid w:val="59D92F13"/>
     <w:multiLevelType w:val="hybridMultilevel"/>
     <w:tmpl w:val="3E70B442"/>
@@ -4813,7 +4235,7 @@
       </w:rPr>
     </w:lvl>
   </w:abstractNum>
-  <w:abstractNum w:abstractNumId="11" w15:restartNumberingAfterBreak="0">
+  <w:abstractNum w:abstractNumId="14" w15:restartNumberingAfterBreak="0">
     <w:nsid w:val="793B1455"/>
     <w:multiLevelType w:val="multilevel"/>
     <w:tmpl w:val="45FA1F3E"/>
@@ -4962,7 +4384,7 @@
       </w:rPr>
     </w:lvl>
   </w:abstractNum>
-  <w:abstractNum w:abstractNumId="12" w15:restartNumberingAfterBreak="0">
+  <w:abstractNum w:abstractNumId="15" w15:restartNumberingAfterBreak="0">
     <w:nsid w:val="79964E1A"/>
     <w:multiLevelType w:val="multilevel"/>
     <w:tmpl w:val="17FCA0BE"/>
@@ -5115,16 +4537,16 @@
     <w:abstractNumId w:val="3"/>
   </w:num>
   <w:num w:numId="2" w16cid:durableId="818036061">
-    <w:abstractNumId w:val="7"/>
+    <w:abstractNumId w:val="8"/>
   </w:num>
   <w:num w:numId="3" w16cid:durableId="902448729">
-    <w:abstractNumId w:val="9"/>
+    <w:abstractNumId w:val="12"/>
   </w:num>
   <w:num w:numId="4" w16cid:durableId="1994946909">
-    <w:abstractNumId w:val="11"/>
+    <w:abstractNumId w:val="14"/>
   </w:num>
   <w:num w:numId="5" w16cid:durableId="943418575">
-    <w:abstractNumId w:val="8"/>
+    <w:abstractNumId w:val="10"/>
   </w:num>
   <w:num w:numId="6" w16cid:durableId="1938519424">
     <w:abstractNumId w:val="1"/>
@@ -5133,10 +4555,10 @@
     <w:abstractNumId w:val="0"/>
   </w:num>
   <w:num w:numId="8" w16cid:durableId="2026444176">
-    <w:abstractNumId w:val="6"/>
+    <w:abstractNumId w:val="7"/>
   </w:num>
   <w:num w:numId="9" w16cid:durableId="487865267">
-    <w:abstractNumId w:val="12"/>
+    <w:abstractNumId w:val="15"/>
   </w:num>
   <w:num w:numId="10" w16cid:durableId="963004959">
     <w:abstractNumId w:val="2"/>
@@ -5145,13 +4567,22 @@
     <w:abstractNumId w:val="4"/>
   </w:num>
   <w:num w:numId="12" w16cid:durableId="492529509">
-    <w:abstractNumId w:val="10"/>
+    <w:abstractNumId w:val="13"/>
   </w:num>
   <w:num w:numId="13" w16cid:durableId="181165417">
     <w:abstractNumId w:val="3"/>
   </w:num>
   <w:num w:numId="14" w16cid:durableId="404424427">
     <w:abstractNumId w:val="5"/>
+  </w:num>
+  <w:num w:numId="15" w16cid:durableId="2041395452">
+    <w:abstractNumId w:val="11"/>
+  </w:num>
+  <w:num w:numId="16" w16cid:durableId="909387968">
+    <w:abstractNumId w:val="6"/>
+  </w:num>
+  <w:num w:numId="17" w16cid:durableId="2044287362">
+    <w:abstractNumId w:val="9"/>
   </w:num>
 </w:numbering>
 </file>
@@ -5759,7 +5190,6 @@
   <w:style w:type="character" w:default="1" w:styleId="DefaultParagraphFont">
     <w:name w:val="Default Paragraph Font"/>
     <w:uiPriority w:val="1"/>
-    <w:semiHidden/>
     <w:unhideWhenUsed/>
   </w:style>
   <w:style w:type="table" w:default="1" w:styleId="TableNormal">
@@ -6073,6 +5503,36 @@
       <w:spacing w:val="5"/>
     </w:rPr>
   </w:style>
+  <w:style w:type="paragraph" w:styleId="HTMLPreformatted">
+    <w:name w:val="HTML Preformatted"/>
+    <w:basedOn w:val="Normal"/>
+    <w:link w:val="HTMLPreformattedChar"/>
+    <w:uiPriority w:val="99"/>
+    <w:semiHidden/>
+    <w:unhideWhenUsed/>
+    <w:rsid w:val="00B65929"/>
+    <w:pPr>
+      <w:spacing w:after="0" w:line="240" w:lineRule="auto"/>
+    </w:pPr>
+    <w:rPr>
+      <w:rFonts w:ascii="Consolas" w:hAnsi="Consolas"/>
+      <w:sz w:val="20"/>
+      <w:szCs w:val="20"/>
+    </w:rPr>
+  </w:style>
+  <w:style w:type="character" w:customStyle="1" w:styleId="HTMLPreformattedChar">
+    <w:name w:val="HTML Preformatted Char"/>
+    <w:basedOn w:val="DefaultParagraphFont"/>
+    <w:link w:val="HTMLPreformatted"/>
+    <w:uiPriority w:val="99"/>
+    <w:semiHidden/>
+    <w:rsid w:val="00B65929"/>
+    <w:rPr>
+      <w:rFonts w:ascii="Consolas" w:hAnsi="Consolas"/>
+      <w:sz w:val="20"/>
+      <w:szCs w:val="20"/>
+    </w:rPr>
+  </w:style>
 </w:styles>
 </file>
 

</xml_diff>